<commit_message>
more minor docx fixes
</commit_message>
<xml_diff>
--- a/Machine_Learning_for_Fraud_Detection_in_Online_Financial_Transactions.docx
+++ b/Machine_Learning_for_Fraud_Detection_in_Online_Financial_Transactions.docx
@@ -607,7 +607,7 @@
         <w:rPr>
           <w:rFonts w:ascii="Times New Roman" w:hAnsi="Times New Roman"/>
           <w:sz w:val="20"/>
-          <w:lang w:val="el-GR"/>
+          <w:lang w:val="en-US"/>
         </w:rPr>
       </w:pPr>
       <w:r>
@@ -622,7 +622,7 @@
         <w:rPr>
           <w:rFonts w:ascii="Times New Roman" w:hAnsi="Times New Roman"/>
           <w:sz w:val="20"/>
-          <w:lang w:val="el-GR"/>
+          <w:lang w:val="en-US"/>
         </w:rPr>
         <w:t xml:space="preserve">, </w:t>
       </w:r>
@@ -638,7 +638,7 @@
         <w:rPr>
           <w:rFonts w:ascii="Times New Roman" w:hAnsi="Times New Roman"/>
           <w:sz w:val="20"/>
-          <w:lang w:val="el-GR"/>
+          <w:lang w:val="en-US"/>
         </w:rPr>
         <w:t xml:space="preserve"> </w:t>
       </w:r>
@@ -646,7 +646,7 @@
         <w:rPr>
           <w:rFonts w:ascii="Times New Roman" w:hAnsi="Times New Roman"/>
           <w:sz w:val="20"/>
-          <w:lang w:val="el-GR"/>
+          <w:lang w:val="en-US"/>
         </w:rPr>
         <w:t>2026</w:t>
       </w:r>
@@ -655,7 +655,7 @@
       <w:pPr>
         <w:pStyle w:val="BodyText"/>
         <w:rPr>
-          <w:lang w:val="el-GR"/>
+          <w:lang w:val="en-US"/>
         </w:rPr>
       </w:pPr>
     </w:p>
@@ -663,7 +663,7 @@
       <w:pPr>
         <w:pStyle w:val="BodyText"/>
         <w:rPr>
-          <w:lang w:val="el-GR"/>
+          <w:lang w:val="en-US"/>
         </w:rPr>
       </w:pPr>
     </w:p>
@@ -671,7 +671,7 @@
       <w:pPr>
         <w:pStyle w:val="BodyText"/>
         <w:rPr>
-          <w:lang w:val="el-GR"/>
+          <w:lang w:val="en-US"/>
         </w:rPr>
       </w:pPr>
     </w:p>
@@ -679,7 +679,7 @@
       <w:pPr>
         <w:pStyle w:val="BodyText"/>
         <w:rPr>
-          <w:lang w:val="el-GR"/>
+          <w:lang w:val="en-US"/>
         </w:rPr>
       </w:pPr>
     </w:p>
@@ -687,7 +687,7 @@
       <w:pPr>
         <w:pStyle w:val="BodyText"/>
         <w:rPr>
-          <w:lang w:val="el-GR"/>
+          <w:lang w:val="en-US"/>
         </w:rPr>
       </w:pPr>
     </w:p>
@@ -695,7 +695,7 @@
       <w:pPr>
         <w:pStyle w:val="BodyText"/>
         <w:rPr>
-          <w:lang w:val="el-GR"/>
+          <w:lang w:val="en-US"/>
         </w:rPr>
       </w:pPr>
     </w:p>
@@ -703,7 +703,7 @@
       <w:pPr>
         <w:pStyle w:val="BodyText"/>
         <w:rPr>
-          <w:lang w:val="el-GR"/>
+          <w:lang w:val="en-US"/>
         </w:rPr>
       </w:pPr>
     </w:p>
@@ -711,7 +711,7 @@
       <w:pPr>
         <w:pStyle w:val="BodyText"/>
         <w:rPr>
-          <w:lang w:val="el-GR"/>
+          <w:lang w:val="en-US"/>
         </w:rPr>
       </w:pPr>
     </w:p>
@@ -719,7 +719,7 @@
       <w:pPr>
         <w:pStyle w:val="BodyText"/>
         <w:rPr>
-          <w:lang w:val="el-GR"/>
+          <w:lang w:val="en-US"/>
         </w:rPr>
       </w:pPr>
     </w:p>
@@ -727,7 +727,7 @@
       <w:pPr>
         <w:pStyle w:val="BodyText"/>
         <w:rPr>
-          <w:lang w:val="el-GR"/>
+          <w:lang w:val="en-US"/>
         </w:rPr>
       </w:pPr>
     </w:p>
@@ -735,7 +735,7 @@
       <w:pPr>
         <w:pStyle w:val="BodyText"/>
         <w:rPr>
-          <w:lang w:val="el-GR"/>
+          <w:lang w:val="en-US"/>
         </w:rPr>
       </w:pPr>
     </w:p>
@@ -743,7 +743,7 @@
       <w:pPr>
         <w:pStyle w:val="BodyText"/>
         <w:rPr>
-          <w:lang w:val="el-GR"/>
+          <w:lang w:val="en-US"/>
         </w:rPr>
       </w:pPr>
     </w:p>
@@ -751,7 +751,7 @@
       <w:pPr>
         <w:pStyle w:val="BodyText"/>
         <w:rPr>
-          <w:lang w:val="el-GR"/>
+          <w:lang w:val="en-US"/>
         </w:rPr>
       </w:pPr>
     </w:p>
@@ -759,7 +759,7 @@
       <w:pPr>
         <w:pStyle w:val="BodyText"/>
         <w:rPr>
-          <w:lang w:val="el-GR"/>
+          <w:lang w:val="en-US"/>
         </w:rPr>
       </w:pPr>
     </w:p>
@@ -795,32 +795,109 @@
       <w:pPr>
         <w:pStyle w:val="BodyText"/>
         <w:rPr>
+          <w:lang w:val="en-US"/>
+        </w:rPr>
+      </w:pPr>
+      <w:r>
+        <w:rPr>
+          <w:lang w:val="en-US"/>
+        </w:rPr>
+        <w:t xml:space="preserve">Copyright </w:t>
+      </w:r>
+      <w:r>
+        <w:rPr>
+          <w:lang w:val="en-US"/>
+        </w:rPr>
+        <w:t>©</w:t>
+      </w:r>
+      <w:r>
+        <w:rPr>
+          <w:lang w:val="en-US"/>
+        </w:rPr>
+        <w:t xml:space="preserve"> Koutsompinas Konstantinos</w:t>
+      </w:r>
+      <w:r>
+        <w:rPr>
+          <w:lang w:val="en-US"/>
+        </w:rPr>
+        <w:t>, 2026</w:t>
+      </w:r>
+    </w:p>
+    <w:p>
+      <w:pPr>
+        <w:pStyle w:val="BodyText"/>
+        <w:rPr>
           <w:lang w:val="el-GR"/>
         </w:rPr>
       </w:pPr>
       <w:r>
-        <w:rPr>
-          <w:lang w:val="en-US"/>
-        </w:rPr>
-        <w:t xml:space="preserve">Copyright </w:t>
-      </w:r>
-      <w:r>
-        <w:t>©</w:t>
-      </w:r>
-      <w:r>
-        <w:rPr>
-          <w:lang w:val="en-US"/>
-        </w:rPr>
-        <w:t xml:space="preserve"> Koutsompinas Konstantinos</w:t>
-      </w:r>
-      <w:r>
-        <w:t>, 202</w:t>
+        <w:t>Με</w:t>
+      </w:r>
+      <w:r>
+        <w:rPr>
+          <w:lang w:val="en-US"/>
+        </w:rPr>
+        <w:t xml:space="preserve"> </w:t>
+      </w:r>
+      <w:r>
+        <w:t>επιφύλαξη</w:t>
+      </w:r>
+      <w:r>
+        <w:rPr>
+          <w:lang w:val="en-US"/>
+        </w:rPr>
+        <w:t xml:space="preserve"> </w:t>
+      </w:r>
+      <w:r>
+        <w:t>παντός</w:t>
+      </w:r>
+      <w:r>
+        <w:rPr>
+          <w:lang w:val="en-US"/>
+        </w:rPr>
+        <w:t xml:space="preserve"> </w:t>
+      </w:r>
+      <w:r>
+        <w:t>δικαιώματος</w:t>
+      </w:r>
+      <w:r>
+        <w:rPr>
+          <w:lang w:val="en-US"/>
+        </w:rPr>
+        <w:t xml:space="preserve">. </w:t>
+      </w:r>
+      <w:r>
+        <w:rPr>
+          <w:lang w:val="en-US"/>
+        </w:rPr>
+        <w:t>All</w:t>
       </w:r>
       <w:r>
         <w:rPr>
           <w:lang w:val="el-GR"/>
         </w:rPr>
-        <w:t>6</w:t>
+        <w:t xml:space="preserve"> </w:t>
+      </w:r>
+      <w:r>
+        <w:rPr>
+          <w:lang w:val="en-US"/>
+        </w:rPr>
+        <w:t>rights</w:t>
+      </w:r>
+      <w:r>
+        <w:rPr>
+          <w:lang w:val="el-GR"/>
+        </w:rPr>
+        <w:t xml:space="preserve"> </w:t>
+      </w:r>
+      <w:r>
+        <w:rPr>
+          <w:lang w:val="en-US"/>
+        </w:rPr>
+        <w:t>reserved</w:t>
+      </w:r>
+      <w:r>
+        <w:t xml:space="preserve">. </w:t>
       </w:r>
     </w:p>
     <w:p>
@@ -828,50 +905,6 @@
         <w:pStyle w:val="BodyText"/>
         <w:rPr>
           <w:lang w:val="el-GR"/>
-        </w:rPr>
-      </w:pPr>
-      <w:r>
-        <w:t xml:space="preserve">Με επιφύλαξη παντός δικαιώματος. </w:t>
-      </w:r>
-      <w:r>
-        <w:rPr>
-          <w:lang w:val="en-US"/>
-        </w:rPr>
-        <w:t>All</w:t>
-      </w:r>
-      <w:r>
-        <w:rPr>
-          <w:lang w:val="el-GR"/>
-        </w:rPr>
-        <w:t xml:space="preserve"> </w:t>
-      </w:r>
-      <w:r>
-        <w:rPr>
-          <w:lang w:val="en-US"/>
-        </w:rPr>
-        <w:t>rights</w:t>
-      </w:r>
-      <w:r>
-        <w:rPr>
-          <w:lang w:val="el-GR"/>
-        </w:rPr>
-        <w:t xml:space="preserve"> </w:t>
-      </w:r>
-      <w:r>
-        <w:rPr>
-          <w:lang w:val="en-US"/>
-        </w:rPr>
-        <w:t>reserved</w:t>
-      </w:r>
-      <w:r>
-        <w:t xml:space="preserve">. </w:t>
-      </w:r>
-    </w:p>
-    <w:p>
-      <w:pPr>
-        <w:pStyle w:val="BodyText"/>
-        <w:rPr>
-          <w:lang w:val="en-US"/>
         </w:rPr>
       </w:pPr>
       <w:r>
@@ -1003,21 +1036,7 @@
         <w:rPr>
           <w:lang w:val="en-US"/>
         </w:rPr>
-        <w:t xml:space="preserve">Firstly, I would like to express my sincere gratitude to Mr. Athanasios Argyriou, my thesis supervisor, for his guidance, constructive feedback, and continuous support throughout this work. His assistance not only improved the quality of this </w:t>
-      </w:r>
-      <w:proofErr w:type="gramStart"/>
-      <w:r>
-        <w:rPr>
-          <w:lang w:val="en-US"/>
-        </w:rPr>
-        <w:t>thesis, but</w:t>
-      </w:r>
-      <w:proofErr w:type="gramEnd"/>
-      <w:r>
-        <w:rPr>
-          <w:lang w:val="en-US"/>
-        </w:rPr>
-        <w:t xml:space="preserve"> also helped me gain valuable knowledge and practical experience in machine learning and data analysis, as well as in developing robust research-driven pipelines.</w:t>
+        <w:t>Firstly, I would like to express my sincere gratitude to Mr. Athanasios Argyriou, my thesis supervisor, for his guidance, constructive feedback, and continuous support throughout this work. His assistance not only improved the quality of this thesis, but also helped me gain valuable knowledge and practical experience in machine learning and data analysis, as well as in developing robust research-driven pipelines.</w:t>
       </w:r>
     </w:p>
     <w:p>
@@ -4236,23 +4255,7 @@
             <w:noProof/>
             <w:lang w:val="en-US"/>
           </w:rPr>
-          <w:t>Figure 1: Data Split figure for training - evaluation – te</w:t>
-        </w:r>
-        <w:r>
-          <w:rPr>
-            <w:rStyle w:val="Hyperlink"/>
-            <w:noProof/>
-            <w:lang w:val="en-US"/>
-          </w:rPr>
-          <w:t>s</w:t>
-        </w:r>
-        <w:r>
-          <w:rPr>
-            <w:rStyle w:val="Hyperlink"/>
-            <w:noProof/>
-            <w:lang w:val="en-US"/>
-          </w:rPr>
-          <w:t>ting</w:t>
+          <w:t>Figure 1: Data Split figure for training - evaluation – testing</w:t>
         </w:r>
         <w:r>
           <w:rPr>
@@ -7054,7 +7057,21 @@
           <w:noProof/>
           <w:lang w:val="en-US"/>
         </w:rPr>
-        <w:t>, made more dangerous by the massive volume of transactions nowadays, and the fact that fraudulent cases are rare compared to legitimate ones. This thesis builds and tests a supervised machine learning pipeline for credit card fraud detection using the IEEE-CIS dataset, which includes complex data on devices, identities, and custom-built features. The pipeline is focused on three gradient boosting models (XGBoost, LightGBM, and CatBoost) and a time-based experimental setup is used to simulate a real-world launch. This involved splitting data chronologically and using time-series cross-validation for tuning. To measure success, ROC-AUC is prioritized, but also PR-AUC, precision, recall, and F1-score are examined to understand the practical trade-offs. The research explores four main areas: (i) working with the original imbalanced data, (ii) using a 1:5 downsampling ratio to balance the classes, (iii) cutting down features based on where the different models agreed on importance, and (iv) adjusting decision thresholds to catch more fraud. A key finding is that the engineered behavioral and aggregate features contribute heavily to model performance, often ranking among the most informative predictors by capturing subtle transaction patterns that raw fields miss. The results indicate that LightGBM is the most reliable model (ROC-AUC ≈ 0.918–0.919). Downsampling helped the models learn the "fraud" patterns better, while feature reduction kept the system fast without losing accuracy. Finally, I found that while lowering the detection threshold can catch over 90% of fraud, it also leads to more false alarms, showing that banks must choose their settings based on their actual budget and staff capacity.</w:t>
+        <w:t xml:space="preserve">, made more dangerous by the massive volume of transactions nowadays, and the fact that fraudulent cases are rare compared to legitimate ones. This thesis builds and tests a supervised machine learning pipeline for credit card fraud detection using the IEEE-CIS dataset, which includes complex data on devices, identities, and custom-built features. The pipeline is focused on three gradient boosting models (XGBoost, LightGBM, and CatBoost) and a time-based experimental setup is used to simulate a real-world launch. This involved splitting data chronologically and using time-series cross-validation for tuning. To measure success, ROC-AUC is prioritized, but also PR-AUC, precision, recall, and F1-score are examined to understand the practical trade-offs. The research explores four main areas: (i) working with the original imbalanced data, (ii) using a 1:5 downsampling ratio to balance the classes, (iii) cutting down features based on where the different models agreed on importance, and (iv) adjusting decision thresholds to catch more fraud. A key finding is that the engineered behavioral and aggregate features contribute heavily to model performance, often ranking among the most informative predictors by capturing subtle transaction patterns that raw fields miss. The results indicate that LightGBM is the most reliable model (ROC-AUC ≈ 0.918–0.919). Downsampling helped the models learn the "fraud" patterns better, while feature reduction kept the system fast without losing accuracy. Finally, </w:t>
+      </w:r>
+      <w:r>
+        <w:rPr>
+          <w:noProof/>
+          <w:lang w:val="en-US"/>
+        </w:rPr>
+        <w:t>it was</w:t>
+      </w:r>
+      <w:r>
+        <w:rPr>
+          <w:noProof/>
+          <w:lang w:val="en-US"/>
+        </w:rPr>
+        <w:t xml:space="preserve"> found that while lowering the detection threshold can catch over 90% of fraud, it also leads to more false alarms, showing that banks must choose their settings based on their actual budget and staff capacity.</w:t>
       </w:r>
     </w:p>
     <w:p>
@@ -7227,30 +7244,34 @@
         <w:rPr>
           <w:noProof/>
         </w:rPr>
-        <w:t xml:space="preserve">Η απάτη στις ψηφιακές πληρωμές αποτελεί μια διαρκώς εξελισσόμενη απειλή, η οποία γίνεται πιο επικίνδυνη λόγω του τεράστιου όγκου συναλλαγών σήμερα και του γεγονότος ότι τα περιστατικά απάτης είναι σπάνια σε σχέση με τις νόμιμες συναλλαγές. Η παρούσα διπλωματική εργασία αναπτύσσει και αξιολογεί ένα εποπτευόμενο (supervised) pipeline μηχανικής μάθησης για τον εντοπισμό απάτης σε συναλλαγές με πιστωτική κάρτα, χρησιμοποιώντας το σύνολο δεδομένων IEEE-CIS, το οποίο περιλαμβάνει σύνθετα δεδομένα σχετικά με συσκευές, ταυτότητες και προσαρμοσμένα (engineered) χαρακτηριστικά. Το pipeline εστιάζει σε τρία μοντέλα gradient boosting (XGBoost, LightGBM και CatBoost) και χρησιμοποιεί ένα χρονικά βασισμένο πειραματικό στήσιμο ώστε να προσομοιάζει μια ρεαλιστική εφαρμογή στην πράξη. Αυτό περιλάμβανε χρονολογικό διαχωρισμό των δεδομένων και time-series cross-validation για τη ρύθμιση υπερπαραμέτρων. Για τη μέτρηση της απόδοσης δίνεται προτεραιότητα στο ROC-AUC, ενώ εξετάζονται επίσης τα PR-AUC, precision, recall και F1-score, ώστε να αποτυπωθούν καλύτερα οι πρακτικοί συμβιβασμοί. Η έρευνα διερευνά τέσσερις βασικές κατευθύνσεις: (i) εκπαίδευση με τα αρχικά, έντονα μη ισορροπημένα δεδομένα, (ii) χρήση downsampling με λόγο 1:5 για εξισορρόπηση των κλάσεων, (iii) μείωση χαρακτηριστικών με βάση τη συμφωνία των διαφορετικών μοντέλων ως προς τη σημασία τους, και (iv) προσαρμογή των thresholds απόφασης για τον εντοπισμό περισσότερων περιπτώσεων απάτης. Ένα βασικό εύρημα είναι ότι τα παραγόμενα (engineered) χαρακτηριστικά, όπως αθροιστικά και συμπεριφορικά metrics, συμβάλλουν καθοριστικά στην απόδοση, καθώς συχνά κατατάσσονται στα πιο πληροφοριακά predictors και αποτυπώνουν λεπτά μοτίβα συναλλαγών που τα </w:t>
+        <w:t xml:space="preserve">Η απάτη στις ψηφιακές πληρωμές αποτελεί μια διαρκώς εξελισσόμενη απειλή, η οποία γίνεται </w:t>
       </w:r>
       <w:r>
         <w:rPr>
           <w:noProof/>
           <w:lang w:val="el-GR"/>
         </w:rPr>
-        <w:t>αρχικά</w:t>
+        <w:t xml:space="preserve">ολοένα και </w:t>
       </w:r>
       <w:r>
         <w:rPr>
           <w:noProof/>
         </w:rPr>
-        <w:t xml:space="preserve"> πεδία δεν αναδεικνύουν. Τα αποτελέσματα δείχνουν ότι το LightGBM είναι το πιο αξιόπιστο μοντέλο (ROC-AUC ≈ 0.918–0.919). Το downsampling βοήθησε τα μοντέλα να μάθουν καλύτερα τα μοτίβα της απάτης, ενώ η μείωση χαρακτηριστικών διατήρησε το σύστημα γρήγορο χωρίς απώλεια ακρίβειας. Τέλος, διαπιστώθηκε ότι, παρότι η μείωση του threshold ανίχνευσης μπορεί να εντοπίσει πάνω από το 90% των περιστατικών απάτης, οδηγεί και σε περισσότερους ψευδείς συναγερμούς, γεγονός που δείχνει ότι οι τράπεζες πρέπει να ρυθμίζουν το σύστημα με βάση τον πραγματικό τους προϋπολογισμό και τη διαθέσιμη επιχειρησιακή ικανότητα (προσωπικό).</w:t>
-      </w:r>
-    </w:p>
-    <w:p>
-      <w:pPr>
-        <w:pStyle w:val="BodyText"/>
+        <w:t xml:space="preserve">πιο επικίνδυνη λόγω του τεράστιου όγκου συναλλαγών σήμερα και του γεγονότος ότι τα περιστατικά απάτης είναι σπάνια σε σχέση με τις νόμιμες συναλλαγές. Η παρούσα διπλωματική εργασία αναπτύσσει και αξιολογεί ένα εποπτευόμενο (supervised) pipeline μηχανικής μάθησης για τον εντοπισμό απάτης σε συναλλαγές με πιστωτική κάρτα, χρησιμοποιώντας το σύνολο δεδομένων IEEE-CIS, το οποίο περιλαμβάνει σύνθετα δεδομένα σχετικά με συσκευές, ταυτότητες και προσαρμοσμένα (engineered) χαρακτηριστικά. Το pipeline εστιάζει σε τρία μοντέλα gradient boosting (XGBoost, LightGBM και CatBoost) και χρησιμοποιεί ένα χρονικά βασισμένο πειραματικό στήσιμο ώστε να προσομοιάζει μια ρεαλιστική εφαρμογή στην πράξη. Αυτό περιλάμβανε χρονολογικό διαχωρισμό των δεδομένων και time-series cross-validation για τη ρύθμιση υπερπαραμέτρων. Για τη μέτρηση της απόδοσης δίνεται προτεραιότητα στο ROC-AUC, ενώ εξετάζονται επίσης τα PR-AUC, precision, recall και F1-score, ώστε να αποτυπωθούν καλύτερα οι πρακτικοί συμβιβασμοί. Η έρευνα διερευνά τέσσερις βασικές κατευθύνσεις: (i) εκπαίδευση με τα αρχικά, έντονα μη ισορροπημένα δεδομένα, (ii) χρήση downsampling με λόγο 1:5 για εξισορρόπηση των κλάσεων, (iii) μείωση χαρακτηριστικών με βάση τη συμφωνία των διαφορετικών μοντέλων ως προς τη σημασία τους, και (iv) προσαρμογή των thresholds απόφασης για τον εντοπισμό περισσότερων περιπτώσεων απάτης. Ένα βασικό εύρημα είναι ότι τα παραγόμενα (engineered) χαρακτηριστικά, όπως αθροιστικά και συμπεριφορικά metrics, συμβάλλουν καθοριστικά στην απόδοση, καθώς συχνά κατατάσσονται στα πιο πληροφοριακά predictors και αποτυπώνουν λεπτά μοτίβα συναλλαγών που τα </w:t>
+      </w:r>
+      <w:r>
         <w:rPr>
           <w:noProof/>
           <w:lang w:val="el-GR"/>
         </w:rPr>
-      </w:pPr>
+        <w:t>αρχικά</w:t>
+      </w:r>
+      <w:r>
+        <w:rPr>
+          <w:noProof/>
+        </w:rPr>
+        <w:t xml:space="preserve"> πεδία δεν αναδεικνύουν. Τα αποτελέσματα δείχνουν ότι το LightGBM είναι το πιο αξιόπιστο μοντέλο (ROC-AUC ≈ 0.918–0.919). Το downsampling βοήθησε τα μοντέλα να μάθουν καλύτερα τα μοτίβα της απάτης, ενώ η μείωση χαρακτηριστικών διατήρησε το σύστημα γρήγορο χωρίς απώλεια ακρίβειας. Τέλος, διαπιστώθηκε ότι, παρότι η μείωση του threshold ανίχνευσης μπορεί να εντοπίσει πάνω από το 90% των περιστατικών απάτης, οδηγεί και σε περισσότερους ψευδείς συναγερμούς, γεγονός που δείχνει ότι οι τράπεζες πρέπει να ρυθμίζουν το σύστημα με βάση τον πραγματικό τους προϋπολογισμό και τη διαθέσιμη επιχειρησιακή ικανότητα (προσωπικό).</w:t>
+      </w:r>
     </w:p>
     <w:p>
       <w:pPr>
@@ -7296,73 +7317,99 @@
         <w:rPr>
           <w:noProof/>
         </w:rPr>
-        <w:t xml:space="preserve"> ενισχυμένη δένδρων (gradient boosting)</w:t>
-      </w:r>
-      <w:r>
-        <w:rPr>
-          <w:noProof/>
-        </w:rPr>
-        <w:t>,</w:t>
-      </w:r>
-      <w:r>
-        <w:rPr>
-          <w:noProof/>
-        </w:rPr>
-        <w:t xml:space="preserve"> μη ισορροπημένη ταξινόμηση</w:t>
-      </w:r>
-      <w:r>
-        <w:rPr>
-          <w:noProof/>
-        </w:rPr>
-        <w:t>,</w:t>
-      </w:r>
-      <w:r>
-        <w:rPr>
-          <w:noProof/>
-        </w:rPr>
-        <w:t xml:space="preserve"> σύνολο δεδομένων IEEE-CIS</w:t>
-      </w:r>
-      <w:r>
-        <w:rPr>
-          <w:noProof/>
-        </w:rPr>
-        <w:t>,</w:t>
-      </w:r>
-      <w:r>
-        <w:rPr>
-          <w:noProof/>
-        </w:rPr>
-        <w:t xml:space="preserve"> μηχανική χαρακτηριστικών (feature engineering)</w:t>
-      </w:r>
-      <w:r>
-        <w:rPr>
-          <w:noProof/>
-        </w:rPr>
-        <w:t>,</w:t>
-      </w:r>
-      <w:r>
-        <w:rPr>
-          <w:noProof/>
-        </w:rPr>
-        <w:t xml:space="preserve"> διασταυρούμενη επικύρωση χρονοσειρών</w:t>
-      </w:r>
-      <w:r>
-        <w:rPr>
-          <w:noProof/>
-        </w:rPr>
-        <w:t>,</w:t>
-      </w:r>
-      <w:r>
-        <w:rPr>
-          <w:noProof/>
-        </w:rPr>
-        <w:t xml:space="preserve"> ρύθμιση κατωφλίου (threshold).</w:t>
+        <w:t xml:space="preserve"> ενισχυμένη </w:t>
       </w:r>
       <w:r>
         <w:rPr>
           <w:noProof/>
           <w:lang w:val="el-GR"/>
         </w:rPr>
+        <w:t xml:space="preserve">μάθηση </w:t>
+      </w:r>
+      <w:r>
+        <w:rPr>
+          <w:noProof/>
+        </w:rPr>
+        <w:t>δένδρων (gradient boosting)</w:t>
+      </w:r>
+      <w:r>
+        <w:rPr>
+          <w:noProof/>
+        </w:rPr>
+        <w:t>,</w:t>
+      </w:r>
+      <w:r>
+        <w:rPr>
+          <w:noProof/>
+        </w:rPr>
+        <w:t xml:space="preserve"> μη ισορροπημένη ταξινόμηση</w:t>
+      </w:r>
+      <w:r>
+        <w:rPr>
+          <w:noProof/>
+        </w:rPr>
+        <w:t>,</w:t>
+      </w:r>
+      <w:r>
+        <w:rPr>
+          <w:noProof/>
+        </w:rPr>
+        <w:t xml:space="preserve"> σύνολο δεδομένων IEEE-CIS</w:t>
+      </w:r>
+      <w:r>
+        <w:rPr>
+          <w:noProof/>
+        </w:rPr>
+        <w:t>,</w:t>
+      </w:r>
+      <w:r>
+        <w:rPr>
+          <w:noProof/>
+        </w:rPr>
+        <w:t xml:space="preserve"> </w:t>
+      </w:r>
+      <w:r>
+        <w:rPr>
+          <w:noProof/>
+          <w:lang w:val="el-GR"/>
+        </w:rPr>
+        <w:t>κατασκευή</w:t>
+      </w:r>
+      <w:r>
+        <w:rPr>
+          <w:noProof/>
+        </w:rPr>
+        <w:t xml:space="preserve"> χαρακτηριστικών (feature engineering)</w:t>
+      </w:r>
+      <w:r>
+        <w:rPr>
+          <w:noProof/>
+        </w:rPr>
+        <w:t>,</w:t>
+      </w:r>
+      <w:r>
+        <w:rPr>
+          <w:noProof/>
+        </w:rPr>
+        <w:t xml:space="preserve"> διασταυρούμενη επικύρωση χρονοσειρών</w:t>
+      </w:r>
+      <w:r>
+        <w:rPr>
+          <w:noProof/>
+        </w:rPr>
+        <w:t>,</w:t>
+      </w:r>
+      <w:r>
+        <w:rPr>
+          <w:noProof/>
+        </w:rPr>
+        <w:t xml:space="preserve"> ρύθμιση κατωφλίου (threshold).</w:t>
+      </w:r>
+      <w:r>
+        <w:rPr>
+          <w:noProof/>
+          <w:lang w:val="el-GR"/>
+        </w:rPr>
         <w:br w:type="page"/>
       </w:r>
     </w:p>
@@ -7708,7 +7755,19 @@
         <w:rPr>
           <w:lang w:val="en-US"/>
         </w:rPr>
-        <w:t>Early fraud detection systems largely relied on manual review and rule-based policies (e.g., fixed thresholds and expert-defined rules). While such approaches remain useful in specific scenarios, they are often limited in their ability to adapt to changing fraud strategies and complex behavioral patterns. Machine learning methods have therefore become central to contemporary fraud detection, as they can learn decision boundaries from historical transaction data and produce risk scores that enable prioriti</w:t>
+        <w:t xml:space="preserve">Early fraud detection systems largely relied on manual review and rule-based policies (e.g. fixed thresholds and expert-defined rules). While such approaches remain useful in specific scenarios, they are often limited in their ability to adapt to changing fraud strategies and complex behavioral patterns. Machine learning methods have therefore become central to </w:t>
+      </w:r>
+      <w:r>
+        <w:rPr>
+          <w:lang w:val="en-US"/>
+        </w:rPr>
+        <w:t>modern</w:t>
+      </w:r>
+      <w:r>
+        <w:rPr>
+          <w:lang w:val="en-US"/>
+        </w:rPr>
+        <w:t xml:space="preserve"> fraud detection, as they can learn decision boundaries from historical transaction data and produce risk scores that enable prioriti</w:t>
       </w:r>
       <w:r>
         <w:rPr>
@@ -7720,7 +7779,19 @@
         <w:rPr>
           <w:lang w:val="en-US"/>
         </w:rPr>
-        <w:t>ation and automated screening. Consequently, the research literature has increasingly focused on supervised learning pipelines, feature engineering strategies that encode behavioral signals, and evaluation protocols tailored to the severe class imbalance that characteri</w:t>
+        <w:t xml:space="preserve">ation and automated screening. </w:t>
+      </w:r>
+      <w:r>
+        <w:rPr>
+          <w:lang w:val="en-US"/>
+        </w:rPr>
+        <w:t xml:space="preserve">Furthermore, through the retraining process, they can adapt and “rediscover” the fraud patterns, without the manual labor that would be needed in manual review and rule-based policies. </w:t>
+      </w:r>
+      <w:r>
+        <w:rPr>
+          <w:lang w:val="en-US"/>
+        </w:rPr>
+        <w:t>Consequently, the research literature has increasingly focused on supervised learning pipelines, feature engineering strategies that encode behavioral signals, and evaluation protocols tailored to the severe class imbalance that characteri</w:t>
       </w:r>
       <w:r>
         <w:rPr>
@@ -7839,6 +7910,14 @@
         </w:rPr>
         <w:t xml:space="preserve"> we summarize the main techniques and compare their utility:</w:t>
       </w:r>
+    </w:p>
+    <w:p>
+      <w:pPr>
+        <w:pStyle w:val="BodyText"/>
+        <w:rPr>
+          <w:lang w:val="en-US"/>
+        </w:rPr>
+      </w:pPr>
     </w:p>
     <w:p>
       <w:pPr>
@@ -7856,6 +7935,7 @@
           <w:sz w:val="28"/>
           <w:szCs w:val="28"/>
         </w:rPr>
+        <w:lastRenderedPageBreak/>
         <w:t xml:space="preserve">2.2.1. </w:t>
       </w:r>
       <w:r>
@@ -7901,41 +7981,175 @@
           <w:bCs/>
           <w:lang w:val="en-US"/>
         </w:rPr>
-        <w:t xml:space="preserve">logistic regression, </w:t>
-      </w:r>
-      <w:proofErr w:type="gramStart"/>
+        <w:t>logistic regression, decision trees, random forests,</w:t>
+      </w:r>
       <w:r>
         <w:rPr>
           <w:b/>
           <w:bCs/>
           <w:lang w:val="en-US"/>
         </w:rPr>
-        <w:t>decision</w:t>
-      </w:r>
-      <w:proofErr w:type="gramEnd"/>
+        <w:t xml:space="preserve"> </w:t>
+      </w:r>
       <w:r>
         <w:rPr>
           <w:b/>
           <w:bCs/>
           <w:lang w:val="en-US"/>
         </w:rPr>
-        <w:t xml:space="preserve"> trees, random forests,</w:t>
-      </w:r>
+        <w:t>support vector machines (SVMs), and neural networks</w:t>
+      </w:r>
+      <w:r>
+        <w:rPr>
+          <w:lang w:val="en-US"/>
+        </w:rPr>
+        <w:t>. Supervised classifiers tend to achieve high accuracy when ample labeled examples of fraud are available, and they can directly optimize metrics like classification accuracy or F1-score</w:t>
+      </w:r>
+    </w:p>
+    <w:p>
+      <w:pPr>
+        <w:pStyle w:val="BodyText"/>
+        <w:rPr>
+          <w:lang w:val="en-US"/>
+        </w:rPr>
+      </w:pPr>
       <w:r>
         <w:rPr>
           <w:b/>
           <w:bCs/>
           <w:lang w:val="en-US"/>
         </w:rPr>
-        <w:t xml:space="preserve"> </w:t>
-      </w:r>
+        <w:t>Strengths:</w:t>
+      </w:r>
+      <w:r>
+        <w:rPr>
+          <w:lang w:val="en-US"/>
+        </w:rPr>
+        <w:t xml:space="preserve"> Supervised models can leverage well-understood algorithms and yield high detection performance if trained on representative data. They produce a clear decision output (fraud or not) for each transaction and can incorporate cost-sensitive learning to penalize misclassification of fraud heavily. </w:t>
+      </w:r>
+    </w:p>
+    <w:p>
+      <w:pPr>
+        <w:pStyle w:val="BodyText"/>
+        <w:rPr>
+          <w:lang w:val="en-US"/>
+        </w:rPr>
+      </w:pPr>
       <w:r>
         <w:rPr>
           <w:b/>
           <w:bCs/>
           <w:lang w:val="en-US"/>
         </w:rPr>
-        <w:t xml:space="preserve">support vector machines (SVMs), and neural </w:t>
+        <w:t>Weaknesses:</w:t>
+      </w:r>
+      <w:r>
+        <w:rPr>
+          <w:lang w:val="en-US"/>
+        </w:rPr>
+        <w:t xml:space="preserve"> They require large quantities of labeled fraud data, which is often scarce. By nature, supervised models struggle with new fraud patterns not present in the training data</w:t>
+      </w:r>
+      <w:r>
+        <w:rPr>
+          <w:lang w:val="en-US"/>
+        </w:rPr>
+        <w:t>,</w:t>
+      </w:r>
+      <w:r>
+        <w:rPr>
+          <w:lang w:val="en-US"/>
+        </w:rPr>
+        <w:t xml:space="preserve"> they tend to detect “known” fraud </w:t>
+      </w:r>
+      <w:r>
+        <w:rPr>
+          <w:lang w:val="en-US"/>
+        </w:rPr>
+        <w:t xml:space="preserve">patterns </w:t>
+      </w:r>
+      <w:r>
+        <w:rPr>
+          <w:lang w:val="en-US"/>
+        </w:rPr>
+        <w:t xml:space="preserve">but can miss novel schemes. Moreover, in highly imbalanced </w:t>
+      </w:r>
+      <w:r>
+        <w:rPr>
+          <w:lang w:val="en-US"/>
+        </w:rPr>
+        <w:t xml:space="preserve">datasets, which is quite common on fraud detection cases, </w:t>
+      </w:r>
+      <w:r>
+        <w:rPr>
+          <w:lang w:val="en-US"/>
+        </w:rPr>
+        <w:t xml:space="preserve">supervised learners may </w:t>
+      </w:r>
+      <w:r>
+        <w:rPr>
+          <w:lang w:val="en-US"/>
+        </w:rPr>
+        <w:t>be biased</w:t>
+      </w:r>
+      <w:r>
+        <w:rPr>
+          <w:lang w:val="en-US"/>
+        </w:rPr>
+        <w:t xml:space="preserve"> toward the majority class without special handling. Many studies address this via resampling or algorithmic techniques but it remains a challenge.</w:t>
+      </w:r>
+    </w:p>
+    <w:p>
+      <w:pPr>
+        <w:pStyle w:val="subsubheading"/>
+        <w:rPr>
+          <w:lang w:val="en-US"/>
+        </w:rPr>
+      </w:pPr>
+      <w:bookmarkStart w:id="13" w:name="_Toc221291845"/>
+      <w:r>
+        <w:rPr>
+          <w:lang w:val="en-US"/>
+        </w:rPr>
+        <w:t>2.2.2. Unsupervised and Semi-Supervised Learning (Anomaly Detection)</w:t>
+      </w:r>
+      <w:bookmarkEnd w:id="13"/>
+    </w:p>
+    <w:p>
+      <w:pPr>
+        <w:pStyle w:val="BodyText"/>
+        <w:rPr>
+          <w:lang w:val="en-US"/>
+        </w:rPr>
+      </w:pPr>
+      <w:r>
+        <w:rPr>
+          <w:lang w:val="en-US"/>
+        </w:rPr>
+        <w:t xml:space="preserve">Because fraudulent transactions are rare and evolving, unsupervised learning techniques are crucial to detect anomalies without relying on labeled examples (Ali et al., 2022; </w:t>
+      </w:r>
+      <w:r>
+        <w:rPr>
+          <w:lang w:val="en-US"/>
+        </w:rPr>
+        <w:t>Waleed Hilal, S. Andrew Gadsden, and John Yawney, 2021</w:t>
+      </w:r>
+      <w:r>
+        <w:rPr>
+          <w:lang w:val="en-US"/>
+        </w:rPr>
+        <w:t xml:space="preserve">). Unsupervised methods </w:t>
+      </w:r>
+      <w:r>
+        <w:rPr>
+          <w:lang w:val="en-US"/>
+        </w:rPr>
+        <w:t>attempt</w:t>
+      </w:r>
+      <w:r>
+        <w:rPr>
+          <w:lang w:val="en-US"/>
+        </w:rPr>
+        <w:t xml:space="preserve"> to model the distribution of normal transactions and flag outliers as potential fraud. Common approaches include </w:t>
       </w:r>
       <w:r>
         <w:rPr>
@@ -7943,165 +8157,42 @@
           <w:bCs/>
           <w:lang w:val="en-US"/>
         </w:rPr>
-        <w:lastRenderedPageBreak/>
-        <w:t>networks</w:t>
-      </w:r>
-      <w:r>
-        <w:rPr>
-          <w:lang w:val="en-US"/>
-        </w:rPr>
-        <w:t>. Supervised classifiers tend to achieve high accuracy when ample labeled examples of fraud are available, and they can directly optimize metrics like classification accuracy or F1-score</w:t>
-      </w:r>
-    </w:p>
-    <w:p>
-      <w:pPr>
-        <w:pStyle w:val="BodyText"/>
-        <w:rPr>
-          <w:lang w:val="en-US"/>
-        </w:rPr>
-      </w:pPr>
+        <w:t>clustering algorithms</w:t>
+      </w:r>
+      <w:r>
+        <w:rPr>
+          <w:lang w:val="en-US"/>
+        </w:rPr>
+        <w:t xml:space="preserve"> (k-means, DBSCAN), </w:t>
+      </w:r>
       <w:r>
         <w:rPr>
           <w:b/>
           <w:bCs/>
           <w:lang w:val="en-US"/>
         </w:rPr>
-        <w:t>Strengths:</w:t>
-      </w:r>
-      <w:r>
-        <w:rPr>
-          <w:lang w:val="en-US"/>
-        </w:rPr>
-        <w:t xml:space="preserve"> Supervised models can leverage well-understood algorithms and yield high detection performance if trained on representative data. They produce a clear decision output (fraud or not) for each transaction and can incorporate cost-sensitive learning to penalize misclassification of fraud heavily. </w:t>
-      </w:r>
-    </w:p>
-    <w:p>
-      <w:pPr>
-        <w:pStyle w:val="BodyText"/>
-        <w:rPr>
-          <w:lang w:val="en-US"/>
-        </w:rPr>
-      </w:pPr>
+        <w:t>density estimation</w:t>
+      </w:r>
+      <w:r>
+        <w:rPr>
+          <w:lang w:val="en-US"/>
+        </w:rPr>
+        <w:t xml:space="preserve">, and </w:t>
+      </w:r>
       <w:r>
         <w:rPr>
           <w:b/>
           <w:bCs/>
           <w:lang w:val="en-US"/>
         </w:rPr>
-        <w:t>Weaknesses:</w:t>
-      </w:r>
-      <w:r>
-        <w:rPr>
-          <w:lang w:val="en-US"/>
-        </w:rPr>
-        <w:t xml:space="preserve"> They require large quantities of labeled fraud data, which is often scarce. By nature, supervised models struggle with new fraud patterns </w:t>
-      </w:r>
-      <w:proofErr w:type="gramStart"/>
-      <w:r>
-        <w:rPr>
-          <w:lang w:val="en-US"/>
-        </w:rPr>
-        <w:t>not present</w:t>
-      </w:r>
-      <w:proofErr w:type="gramEnd"/>
-      <w:r>
-        <w:rPr>
-          <w:lang w:val="en-US"/>
-        </w:rPr>
-        <w:t xml:space="preserve"> in the training data</w:t>
-      </w:r>
-      <w:r>
-        <w:rPr>
-          <w:lang w:val="en-US"/>
-        </w:rPr>
-        <w:t>,</w:t>
-      </w:r>
-      <w:r>
-        <w:rPr>
-          <w:lang w:val="en-US"/>
-        </w:rPr>
-        <w:t xml:space="preserve"> they tend to detect “known” fraud </w:t>
-      </w:r>
-      <w:r>
-        <w:rPr>
-          <w:lang w:val="en-US"/>
-        </w:rPr>
-        <w:t xml:space="preserve">patterns </w:t>
-      </w:r>
-      <w:r>
-        <w:rPr>
-          <w:lang w:val="en-US"/>
-        </w:rPr>
-        <w:t xml:space="preserve">but can miss novel schemes. Moreover, in highly imbalanced </w:t>
-      </w:r>
-      <w:r>
-        <w:rPr>
-          <w:lang w:val="en-US"/>
-        </w:rPr>
-        <w:t xml:space="preserve">datasets, which </w:t>
-      </w:r>
-      <w:proofErr w:type="gramStart"/>
-      <w:r>
-        <w:rPr>
-          <w:lang w:val="en-US"/>
-        </w:rPr>
-        <w:t>is</w:t>
-      </w:r>
-      <w:proofErr w:type="gramEnd"/>
-      <w:r>
-        <w:rPr>
-          <w:lang w:val="en-US"/>
-        </w:rPr>
-        <w:t xml:space="preserve"> quite common on fraud detection cases, </w:t>
-      </w:r>
-      <w:r>
-        <w:rPr>
-          <w:lang w:val="en-US"/>
-        </w:rPr>
-        <w:t xml:space="preserve">supervised learners may </w:t>
-      </w:r>
-      <w:r>
-        <w:rPr>
-          <w:lang w:val="en-US"/>
-        </w:rPr>
-        <w:t>be biased</w:t>
-      </w:r>
-      <w:r>
-        <w:rPr>
-          <w:lang w:val="en-US"/>
-        </w:rPr>
-        <w:t xml:space="preserve"> toward the majority class without special handling. Many studies address this via resampling or algorithmic </w:t>
-      </w:r>
-      <w:proofErr w:type="gramStart"/>
-      <w:r>
-        <w:rPr>
-          <w:lang w:val="en-US"/>
-        </w:rPr>
-        <w:t>techniques</w:t>
-      </w:r>
-      <w:proofErr w:type="gramEnd"/>
-      <w:r>
-        <w:rPr>
-          <w:lang w:val="en-US"/>
-        </w:rPr>
-        <w:t xml:space="preserve"> but it remains a challenge.</w:t>
-      </w:r>
-    </w:p>
-    <w:p>
-      <w:pPr>
-        <w:pStyle w:val="subsubheading"/>
-        <w:rPr>
-          <w:lang w:val="en-US"/>
-        </w:rPr>
-      </w:pPr>
-      <w:bookmarkStart w:id="13" w:name="_Toc221291845"/>
-      <w:r>
-        <w:rPr>
-          <w:lang w:val="en-US"/>
-        </w:rPr>
-        <w:t>2.2.2. Unsupervised and Semi-Supervised Learning (Anomaly Detection)</w:t>
-      </w:r>
-      <w:bookmarkEnd w:id="13"/>
+        <w:t>one-class classification</w:t>
+      </w:r>
+      <w:r>
+        <w:rPr>
+          <w:lang w:val="en-US"/>
+        </w:rPr>
+        <w:t xml:space="preserve"> methods (One-Class SVM, Isolation Forest). </w:t>
+      </w:r>
     </w:p>
     <w:p>
       <w:pPr>
@@ -8110,63 +8201,48 @@
           <w:lang w:val="en-US"/>
         </w:rPr>
       </w:pPr>
-      <w:r>
-        <w:rPr>
-          <w:lang w:val="en-US"/>
-        </w:rPr>
-        <w:t xml:space="preserve">Because fraudulent transactions are rare and evolving, unsupervised learning techniques are crucial to detect anomalies without relying on labeled examples (Ali et al., 2022; </w:t>
-      </w:r>
-      <w:r>
-        <w:rPr>
-          <w:lang w:val="en-US"/>
-        </w:rPr>
-        <w:t>Waleed Hilal, S. Andrew Gadsden, and John Yawney, 2021</w:t>
-      </w:r>
-      <w:r>
-        <w:rPr>
-          <w:lang w:val="en-US"/>
-        </w:rPr>
-        <w:t xml:space="preserve">). Unsupervised methods </w:t>
-      </w:r>
-      <w:r>
-        <w:rPr>
-          <w:lang w:val="en-US"/>
-        </w:rPr>
-        <w:t>attempt</w:t>
-      </w:r>
-      <w:r>
-        <w:rPr>
-          <w:lang w:val="en-US"/>
-        </w:rPr>
-        <w:t xml:space="preserve"> to model the distribution of normal transactions and flag outliers as potential fraud. Common approaches include </w:t>
-      </w:r>
       <w:r>
         <w:rPr>
           <w:b/>
           <w:bCs/>
           <w:lang w:val="en-US"/>
         </w:rPr>
-        <w:t>clustering algorithms</w:t>
-      </w:r>
-      <w:r>
-        <w:rPr>
-          <w:lang w:val="en-US"/>
-        </w:rPr>
-        <w:t xml:space="preserve"> (k-means, DBSCAN), </w:t>
-      </w:r>
+        <w:t>Strengths:</w:t>
+      </w:r>
+      <w:r>
+        <w:rPr>
+          <w:lang w:val="en-US"/>
+        </w:rPr>
+        <w:t xml:space="preserve"> Unsupervised anomaly detection can potentially identify previously unseen fraud patterns, making it adaptive to emerging threats. It does not require annotated fraud data, which is useful when labels are expensive or delayed (a common situation in financial fraud, where only some frauds are ever confirmed). </w:t>
+      </w:r>
+    </w:p>
+    <w:p>
+      <w:pPr>
+        <w:pStyle w:val="BodyText"/>
+        <w:rPr>
+          <w:lang w:val="en-US"/>
+        </w:rPr>
+      </w:pPr>
       <w:r>
         <w:rPr>
           <w:b/>
           <w:bCs/>
           <w:lang w:val="en-US"/>
         </w:rPr>
-        <w:t>density estimation</w:t>
-      </w:r>
-      <w:r>
-        <w:rPr>
-          <w:lang w:val="en-US"/>
-        </w:rPr>
-        <w:t xml:space="preserve">, and </w:t>
+        <w:t>Weaknesses:</w:t>
+      </w:r>
+      <w:r>
+        <w:rPr>
+          <w:lang w:val="en-US"/>
+        </w:rPr>
+        <w:t xml:space="preserve"> These methods can suffer from higher false positive rates, since not every statistical outlier is fraudulent. Tuning them can be difficult, and evaluating their performance is tricky </w:t>
+      </w:r>
+      <w:r>
+        <w:rPr>
+          <w:lang w:val="en-US"/>
+        </w:rPr>
+        <w:lastRenderedPageBreak/>
+        <w:t xml:space="preserve">without ground-truth labels (often requiring manual review). Indeed, surveys report that unsupervised techniques, while studied, have been used </w:t>
       </w:r>
       <w:r>
         <w:rPr>
@@ -8174,14 +8250,56 @@
           <w:bCs/>
           <w:lang w:val="en-US"/>
         </w:rPr>
-        <w:t>one-class classification</w:t>
-      </w:r>
-      <w:r>
-        <w:rPr>
-          <w:lang w:val="en-US"/>
-        </w:rPr>
-        <w:t xml:space="preserve"> methods (One-Class SVM, Isolation Forest). </w:t>
-      </w:r>
+        <w:t>less frequently than supervised ones in the literature</w:t>
+      </w:r>
+      <w:r>
+        <w:rPr>
+          <w:lang w:val="en-US"/>
+        </w:rPr>
+        <w:t xml:space="preserve"> </w:t>
+      </w:r>
+      <w:r>
+        <w:rPr>
+          <w:lang w:val="en-US"/>
+        </w:rPr>
+        <w:t xml:space="preserve">(Ngai </w:t>
+      </w:r>
+      <w:r>
+        <w:rPr>
+          <w:i/>
+          <w:iCs/>
+          <w:lang w:val="en-US"/>
+        </w:rPr>
+        <w:t>et al.</w:t>
+      </w:r>
+      <w:r>
+        <w:rPr>
+          <w:lang w:val="en-US"/>
+        </w:rPr>
+        <w:t>, 2011)</w:t>
+      </w:r>
+      <w:r>
+        <w:rPr>
+          <w:lang w:val="en-US"/>
+        </w:rPr>
+        <w:t xml:space="preserve">. </w:t>
+      </w:r>
+    </w:p>
+    <w:p>
+      <w:pPr>
+        <w:pStyle w:val="subsubheading"/>
+        <w:rPr>
+          <w:lang w:val="en-US"/>
+        </w:rPr>
+      </w:pPr>
+      <w:bookmarkStart w:id="14" w:name="_Toc221291846"/>
+      <w:r>
+        <w:rPr>
+          <w:lang w:val="en-US"/>
+        </w:rPr>
+        <w:t>2.2.3. Ensemble Methods</w:t>
+      </w:r>
+      <w:bookmarkEnd w:id="14"/>
     </w:p>
     <w:p>
       <w:pPr>
@@ -8190,19 +8308,85 @@
           <w:lang w:val="en-US"/>
         </w:rPr>
       </w:pPr>
+      <w:r>
+        <w:rPr>
+          <w:lang w:val="en-US"/>
+        </w:rPr>
+        <w:t xml:space="preserve">Ensemble learning </w:t>
+      </w:r>
+      <w:r>
+        <w:rPr>
+          <w:lang w:val="en-US"/>
+        </w:rPr>
+        <w:t xml:space="preserve">is a special sub-category of supervised learning, which </w:t>
+      </w:r>
+      <w:r>
+        <w:rPr>
+          <w:lang w:val="en-US"/>
+        </w:rPr>
+        <w:t>combines multiple models to improve predictive performance. Ensembles are widely used in fraud detection to boost accuracy and robustness. Techniques include bagging (e.g.</w:t>
+      </w:r>
+      <w:r>
+        <w:rPr>
+          <w:lang w:val="en-US"/>
+        </w:rPr>
+        <w:t>,</w:t>
+      </w:r>
+      <w:r>
+        <w:rPr>
+          <w:lang w:val="en-US"/>
+        </w:rPr>
+        <w:t xml:space="preserve"> Random Forest, which aggregates many decision trees), boosting (e.g.</w:t>
+      </w:r>
+      <w:r>
+        <w:rPr>
+          <w:lang w:val="en-US"/>
+        </w:rPr>
+        <w:t>,</w:t>
+      </w:r>
+      <w:r>
+        <w:rPr>
+          <w:lang w:val="en-US"/>
+        </w:rPr>
+        <w:t xml:space="preserve"> XGBoost, LightGBM), and stacking (blending different model types). Ensembles </w:t>
+      </w:r>
       <w:r>
         <w:rPr>
           <w:b/>
           <w:bCs/>
           <w:lang w:val="en-US"/>
         </w:rPr>
-        <w:t>Strengths:</w:t>
-      </w:r>
-      <w:r>
-        <w:rPr>
-          <w:lang w:val="en-US"/>
-        </w:rPr>
-        <w:t xml:space="preserve"> Unsupervised anomaly detection can potentially identify previously unseen fraud patterns, making it adaptive to emerging threats. It does not require annotated fraud data, which is useful when labels are expensive or delayed (a common situation in financial fraud, where only some frauds are ever confirmed). </w:t>
+        <w:t>often win data science competitions for fraud detection</w:t>
+      </w:r>
+      <w:r>
+        <w:rPr>
+          <w:lang w:val="en-US"/>
+        </w:rPr>
+        <w:t xml:space="preserve"> due to their ability to capture diverse patterns. For example, boosting algorithms have achieved top results on credit card fraud datasets by effectively handling imbalance and nonlinear interactions (Hernandez Aros et al., 2024).</w:t>
+      </w:r>
+      <w:r>
+        <w:rPr>
+          <w:lang w:val="en-US"/>
+        </w:rPr>
+        <w:t xml:space="preserve"> Also, top scores on one of the most recent fraud detection Kaggle competitions (</w:t>
+      </w:r>
+      <w:r>
+        <w:rPr>
+          <w:lang w:val="en-US"/>
+        </w:rPr>
+        <w:t>IEEE-CIS Fraud Detection</w:t>
+      </w:r>
+      <w:r>
+        <w:rPr>
+          <w:lang w:val="en-US"/>
+        </w:rPr>
+        <w:t xml:space="preserve">) have been achieved with such methods. </w:t>
+      </w:r>
+      <w:r>
+        <w:rPr>
+          <w:lang w:val="en-US"/>
+        </w:rPr>
+        <w:t xml:space="preserve">Ensembles can also incorporate different algorithms for different sub-tasks: one study used a hybrid of SVM, logistic regression, and linear regression as a composite model to classify transactions (Ali et al., 2022). </w:t>
       </w:r>
     </w:p>
     <w:p>
@@ -8218,33 +8402,155 @@
           <w:bCs/>
           <w:lang w:val="en-US"/>
         </w:rPr>
-        <w:t>Weaknesses:</w:t>
-      </w:r>
-      <w:r>
-        <w:rPr>
-          <w:lang w:val="en-US"/>
-        </w:rPr>
-        <w:t xml:space="preserve"> These methods can suffer from higher false positive rates, since not every statistical outlier is fraudulent. Tuning them can be difficult, and evaluating their performance is tricky without ground-truth labels (often requiring manual review). Indeed, surveys report that unsupervised techniques, while studied, have been used </w:t>
-      </w:r>
+        <w:t>Strengths:</w:t>
+      </w:r>
+      <w:r>
+        <w:rPr>
+          <w:lang w:val="en-US"/>
+        </w:rPr>
+        <w:t xml:space="preserve"> Ensembles usually outperform individual models by reducing variance and bias – this is valuable in fraud detection</w:t>
+      </w:r>
+      <w:r>
+        <w:rPr>
+          <w:lang w:val="en-US"/>
+        </w:rPr>
+        <w:t>,</w:t>
+      </w:r>
+      <w:r>
+        <w:rPr>
+          <w:lang w:val="en-US"/>
+        </w:rPr>
+        <w:t xml:space="preserve"> where catching as many fraud cases as possible (high recall) while keeping false alarms low (high precision) requires a delicate balance. </w:t>
+      </w:r>
+    </w:p>
+    <w:p>
+      <w:pPr>
+        <w:pStyle w:val="BodyText"/>
+        <w:rPr>
+          <w:lang w:val="en-US"/>
+        </w:rPr>
+      </w:pPr>
       <w:r>
         <w:rPr>
           <w:b/>
           <w:bCs/>
           <w:lang w:val="en-US"/>
         </w:rPr>
-        <w:t>less frequently than supervised ones in the literature</w:t>
-      </w:r>
+        <w:t>Weaknesses:</w:t>
+      </w:r>
+      <w:r>
+        <w:rPr>
+          <w:lang w:val="en-US"/>
+        </w:rPr>
+        <w:t xml:space="preserve"> The main downsides are increased complexity and reduced interpretability. A large ensemble (hundreds of trees or mixed models) can be a </w:t>
+      </w:r>
+      <w:r>
+        <w:rPr>
+          <w:b/>
+          <w:bCs/>
+          <w:lang w:val="en-US"/>
+        </w:rPr>
+        <w:t>“black box”</w:t>
+      </w:r>
+      <w:r>
+        <w:rPr>
+          <w:lang w:val="en-US"/>
+        </w:rPr>
+        <w:t xml:space="preserve"> that is hard to interpret, which </w:t>
+      </w:r>
+      <w:r>
+        <w:rPr>
+          <w:lang w:val="en-US"/>
+        </w:rPr>
+        <w:t xml:space="preserve">may be </w:t>
+      </w:r>
+      <w:r>
+        <w:rPr>
+          <w:lang w:val="en-US"/>
+        </w:rPr>
+        <w:t>problematic in regulated financial environments</w:t>
+      </w:r>
+      <w:r>
+        <w:rPr>
+          <w:lang w:val="en-US"/>
+        </w:rPr>
+        <w:t>.</w:t>
+      </w:r>
+    </w:p>
+    <w:p>
+      <w:pPr>
+        <w:pStyle w:val="subsubheading"/>
+        <w:rPr>
+          <w:lang w:val="en-US"/>
+        </w:rPr>
+      </w:pPr>
+      <w:bookmarkStart w:id="15" w:name="_Toc221291847"/>
+      <w:r>
+        <w:rPr>
+          <w:lang w:val="en-US"/>
+        </w:rPr>
+        <w:t>2.2.4. Deep Learning</w:t>
+      </w:r>
+      <w:bookmarkEnd w:id="15"/>
+    </w:p>
+    <w:p>
+      <w:pPr>
+        <w:pStyle w:val="BodyText"/>
+        <w:rPr>
+          <w:lang w:val="en-US"/>
+        </w:rPr>
+      </w:pPr>
+      <w:r>
+        <w:rPr>
+          <w:lang w:val="en-US"/>
+        </w:rPr>
+        <w:t>Deep</w:t>
+      </w:r>
+      <w:r>
+        <w:rPr>
+          <w:lang w:val="en-US"/>
+        </w:rPr>
+        <w:t xml:space="preserve"> learning techniques have been increasingly applied to fraud detection, thanks to their ability to model complex data patterns. Artificial Neural Networks (ANNs) in various forms (</w:t>
+      </w:r>
+      <w:r>
+        <w:rPr>
+          <w:b/>
+          <w:bCs/>
+          <w:lang w:val="en-US"/>
+        </w:rPr>
+        <w:t>multilayer perceptrons, convolutional networks, recurrent networks, graph neural networks</w:t>
+      </w:r>
+      <w:r>
+        <w:rPr>
+          <w:lang w:val="en-US"/>
+        </w:rPr>
+        <w:t>) have been explored. Early works used basic ANNs to classify fraudulent transactions (</w:t>
+      </w:r>
+      <w:r>
+        <w:rPr>
+          <w:lang w:val="en-US"/>
+        </w:rPr>
+        <w:t>Sahin and Duman, 2011</w:t>
+      </w:r>
+      <w:r>
+        <w:rPr>
+          <w:lang w:val="en-US"/>
+        </w:rPr>
+        <w:t xml:space="preserve">; </w:t>
+      </w:r>
+      <w:proofErr w:type="spellStart"/>
+      <w:r>
+        <w:rPr>
+          <w:lang w:val="en-US"/>
+        </w:rPr>
+        <w:t>Bouchti</w:t>
+      </w:r>
+      <w:proofErr w:type="spellEnd"/>
       <w:r>
         <w:rPr>
           <w:lang w:val="en-US"/>
         </w:rPr>
         <w:t xml:space="preserve"> </w:t>
-      </w:r>
-      <w:r>
-        <w:rPr>
-          <w:lang w:val="en-US"/>
-        </w:rPr>
-        <w:t xml:space="preserve">(Ngai </w:t>
       </w:r>
       <w:r>
         <w:rPr>
@@ -8258,31 +8564,85 @@
         <w:rPr>
           <w:lang w:val="en-US"/>
         </w:rPr>
-        <w:t>, 2011)</w:t>
-      </w:r>
-      <w:r>
-        <w:rPr>
-          <w:lang w:val="en-US"/>
-        </w:rPr>
-        <w:t xml:space="preserve">. </w:t>
-      </w:r>
-    </w:p>
-    <w:p>
-      <w:pPr>
-        <w:pStyle w:val="subsubheading"/>
-        <w:rPr>
-          <w:lang w:val="en-US"/>
-        </w:rPr>
-      </w:pPr>
-      <w:bookmarkStart w:id="14" w:name="_Toc221291846"/>
+        <w:t>, 2017</w:t>
+      </w:r>
+      <w:r>
+        <w:rPr>
+          <w:lang w:val="en-US"/>
+        </w:rPr>
+        <w:t xml:space="preserve">; </w:t>
+      </w:r>
+      <w:r>
+        <w:rPr>
+          <w:lang w:val="en-US"/>
+        </w:rPr>
+        <w:t xml:space="preserve">Dang </w:t>
+      </w:r>
+      <w:r>
+        <w:rPr>
+          <w:i/>
+          <w:iCs/>
+          <w:lang w:val="en-US"/>
+        </w:rPr>
+        <w:t>et al.</w:t>
+      </w:r>
+      <w:r>
+        <w:rPr>
+          <w:lang w:val="en-US"/>
+        </w:rPr>
+        <w:t>, 2021</w:t>
+      </w:r>
+      <w:r>
+        <w:rPr>
+          <w:lang w:val="en-US"/>
+        </w:rPr>
+        <w:t>), while newer studies leverage specialized architectures. For example, recurrent neural networks (RNNs) and long short-term memory (LSTM) networks can capture sequential patterns in transaction streams (useful for detecting sequential fraud behavior or repeated offenses). Graph Neural Networks (GNNs) have emerged to detect fraud by modeling transactions as graphs (e.g.</w:t>
+      </w:r>
+      <w:r>
+        <w:rPr>
+          <w:lang w:val="en-US"/>
+        </w:rPr>
+        <w:t>,</w:t>
+      </w:r>
+      <w:r>
+        <w:rPr>
+          <w:lang w:val="en-US"/>
+        </w:rPr>
+        <w:t xml:space="preserve"> linking customers, merchants, IP </w:t>
+      </w:r>
       <w:r>
         <w:rPr>
           <w:lang w:val="en-US"/>
         </w:rPr>
         <w:lastRenderedPageBreak/>
-        <w:t>2.2.3. Ensemble Methods</w:t>
-      </w:r>
-      <w:bookmarkEnd w:id="14"/>
+        <w:t>addresses)</w:t>
+      </w:r>
+      <w:r>
+        <w:rPr>
+          <w:lang w:val="en-US"/>
+        </w:rPr>
+        <w:t>,</w:t>
+      </w:r>
+      <w:r>
+        <w:rPr>
+          <w:lang w:val="en-US"/>
+        </w:rPr>
+        <w:t xml:space="preserve"> graph-based approaches can uncover organized fraud rings or money laundering patterns by relational analysis (Nicholls et al., 2021). Deep learning has also been combined with other methods: autoencoder networks for anomaly detection (unsupervised) or hybrid deep models with feature extraction followed by classification (</w:t>
+      </w:r>
+      <w:proofErr w:type="spellStart"/>
+      <w:r>
+        <w:rPr>
+          <w:lang w:val="en-US"/>
+        </w:rPr>
+        <w:t>Jurgovsky</w:t>
+      </w:r>
+      <w:proofErr w:type="spellEnd"/>
+      <w:r>
+        <w:rPr>
+          <w:lang w:val="en-US"/>
+        </w:rPr>
+        <w:t xml:space="preserve"> et al., 2018). </w:t>
+      </w:r>
     </w:p>
     <w:p>
       <w:pPr>
@@ -8291,99 +8651,31 @@
           <w:lang w:val="en-US"/>
         </w:rPr>
       </w:pPr>
-      <w:r>
-        <w:rPr>
-          <w:lang w:val="en-US"/>
-        </w:rPr>
-        <w:t xml:space="preserve">Ensemble learning </w:t>
-      </w:r>
-      <w:r>
-        <w:rPr>
-          <w:lang w:val="en-US"/>
-        </w:rPr>
-        <w:t xml:space="preserve">is a special sub-category of supervised learning, which </w:t>
-      </w:r>
-      <w:r>
-        <w:rPr>
-          <w:lang w:val="en-US"/>
-        </w:rPr>
-        <w:t>combines multiple models to improve predictive performance. Ensembles are widely used in fraud detection to boost accuracy and robustness. Techniques include bagging (e.g.</w:t>
-      </w:r>
-      <w:r>
-        <w:rPr>
-          <w:lang w:val="en-US"/>
-        </w:rPr>
-        <w:t>,</w:t>
-      </w:r>
-      <w:r>
-        <w:rPr>
-          <w:lang w:val="en-US"/>
-        </w:rPr>
-        <w:t xml:space="preserve"> Random Forest, which aggregates many decision trees), boosting (e.g.</w:t>
-      </w:r>
-      <w:r>
-        <w:rPr>
-          <w:lang w:val="en-US"/>
-        </w:rPr>
-        <w:t>,</w:t>
-      </w:r>
-      <w:r>
-        <w:rPr>
-          <w:lang w:val="en-US"/>
-        </w:rPr>
-        <w:t xml:space="preserve"> XGBoost, LightGBM), and stacking (blending different model types). Ensembles </w:t>
-      </w:r>
       <w:r>
         <w:rPr>
           <w:b/>
           <w:bCs/>
           <w:lang w:val="en-US"/>
         </w:rPr>
-        <w:t>often win data science competitions for fraud detection</w:t>
-      </w:r>
-      <w:r>
-        <w:rPr>
-          <w:lang w:val="en-US"/>
-        </w:rPr>
-        <w:t xml:space="preserve"> due to their ability to capture diverse patterns. For example, boosting algorithms have achieved top results on credit card fraud datasets by effectively handling imbalance and nonlinear interactions (Hernandez Aros et al., 2024).</w:t>
-      </w:r>
-      <w:r>
-        <w:rPr>
-          <w:lang w:val="en-US"/>
-        </w:rPr>
-        <w:t xml:space="preserve"> Also, top scores on one of the most recent fraud </w:t>
-      </w:r>
-      <w:proofErr w:type="gramStart"/>
-      <w:r>
-        <w:rPr>
-          <w:lang w:val="en-US"/>
-        </w:rPr>
-        <w:t>detection</w:t>
-      </w:r>
-      <w:proofErr w:type="gramEnd"/>
-      <w:r>
-        <w:rPr>
-          <w:lang w:val="en-US"/>
-        </w:rPr>
-        <w:t xml:space="preserve"> Kaggle competitions (</w:t>
-      </w:r>
-      <w:r>
-        <w:rPr>
-          <w:lang w:val="en-US"/>
-        </w:rPr>
-        <w:t>IEEE-CIS Fraud Detection</w:t>
-      </w:r>
-      <w:r>
-        <w:rPr>
-          <w:lang w:val="en-US"/>
-        </w:rPr>
-        <w:t xml:space="preserve">) have been achieved with such methods. </w:t>
-      </w:r>
-      <w:r>
-        <w:rPr>
-          <w:lang w:val="en-US"/>
-        </w:rPr>
-        <w:t xml:space="preserve">Ensembles can also incorporate different algorithms for different sub-tasks: one study used a hybrid of SVM, logistic regression, and linear regression as a composite model to classify transactions (Ali et al., 2022). </w:t>
+        <w:t>Strengths:</w:t>
+      </w:r>
+      <w:r>
+        <w:rPr>
+          <w:lang w:val="en-US"/>
+        </w:rPr>
+        <w:t xml:space="preserve"> Deep learning models can capture highly nonlinear and intricate patterns that shallow models might miss. They are adept at processing large-scale data and can learn feature representations automatically (reducing the need for manual feature engineering). Some deep models (like GNNs) naturally incorporate network information that is crucial for certain fraud types (e.g.</w:t>
+      </w:r>
+      <w:r>
+        <w:rPr>
+          <w:lang w:val="en-US"/>
+        </w:rPr>
+        <w:t>,</w:t>
+      </w:r>
+      <w:r>
+        <w:rPr>
+          <w:lang w:val="en-US"/>
+        </w:rPr>
+        <w:t xml:space="preserve"> collusive networks). </w:t>
       </w:r>
     </w:p>
     <w:p>
@@ -8399,370 +8691,63 @@
           <w:bCs/>
           <w:lang w:val="en-US"/>
         </w:rPr>
-        <w:t>Strengths:</w:t>
-      </w:r>
-      <w:r>
-        <w:rPr>
-          <w:lang w:val="en-US"/>
-        </w:rPr>
-        <w:t xml:space="preserve"> Ensembles usually outperform individual models by reducing variance and bias – this is valuable in fraud detection</w:t>
-      </w:r>
-      <w:r>
-        <w:rPr>
-          <w:lang w:val="en-US"/>
-        </w:rPr>
-        <w:t>,</w:t>
-      </w:r>
-      <w:r>
-        <w:rPr>
-          <w:lang w:val="en-US"/>
-        </w:rPr>
-        <w:t xml:space="preserve"> where catching as many fraud cases as possible (high recall) while keeping false alarms low (high precision) requires a delicate balance. </w:t>
-      </w:r>
-    </w:p>
-    <w:p>
-      <w:pPr>
-        <w:pStyle w:val="BodyText"/>
-        <w:rPr>
-          <w:lang w:val="en-US"/>
-        </w:rPr>
-      </w:pPr>
+        <w:t>Weaknesses:</w:t>
+      </w:r>
+      <w:r>
+        <w:rPr>
+          <w:lang w:val="en-US"/>
+        </w:rPr>
+        <w:t xml:space="preserve"> Deep models typically require even larger training datasets and computational resources</w:t>
+      </w:r>
+      <w:r>
+        <w:rPr>
+          <w:lang w:val="en-US"/>
+        </w:rPr>
+        <w:t xml:space="preserve">, </w:t>
+      </w:r>
+      <w:r>
+        <w:rPr>
+          <w:lang w:val="en-US"/>
+        </w:rPr>
+        <w:t>while, in</w:t>
+      </w:r>
+      <w:r>
+        <w:rPr>
+          <w:lang w:val="en-US"/>
+        </w:rPr>
+        <w:t xml:space="preserve"> the same time, </w:t>
+      </w:r>
+      <w:r>
+        <w:rPr>
+          <w:lang w:val="en-US"/>
+        </w:rPr>
+        <w:t>performance gains depend on feature availability, scale, and constraints.</w:t>
+      </w:r>
+      <w:r>
+        <w:rPr>
+          <w:lang w:val="en-US"/>
+        </w:rPr>
+        <w:t xml:space="preserve"> They also tend to be </w:t>
+      </w:r>
       <w:r>
         <w:rPr>
           <w:b/>
           <w:bCs/>
           <w:lang w:val="en-US"/>
         </w:rPr>
-        <w:t>Weaknesses:</w:t>
-      </w:r>
-      <w:r>
-        <w:rPr>
-          <w:lang w:val="en-US"/>
-        </w:rPr>
-        <w:t xml:space="preserve"> The main downsides are increased complexity and reduced interpretability. A large ensemble (hundreds of trees or mixed models) can be a </w:t>
-      </w:r>
-      <w:r>
-        <w:rPr>
-          <w:b/>
-          <w:bCs/>
-          <w:lang w:val="en-US"/>
-        </w:rPr>
-        <w:t>“black box”</w:t>
-      </w:r>
-      <w:r>
-        <w:rPr>
-          <w:lang w:val="en-US"/>
-        </w:rPr>
-        <w:t xml:space="preserve"> that is hard to interpret, which </w:t>
-      </w:r>
-      <w:r>
-        <w:rPr>
-          <w:lang w:val="en-US"/>
-        </w:rPr>
-        <w:t xml:space="preserve">may be </w:t>
-      </w:r>
-      <w:r>
-        <w:rPr>
-          <w:lang w:val="en-US"/>
-        </w:rPr>
-        <w:t>problematic in regulated financial environments</w:t>
-      </w:r>
-      <w:r>
-        <w:rPr>
-          <w:lang w:val="en-US"/>
-        </w:rPr>
-        <w:t>.</w:t>
-      </w:r>
-    </w:p>
-    <w:p>
-      <w:pPr>
-        <w:pStyle w:val="subsubheading"/>
-        <w:rPr>
-          <w:lang w:val="en-US"/>
-        </w:rPr>
-      </w:pPr>
-      <w:bookmarkStart w:id="15" w:name="_Toc221291847"/>
-      <w:r>
-        <w:rPr>
-          <w:lang w:val="en-US"/>
-        </w:rPr>
-        <w:t>2.2.4. Deep Learning</w:t>
-      </w:r>
-      <w:bookmarkEnd w:id="15"/>
-    </w:p>
-    <w:p>
-      <w:pPr>
-        <w:pStyle w:val="BodyText"/>
-        <w:rPr>
-          <w:lang w:val="en-US"/>
-        </w:rPr>
-      </w:pPr>
-      <w:r>
-        <w:rPr>
-          <w:lang w:val="en-US"/>
-        </w:rPr>
-        <w:t>Deep</w:t>
-      </w:r>
-      <w:r>
-        <w:rPr>
-          <w:lang w:val="en-US"/>
-        </w:rPr>
-        <w:t xml:space="preserve"> learning techniques have been increasingly applied to fraud detection, thanks to their ability to model complex data patterns. Artificial Neural Networks (ANNs) in various forms (</w:t>
-      </w:r>
-      <w:r>
-        <w:rPr>
-          <w:b/>
-          <w:bCs/>
-          <w:lang w:val="en-US"/>
-        </w:rPr>
-        <w:t>multilayer perceptrons, convolutional networks, recurrent networks, graph neural networks</w:t>
-      </w:r>
-      <w:r>
-        <w:rPr>
-          <w:lang w:val="en-US"/>
-        </w:rPr>
-        <w:t>) have been explored. Early works used basic ANNs to classify fraudulent transactions (</w:t>
-      </w:r>
-      <w:r>
-        <w:rPr>
-          <w:lang w:val="en-US"/>
-        </w:rPr>
-        <w:t>Sahin and Duman, 2011</w:t>
-      </w:r>
-      <w:r>
-        <w:rPr>
-          <w:lang w:val="en-US"/>
-        </w:rPr>
-        <w:t xml:space="preserve">; </w:t>
-      </w:r>
-      <w:proofErr w:type="spellStart"/>
-      <w:r>
-        <w:rPr>
-          <w:lang w:val="en-US"/>
-        </w:rPr>
-        <w:t>Bouchti</w:t>
-      </w:r>
-      <w:proofErr w:type="spellEnd"/>
-      <w:r>
-        <w:rPr>
-          <w:lang w:val="en-US"/>
-        </w:rPr>
-        <w:t xml:space="preserve"> </w:t>
-      </w:r>
-      <w:r>
-        <w:rPr>
-          <w:i/>
-          <w:iCs/>
-          <w:lang w:val="en-US"/>
-        </w:rPr>
-        <w:t>et al.</w:t>
-      </w:r>
-      <w:r>
-        <w:rPr>
-          <w:lang w:val="en-US"/>
-        </w:rPr>
-        <w:t>, 2017</w:t>
-      </w:r>
-      <w:r>
-        <w:rPr>
-          <w:lang w:val="en-US"/>
-        </w:rPr>
-        <w:t xml:space="preserve">; </w:t>
-      </w:r>
-      <w:r>
-        <w:rPr>
-          <w:lang w:val="en-US"/>
-        </w:rPr>
-        <w:t xml:space="preserve">Dang </w:t>
-      </w:r>
-      <w:r>
-        <w:rPr>
-          <w:i/>
-          <w:iCs/>
-          <w:lang w:val="en-US"/>
-        </w:rPr>
-        <w:t>et al.</w:t>
-      </w:r>
-      <w:r>
-        <w:rPr>
-          <w:lang w:val="en-US"/>
-        </w:rPr>
-        <w:t>, 2021</w:t>
-      </w:r>
-      <w:r>
-        <w:rPr>
-          <w:lang w:val="en-US"/>
-        </w:rPr>
-        <w:t>), while newer studies leverage specialized architectures. For example, recurrent neural networks (RNNs) and long short-term memory (LSTM) networks can capture sequential patterns in transaction streams (useful for detecting sequential fraud behavior or repeated offenses). Graph Neural Networks (GNNs) have emerged to detect fraud by modeling transactions as graphs (e.g.</w:t>
-      </w:r>
-      <w:r>
-        <w:rPr>
-          <w:lang w:val="en-US"/>
-        </w:rPr>
-        <w:t>,</w:t>
-      </w:r>
-      <w:r>
-        <w:rPr>
-          <w:lang w:val="en-US"/>
-        </w:rPr>
-        <w:t xml:space="preserve"> linking customers, merchants, IP addresses)</w:t>
-      </w:r>
-      <w:r>
-        <w:rPr>
-          <w:lang w:val="en-US"/>
-        </w:rPr>
-        <w:t>,</w:t>
-      </w:r>
-      <w:r>
-        <w:rPr>
-          <w:lang w:val="en-US"/>
-        </w:rPr>
-        <w:t xml:space="preserve"> graph-based approaches can uncover organized fraud rings or money laundering patterns by relational analysis (Nicholls et al., 2021). Deep learning has also been combined with </w:t>
-      </w:r>
-      <w:r>
-        <w:rPr>
-          <w:lang w:val="en-US"/>
-        </w:rPr>
-        <w:lastRenderedPageBreak/>
-        <w:t>other methods: autoencoder networks for anomaly detection (unsupervised) or hybrid deep models with feature extraction followed by classification (</w:t>
-      </w:r>
-      <w:proofErr w:type="spellStart"/>
-      <w:r>
-        <w:rPr>
-          <w:lang w:val="en-US"/>
-        </w:rPr>
-        <w:t>Jurgovsky</w:t>
-      </w:r>
-      <w:proofErr w:type="spellEnd"/>
-      <w:r>
-        <w:rPr>
-          <w:lang w:val="en-US"/>
-        </w:rPr>
-        <w:t xml:space="preserve"> et al., 2018). </w:t>
-      </w:r>
-    </w:p>
-    <w:p>
-      <w:pPr>
-        <w:pStyle w:val="BodyText"/>
-        <w:rPr>
-          <w:lang w:val="en-US"/>
-        </w:rPr>
-      </w:pPr>
-      <w:r>
-        <w:rPr>
-          <w:b/>
-          <w:bCs/>
-          <w:lang w:val="en-US"/>
-        </w:rPr>
-        <w:t>Strengths:</w:t>
-      </w:r>
-      <w:r>
-        <w:rPr>
-          <w:lang w:val="en-US"/>
-        </w:rPr>
-        <w:t xml:space="preserve"> Deep learning models can capture highly nonlinear and intricate patterns that shallow models might miss. They are adept at processing large-scale data and can learn feature representations automatically (reducing the need for manual feature engineering). Some deep models (like GNNs) naturally incorporate network information that is crucial for certain fraud types (e.g.</w:t>
-      </w:r>
-      <w:r>
-        <w:rPr>
-          <w:lang w:val="en-US"/>
-        </w:rPr>
-        <w:t>,</w:t>
-      </w:r>
-      <w:r>
-        <w:rPr>
-          <w:lang w:val="en-US"/>
-        </w:rPr>
-        <w:t xml:space="preserve"> collusive networks). </w:t>
-      </w:r>
-    </w:p>
-    <w:p>
-      <w:pPr>
-        <w:pStyle w:val="BodyText"/>
-        <w:rPr>
-          <w:lang w:val="en-US"/>
-        </w:rPr>
-      </w:pPr>
-      <w:r>
-        <w:rPr>
-          <w:b/>
-          <w:bCs/>
-          <w:lang w:val="en-US"/>
-        </w:rPr>
-        <w:t>Weaknesses:</w:t>
-      </w:r>
-      <w:r>
-        <w:rPr>
-          <w:lang w:val="en-US"/>
-        </w:rPr>
-        <w:t xml:space="preserve"> Deep models typically require even larger training datasets and computational resources</w:t>
-      </w:r>
-      <w:r>
-        <w:rPr>
-          <w:lang w:val="en-US"/>
-        </w:rPr>
-        <w:t xml:space="preserve">, </w:t>
-      </w:r>
-      <w:r>
-        <w:rPr>
-          <w:lang w:val="en-US"/>
-        </w:rPr>
-        <w:t xml:space="preserve">while, </w:t>
-      </w:r>
-      <w:proofErr w:type="gramStart"/>
-      <w:r>
-        <w:rPr>
-          <w:lang w:val="en-US"/>
-        </w:rPr>
-        <w:t>in</w:t>
-      </w:r>
-      <w:proofErr w:type="gramEnd"/>
-      <w:r>
-        <w:rPr>
-          <w:lang w:val="en-US"/>
-        </w:rPr>
-        <w:t xml:space="preserve"> the same time, </w:t>
-      </w:r>
-      <w:r>
-        <w:rPr>
-          <w:lang w:val="en-US"/>
-        </w:rPr>
-        <w:t>performance gains depend on feature availability, scale, and constraints.</w:t>
-      </w:r>
-      <w:r>
-        <w:rPr>
-          <w:lang w:val="en-US"/>
-        </w:rPr>
-        <w:t xml:space="preserve"> They also tend to be </w:t>
-      </w:r>
-      <w:proofErr w:type="gramStart"/>
-      <w:r>
-        <w:rPr>
-          <w:b/>
-          <w:bCs/>
-          <w:lang w:val="en-US"/>
-        </w:rPr>
         <w:t>black-box</w:t>
       </w:r>
-      <w:proofErr w:type="gramEnd"/>
       <w:r>
         <w:rPr>
           <w:lang w:val="en-US"/>
         </w:rPr>
         <w:t xml:space="preserve"> in nature, raising explainability concerns.  </w:t>
       </w:r>
-      <w:proofErr w:type="gramStart"/>
-      <w:r>
-        <w:rPr>
-          <w:lang w:val="en-US"/>
-        </w:rPr>
-        <w:t>Also</w:t>
-      </w:r>
-      <w:proofErr w:type="gramEnd"/>
-      <w:r>
-        <w:rPr>
-          <w:lang w:val="en-US"/>
-        </w:rPr>
-        <w:t xml:space="preserve"> deep learning algorithms have very high capacity and are more likely to overfit, if not treated with caution. </w:t>
+      <w:r>
+        <w:rPr>
+          <w:lang w:val="en-US"/>
+        </w:rPr>
+        <w:t xml:space="preserve">Also deep learning algorithms have very high capacity and are more likely to overfit, if not treated with caution. </w:t>
       </w:r>
     </w:p>
     <w:p>
@@ -8957,21 +8942,7 @@
         <w:rPr>
           <w:lang w:val="en-US"/>
         </w:rPr>
-        <w:t xml:space="preserve"> </w:t>
-      </w:r>
-      <w:proofErr w:type="gramStart"/>
-      <w:r>
-        <w:rPr>
-          <w:lang w:val="en-US"/>
-        </w:rPr>
-        <w:t>datasets</w:t>
-      </w:r>
-      <w:proofErr w:type="gramEnd"/>
-      <w:r>
-        <w:rPr>
-          <w:lang w:val="en-US"/>
-        </w:rPr>
-        <w:t xml:space="preserve"> and benchmarks in the field:</w:t>
+        <w:t xml:space="preserve"> datasets and benchmarks in the field:</w:t>
       </w:r>
     </w:p>
     <w:p>
@@ -9213,21 +9184,7 @@
         <w:rPr>
           <w:lang w:val="en-US"/>
         </w:rPr>
-        <w:t xml:space="preserve"> is valuable for research because it provides large-scale data with realistic behavior for fraud (though </w:t>
-      </w:r>
-      <w:proofErr w:type="gramStart"/>
-      <w:r>
-        <w:rPr>
-          <w:lang w:val="en-US"/>
-        </w:rPr>
-        <w:t>the fraud</w:t>
-      </w:r>
-      <w:proofErr w:type="gramEnd"/>
-      <w:r>
-        <w:rPr>
-          <w:lang w:val="en-US"/>
-        </w:rPr>
-        <w:t xml:space="preserve"> instances are simulated). Several studies have used </w:t>
+        <w:t xml:space="preserve"> is valuable for research because it provides large-scale data with realistic behavior for fraud (though the fraud instances are simulated). Several studies have used </w:t>
       </w:r>
       <w:proofErr w:type="spellStart"/>
       <w:r>
@@ -9324,21 +9281,7 @@
         <w:rPr>
           <w:lang w:val="en-US"/>
         </w:rPr>
-        <w:t xml:space="preserve"> is another simulator-based dataset (simulated from a Spanish bank’s data sample) that provides transactions with attributes like customer ID, merchant, location, etc., along with fraud labels (Lopez-Rojas et al., 2014). It has been used in studies focusing on fraud detection in banking transactions and often for testing pattern recognition algorithms in a controlled environment (Hernandez Aros et al., 2024). </w:t>
-      </w:r>
-      <w:proofErr w:type="gramStart"/>
-      <w:r>
-        <w:rPr>
-          <w:lang w:val="en-US"/>
-        </w:rPr>
-        <w:t>Similar to</w:t>
-      </w:r>
-      <w:proofErr w:type="gramEnd"/>
-      <w:r>
-        <w:rPr>
-          <w:lang w:val="en-US"/>
-        </w:rPr>
-        <w:t xml:space="preserve"> </w:t>
+        <w:t xml:space="preserve"> is another simulator-based dataset (simulated from a Spanish bank’s data sample) that provides transactions with attributes like customer ID, merchant, location, etc., along with fraud labels (Lopez-Rojas et al., 2014). It has been used in studies focusing on fraud detection in banking transactions and often for testing pattern recognition algorithms in a controlled environment (Hernandez Aros et al., 2024). Similar to </w:t>
       </w:r>
       <w:proofErr w:type="spellStart"/>
       <w:r>
@@ -9412,21 +9355,7 @@
         <w:rPr>
           <w:lang w:val="en-US"/>
         </w:rPr>
-        <w:t xml:space="preserve"> literature reviews have found that </w:t>
-      </w:r>
-      <w:proofErr w:type="gramStart"/>
-      <w:r>
-        <w:rPr>
-          <w:lang w:val="en-US"/>
-        </w:rPr>
-        <w:t>a majority of</w:t>
-      </w:r>
-      <w:proofErr w:type="gramEnd"/>
-      <w:r>
-        <w:rPr>
-          <w:lang w:val="en-US"/>
-        </w:rPr>
-        <w:t xml:space="preserve"> studies now use real datasets in experiments, with relatively few relying solely on synthetic data (Hernandez Aros et al., 2024). This suggests a push towards evaluating models on realistic data distributions. The availability of open datasets like the ULB credit card data and various Kaggle datasets has facilitated this. However, obtaining real fraud data beyond these public sets remains a challenge – many researchers collaborate with financial institutions to test their models on private datasets (e.g., a bank’s internal transaction logs), but such results may not be fully public. Synthetic datasets (like </w:t>
+        <w:t xml:space="preserve"> literature reviews have found that a majority of studies now use real datasets in experiments, with relatively few relying solely on synthetic data (Hernandez Aros et al., 2024). This suggests a push towards evaluating models on realistic data distributions. The availability of open datasets like the ULB credit card data and various Kaggle datasets has facilitated this. However, obtaining real fraud data beyond these public sets remains a challenge – many researchers collaborate with financial institutions to test their models on private datasets (e.g., a bank’s internal transaction logs), but such results may not be fully public. Synthetic datasets (like </w:t>
       </w:r>
       <w:proofErr w:type="spellStart"/>
       <w:r>
@@ -9524,21 +9453,7 @@
         <w:rPr>
           <w:lang w:val="en-US"/>
         </w:rPr>
-        <w:t xml:space="preserve">. Prior studies often derive features based on how </w:t>
-      </w:r>
-      <w:proofErr w:type="gramStart"/>
-      <w:r>
-        <w:rPr>
-          <w:lang w:val="en-US"/>
-        </w:rPr>
-        <w:t>recently</w:t>
-      </w:r>
-      <w:proofErr w:type="gramEnd"/>
-      <w:r>
-        <w:rPr>
-          <w:lang w:val="en-US"/>
-        </w:rPr>
-        <w:t xml:space="preserve"> transactions have occurred, how frequently they </w:t>
+        <w:t xml:space="preserve">. Prior studies often derive features based on how recently transactions have occurred, how frequently they </w:t>
       </w:r>
       <w:r>
         <w:rPr>
@@ -9550,21 +9465,7 @@
         <w:rPr>
           <w:lang w:val="en-US"/>
         </w:rPr>
-        <w:t xml:space="preserve"> </w:t>
-      </w:r>
-      <w:proofErr w:type="gramStart"/>
-      <w:r>
-        <w:rPr>
-          <w:lang w:val="en-US"/>
-        </w:rPr>
-        <w:t>in a given</w:t>
-      </w:r>
-      <w:proofErr w:type="gramEnd"/>
-      <w:r>
-        <w:rPr>
-          <w:lang w:val="en-US"/>
-        </w:rPr>
-        <w:t xml:space="preserve"> period, and the monetary values involved (Ti et al., 2022). For example, features can include the time since last transaction, number of transactions in the past 24 hours (or past week, month, etc.), average transaction amount, and maximum transaction amount. These RFM features help characterize if an account’s recent behavior deviates from its usual pattern. </w:t>
+        <w:t xml:space="preserve"> in a given period, and the monetary values involved (Ti et al., 2022). For example, features can include the time since last transaction, number of transactions in the past 24 hours (or past week, month, etc.), average transaction amount, and maximum transaction amount. These RFM features help characterize if an account’s recent behavior deviates from its usual pattern. </w:t>
       </w:r>
     </w:p>
     <w:p>
@@ -9632,21 +9533,7 @@
         <w:rPr>
           <w:lang w:val="en-US"/>
         </w:rPr>
-        <w:t xml:space="preserve"> Timing is critical in fraud. Features capturing temporal patterns include time-of-day or day-of-</w:t>
-      </w:r>
-      <w:proofErr w:type="gramStart"/>
-      <w:r>
-        <w:rPr>
-          <w:lang w:val="en-US"/>
-        </w:rPr>
-        <w:t>week of</w:t>
-      </w:r>
-      <w:proofErr w:type="gramEnd"/>
-      <w:r>
-        <w:rPr>
-          <w:lang w:val="en-US"/>
-        </w:rPr>
-        <w:t xml:space="preserve"> transactions (fraud might happen at unusual times for a given user), velocity features (e.g., number of transactions in the last hour), and sequence patterns (like rapid successive transactions at different merchants). ML models can learn such thresholds if provided </w:t>
+        <w:t xml:space="preserve"> Timing is critical in fraud. Features capturing temporal patterns include time-of-day or day-of-week of transactions (fraud might happen at unusual times for a given user), velocity features (e.g., number of transactions in the last hour), and sequence patterns (like rapid successive transactions at different merchants). ML models can learn such thresholds if provided </w:t>
       </w:r>
       <w:r>
         <w:rPr>
@@ -9968,21 +9855,7 @@
         <w:rPr>
           <w:lang w:val="en-US"/>
         </w:rPr>
-        <w:t xml:space="preserve">Despite substantial progress, deploying machine learning for fraud detection in online financial systems faces numerous challenges and limitations. These arise from the inherent nature of fraud (adaptive adversaries, rarity of events) and practical constraints (data privacy, system scalability, etc.). We outline the key challenges identified in </w:t>
-      </w:r>
-      <w:proofErr w:type="gramStart"/>
-      <w:r>
-        <w:rPr>
-          <w:lang w:val="en-US"/>
-        </w:rPr>
-        <w:t>the literature</w:t>
-      </w:r>
-      <w:proofErr w:type="gramEnd"/>
-      <w:r>
-        <w:rPr>
-          <w:lang w:val="en-US"/>
-        </w:rPr>
-        <w:t xml:space="preserve"> and their implications:</w:t>
+        <w:t>Despite substantial progress, deploying machine learning for fraud detection in online financial systems faces numerous challenges and limitations. These arise from the inherent nature of fraud (adaptive adversaries, rarity of events) and practical constraints (data privacy, system scalability, etc.). We outline the key challenges identified in the literature and their implications:</w:t>
       </w:r>
     </w:p>
     <w:p>
@@ -10004,36 +9877,14 @@
         <w:rPr>
           <w:lang w:val="en-US"/>
         </w:rPr>
-        <w:t xml:space="preserve"> As </w:t>
-      </w:r>
-      <w:proofErr w:type="gramStart"/>
-      <w:r>
-        <w:rPr>
-          <w:lang w:val="en-US"/>
-        </w:rPr>
-        <w:t>noted</w:t>
-      </w:r>
-      <w:proofErr w:type="gramEnd"/>
-      <w:r>
-        <w:rPr>
-          <w:lang w:val="en-US"/>
-        </w:rPr>
-        <w:t xml:space="preserve"> multiple times, fraud datasets are extremely imbalanced – genuine transactions vastly outnumber fraudulent ones (Hernandez Aros et al., 2024). ML models tend to be biased towards predicting the majority class (“not fraud”), potentially missing many frauds unless carefully trained</w:t>
-      </w:r>
-      <w:r>
-        <w:rPr>
-          <w:lang w:val="en-US"/>
-        </w:rPr>
-        <w:t xml:space="preserve">. </w:t>
-      </w:r>
-      <w:proofErr w:type="gramStart"/>
-      <w:r>
-        <w:rPr>
-          <w:lang w:val="en-US"/>
-        </w:rPr>
-        <w:t>Also</w:t>
-      </w:r>
-      <w:proofErr w:type="gramEnd"/>
+        <w:t xml:space="preserve"> As noted multiple times, fraud datasets are extremely imbalanced – genuine transactions vastly outnumber fraudulent ones (Hernandez Aros et al., 2024). ML models tend to be biased towards predicting the majority class (“not fraud”), potentially missing many frauds unless carefully trained</w:t>
+      </w:r>
+      <w:r>
+        <w:rPr>
+          <w:lang w:val="en-US"/>
+        </w:rPr>
+        <w:t>. Also</w:t>
+      </w:r>
       <w:r>
         <w:rPr>
           <w:lang w:val="en-US"/>
@@ -10062,21 +9913,7 @@
         <w:rPr>
           <w:lang w:val="en-US"/>
         </w:rPr>
-        <w:t xml:space="preserve">igh overall accuracy is easy to achieve while missing all fraud. Techniques like resampling (oversampling frauds or </w:t>
-      </w:r>
-      <w:proofErr w:type="spellStart"/>
-      <w:r>
-        <w:rPr>
-          <w:lang w:val="en-US"/>
-        </w:rPr>
-        <w:t>undersampling</w:t>
-      </w:r>
-      <w:proofErr w:type="spellEnd"/>
-      <w:r>
-        <w:rPr>
-          <w:lang w:val="en-US"/>
-        </w:rPr>
-        <w:t xml:space="preserve"> non-frauds), cost-sensitive learning, and specialized algorithms (e.g., one-class classifiers) are used to address imbalance, but none is a panacea</w:t>
+        <w:t>igh overall accuracy is easy to achieve while missing all fraud. Techniques like resampling (oversampling frauds or undersampling non-frauds), cost-sensitive learning, and specialized algorithms (e.g., one-class classifiers) are used to address imbalance, but none is a panacea</w:t>
       </w:r>
       <w:r>
         <w:rPr>
@@ -10146,28 +9983,7 @@
         <w:rPr>
           <w:lang w:val="en-US"/>
         </w:rPr>
-        <w:t xml:space="preserve"> models must be updated frequently. Ali et al. (2022) </w:t>
-      </w:r>
-      <w:proofErr w:type="gramStart"/>
-      <w:r>
-        <w:rPr>
-          <w:lang w:val="en-US"/>
-        </w:rPr>
-        <w:t>observe</w:t>
-      </w:r>
-      <w:proofErr w:type="gramEnd"/>
-      <w:r>
-        <w:rPr>
-          <w:lang w:val="en-US"/>
-        </w:rPr>
-        <w:t xml:space="preserve"> that addressing concept drift by retraining periodically incurs high overhead, and model performance can suffer between retraining cycles. Online learning algorithms or incremental updates are potential </w:t>
-      </w:r>
-      <w:proofErr w:type="gramStart"/>
-      <w:r>
-        <w:rPr>
-          <w:lang w:val="en-US"/>
-        </w:rPr>
-        <w:t>solutions</w:t>
+        <w:t xml:space="preserve"> models must be updated frequently. Ali et al. (2022) observe that addressing concept drift by retraining periodically incurs high overhead, and model performance can suffer between retraining cycles. Online learning algorithms or incremental updates are potential solutions</w:t>
       </w:r>
       <w:r>
         <w:rPr>
@@ -10179,48 +9995,13 @@
         <w:rPr>
           <w:lang w:val="en-US"/>
         </w:rPr>
-        <w:t xml:space="preserve"> but</w:t>
-      </w:r>
-      <w:proofErr w:type="gramEnd"/>
-      <w:r>
-        <w:rPr>
-          <w:lang w:val="en-US"/>
-        </w:rPr>
-        <w:t xml:space="preserve"> are complex to </w:t>
-      </w:r>
-      <w:proofErr w:type="gramStart"/>
-      <w:r>
-        <w:rPr>
-          <w:lang w:val="en-US"/>
-        </w:rPr>
-        <w:t>engineer</w:t>
-      </w:r>
-      <w:proofErr w:type="gramEnd"/>
-      <w:r>
-        <w:rPr>
-          <w:lang w:val="en-US"/>
-        </w:rPr>
-        <w:t xml:space="preserve">. Reinforcement learning approaches are one idea to handle non-stationarity by continuous adaptation (Patel et al., 2025), but this is still nascent. In practice, a combination of human analyst feedback and model retraining on recent data is used to tackle drift, but this lag means new fraud types can still cause damage before models catch up. The challenge is essentially a cat-and-mouse game with </w:t>
-      </w:r>
-      <w:proofErr w:type="gramStart"/>
-      <w:r>
-        <w:rPr>
-          <w:lang w:val="en-US"/>
-        </w:rPr>
-        <w:t>adversaries</w:t>
-      </w:r>
-      <w:r>
-        <w:rPr>
-          <w:lang w:val="en-US"/>
-        </w:rPr>
-        <w:t>,</w:t>
-      </w:r>
-      <w:proofErr w:type="gramEnd"/>
-      <w:r>
-        <w:rPr>
-          <w:lang w:val="en-US"/>
-        </w:rPr>
-        <w:t xml:space="preserve"> </w:t>
+        <w:t xml:space="preserve"> but are complex to engineer. Reinforcement learning approaches are one idea to handle non-stationarity by continuous adaptation (Patel et al., 2025), but this is still nascent. In practice, a combination of human analyst feedback and model retraining on recent data is used to tackle drift, but this lag means new fraud types can still cause damage before models catch up. The challenge is essentially a cat-and-mouse game with adversaries</w:t>
+      </w:r>
+      <w:r>
+        <w:rPr>
+          <w:lang w:val="en-US"/>
+        </w:rPr>
+        <w:t xml:space="preserve">, </w:t>
       </w:r>
       <w:r>
         <w:rPr>
@@ -10647,21 +10428,7 @@
         <w:rPr>
           <w:lang w:val="en-US"/>
         </w:rPr>
-        <w:t xml:space="preserve">Initially, </w:t>
-      </w:r>
-      <w:proofErr w:type="gramStart"/>
-      <w:r>
-        <w:rPr>
-          <w:lang w:val="en-US"/>
-        </w:rPr>
-        <w:t>exploratory</w:t>
-      </w:r>
-      <w:proofErr w:type="gramEnd"/>
-      <w:r>
-        <w:rPr>
-          <w:lang w:val="en-US"/>
-        </w:rPr>
-        <w:t xml:space="preserve"> data analysis (EDA) was conducted to understand the distributional properties of the data, assess class imbalance, and identify relationships between candidate features and the target variable (fraud vs. non-fraud)</w:t>
+        <w:t>Initially, exploratory data analysis (EDA) was conducted to understand the distributional properties of the data, assess class imbalance, and identify relationships between candidate features and the target variable (fraud vs. non-fraud)</w:t>
       </w:r>
       <w:r>
         <w:rPr>
@@ -10986,27 +10753,13 @@
         <w:rPr>
           <w:lang w:val="en-US"/>
         </w:rPr>
-        <w:t>Following model retraining, probability threshold tuning is incorporated as part of the evaluation methodology to examine how variations in the decision threshold affect performance metrics under different operational trade-</w:t>
-      </w:r>
-      <w:proofErr w:type="gramStart"/>
-      <w:r>
-        <w:rPr>
-          <w:lang w:val="en-US"/>
-        </w:rPr>
-        <w:t>offs.</w:t>
-      </w:r>
-      <w:r>
-        <w:rPr>
-          <w:lang w:val="en-US"/>
-        </w:rPr>
-        <w:t>.</w:t>
-      </w:r>
-      <w:proofErr w:type="gramEnd"/>
-      <w:r>
-        <w:rPr>
-          <w:lang w:val="en-US"/>
-        </w:rPr>
-        <w:t xml:space="preserve"> This step aims to balance the trade-off between precision and recall, as well as between false positive and false negative rates.</w:t>
+        <w:t>Following model retraining, probability threshold tuning is incorporated as part of the evaluation methodology to examine how variations in the decision threshold affect performance metrics under different operational trade-offs.</w:t>
+      </w:r>
+      <w:r>
+        <w:rPr>
+          <w:lang w:val="en-US"/>
+        </w:rPr>
+        <w:t>. This step aims to balance the trade-off between precision and recall, as well as between false positive and false negative rates.</w:t>
       </w:r>
     </w:p>
     <w:p>
@@ -11191,21 +10944,7 @@
         <w:rPr>
           <w:lang w:val="en-US"/>
         </w:rPr>
-        <w:t xml:space="preserve">Train dataset has 590540 </w:t>
-      </w:r>
-      <w:proofErr w:type="gramStart"/>
-      <w:r>
-        <w:rPr>
-          <w:lang w:val="en-US"/>
-        </w:rPr>
-        <w:t>rows</w:t>
-      </w:r>
-      <w:proofErr w:type="gramEnd"/>
-      <w:r>
-        <w:rPr>
-          <w:lang w:val="en-US"/>
-        </w:rPr>
-        <w:t xml:space="preserve"> and 434 columns</w:t>
+        <w:t>Train dataset has 590540 rows and 434 columns</w:t>
       </w:r>
       <w:r>
         <w:rPr>
@@ -11229,21 +10968,7 @@
         <w:rPr>
           <w:lang w:val="en-US"/>
         </w:rPr>
-        <w:t xml:space="preserve">. Before training our machine learning models, we </w:t>
-      </w:r>
-      <w:proofErr w:type="gramStart"/>
-      <w:r>
-        <w:rPr>
-          <w:lang w:val="en-US"/>
-        </w:rPr>
-        <w:t>have to</w:t>
-      </w:r>
-      <w:proofErr w:type="gramEnd"/>
-      <w:r>
-        <w:rPr>
-          <w:lang w:val="en-US"/>
-        </w:rPr>
-        <w:t xml:space="preserve"> analyze the nature of the data. In the appendix, we have conducted a detailed explanatory data analysis. On the following section we present the most important results.</w:t>
+        <w:t>. Before training our machine learning models, we have to analyze the nature of the data. In the appendix, we have conducted a detailed explanatory data analysis. On the following section we present the most important results.</w:t>
       </w:r>
     </w:p>
     <w:p>
@@ -12268,7 +11993,6 @@
         </w:rPr>
       </w:pPr>
       <w:proofErr w:type="spellStart"/>
-      <w:proofErr w:type="gramStart"/>
       <w:r>
         <w:rPr>
           <w:lang w:val="en-US"/>
@@ -12280,14 +12004,7 @@
         <w:rPr>
           <w:lang w:val="en-US"/>
         </w:rPr>
-        <w:t xml:space="preserve">  (</w:t>
-      </w:r>
-      <w:proofErr w:type="gramEnd"/>
-      <w:r>
-        <w:rPr>
-          <w:lang w:val="en-US"/>
-        </w:rPr>
-        <w:t>e.g., mobile/desktop).</w:t>
+        <w:t xml:space="preserve">  (e.g., mobile/desktop).</w:t>
       </w:r>
     </w:p>
     <w:p>
@@ -12928,21 +12645,7 @@
         <w:rPr>
           <w:lang w:val="en-US"/>
         </w:rPr>
-        <w:t xml:space="preserve">user identification </w:t>
-      </w:r>
-      <w:proofErr w:type="gramStart"/>
-      <w:r>
-        <w:rPr>
-          <w:lang w:val="en-US"/>
-        </w:rPr>
-        <w:t>data,</w:t>
-      </w:r>
-      <w:proofErr w:type="gramEnd"/>
-      <w:r>
-        <w:rPr>
-          <w:lang w:val="en-US"/>
-        </w:rPr>
-        <w:t xml:space="preserve"> might mean that the adversary couldn’t provide </w:t>
+        <w:t xml:space="preserve">user identification data, might mean that the adversary couldn’t provide </w:t>
       </w:r>
       <w:r>
         <w:rPr>
@@ -12956,19 +12659,11 @@
         </w:rPr>
         <w:t xml:space="preserve"> the user information. </w:t>
       </w:r>
-      <w:proofErr w:type="gramStart"/>
-      <w:r>
-        <w:rPr>
-          <w:lang w:val="en-US"/>
-        </w:rPr>
-        <w:t>So</w:t>
-      </w:r>
-      <w:proofErr w:type="gramEnd"/>
-      <w:r>
-        <w:rPr>
-          <w:lang w:val="en-US"/>
-        </w:rPr>
-        <w:t xml:space="preserve"> for our dataset, we drop only the features with &gt; 9</w:t>
+      <w:r>
+        <w:rPr>
+          <w:lang w:val="en-US"/>
+        </w:rPr>
+        <w:t>So for our dataset, we drop only the features with &gt; 9</w:t>
       </w:r>
       <w:r>
         <w:rPr>
@@ -13314,21 +13009,7 @@
         <w:rPr>
           <w:lang w:val="en-US"/>
         </w:rPr>
-        <w:t xml:space="preserve">These features have a conceptual meaning, as we can later compare each transaction with the relative transaction amount statistics, of the corresponding day of week, or hour of day. </w:t>
-      </w:r>
-      <w:proofErr w:type="gramStart"/>
-      <w:r>
-        <w:rPr>
-          <w:lang w:val="en-US"/>
-        </w:rPr>
-        <w:t>So</w:t>
-      </w:r>
-      <w:proofErr w:type="gramEnd"/>
-      <w:r>
-        <w:rPr>
-          <w:lang w:val="en-US"/>
-        </w:rPr>
-        <w:t xml:space="preserve"> on these features we observe the following:</w:t>
+        <w:t>These features have a conceptual meaning, as we can later compare each transaction with the relative transaction amount statistics, of the corresponding day of week, or hour of day. So on these features we observe the following:</w:t>
       </w:r>
     </w:p>
     <w:p>
@@ -13501,6 +13182,7 @@
     </w:p>
     <w:p>
       <w:pPr>
+        <w:pStyle w:val="BodyText"/>
         <w:rPr>
           <w:rFonts w:asciiTheme="majorHAnsi" w:eastAsiaTheme="majorEastAsia" w:hAnsiTheme="majorHAnsi" w:cstheme="majorBidi"/>
           <w:color w:val="0F4761" w:themeColor="accent1" w:themeShade="BF"/>
@@ -13509,6 +13191,12 @@
           <w:lang w:val="en-US"/>
         </w:rPr>
       </w:pPr>
+      <w:r>
+        <w:rPr>
+          <w:lang w:val="en-US"/>
+        </w:rPr>
+        <w:t xml:space="preserve">It seems there is a slightly clearer pattern in those features. Also, other features could be aggregated based on these 2 generated features, e.g. transaction amount per hour of day (See later chapters). </w:t>
+      </w:r>
       <w:r>
         <w:rPr>
           <w:lang w:val="en-US"/>
@@ -14473,58 +14161,30 @@
           <w:bCs/>
           <w:lang w:val="en-US"/>
         </w:rPr>
-        <w:t xml:space="preserve">3 decimal </w:t>
-      </w:r>
-      <w:proofErr w:type="gramStart"/>
+        <w:t>3 decimal places, have a much higher fraud percentage</w:t>
+      </w:r>
+      <w:r>
+        <w:rPr>
+          <w:lang w:val="en-US"/>
+        </w:rPr>
+        <w:t xml:space="preserve">. Note that as we mentioned earlier, 3 decimal places might indicate that the transaction </w:t>
+      </w:r>
       <w:r>
         <w:rPr>
           <w:b/>
           <w:bCs/>
           <w:lang w:val="en-US"/>
         </w:rPr>
-        <w:t>places,</w:t>
-      </w:r>
-      <w:proofErr w:type="gramEnd"/>
+        <w:t xml:space="preserve">included a currency exchange </w:t>
+      </w:r>
       <w:r>
         <w:rPr>
           <w:b/>
           <w:bCs/>
           <w:lang w:val="en-US"/>
         </w:rPr>
-        <w:t xml:space="preserve"> have a much higher fraud percentage</w:t>
-      </w:r>
-      <w:r>
-        <w:rPr>
-          <w:lang w:val="en-US"/>
-        </w:rPr>
-        <w:t xml:space="preserve">. Note that as we mentioned earlier, 3 decimal places might indicate that the transaction </w:t>
-      </w:r>
-      <w:r>
-        <w:rPr>
-          <w:b/>
-          <w:bCs/>
-          <w:lang w:val="en-US"/>
-        </w:rPr>
-        <w:t xml:space="preserve">included a currency </w:t>
-      </w:r>
-      <w:proofErr w:type="gramStart"/>
-      <w:r>
-        <w:rPr>
-          <w:b/>
-          <w:bCs/>
-          <w:lang w:val="en-US"/>
-        </w:rPr>
-        <w:t xml:space="preserve">exchange </w:t>
-      </w:r>
-      <w:r>
-        <w:rPr>
-          <w:b/>
-          <w:bCs/>
-          <w:lang w:val="en-US"/>
-        </w:rPr>
         <w:t>.</w:t>
       </w:r>
-      <w:proofErr w:type="gramEnd"/>
     </w:p>
     <w:p>
       <w:pPr>
@@ -15104,14 +14764,12 @@
         </w:rPr>
         <w:t xml:space="preserve">those email domains are </w:t>
       </w:r>
-      <w:proofErr w:type="gramStart"/>
-      <w:r>
-        <w:rPr>
-          <w:lang w:val="en-US"/>
-        </w:rPr>
-        <w:t>pretty rare</w:t>
-      </w:r>
-      <w:proofErr w:type="gramEnd"/>
+      <w:r>
+        <w:rPr>
+          <w:lang w:val="en-US"/>
+        </w:rPr>
+        <w:t>relatively rare</w:t>
+      </w:r>
       <w:r>
         <w:rPr>
           <w:lang w:val="en-US"/>
@@ -15987,39 +15645,7 @@
           <w:rStyle w:val="BodyTextChar"/>
           <w:lang w:val="en-US"/>
         </w:rPr>
-        <w:t xml:space="preserve">We keep them as </w:t>
-      </w:r>
-      <w:proofErr w:type="gramStart"/>
-      <w:r>
-        <w:rPr>
-          <w:rStyle w:val="BodyTextChar"/>
-          <w:lang w:val="en-US"/>
-        </w:rPr>
-        <w:t>is, and</w:t>
-      </w:r>
-      <w:proofErr w:type="gramEnd"/>
-      <w:r>
-        <w:rPr>
-          <w:rStyle w:val="BodyTextChar"/>
-          <w:lang w:val="en-US"/>
-        </w:rPr>
-        <w:t xml:space="preserve"> let </w:t>
-      </w:r>
-      <w:proofErr w:type="gramStart"/>
-      <w:r>
-        <w:rPr>
-          <w:rStyle w:val="BodyTextChar"/>
-          <w:lang w:val="en-US"/>
-        </w:rPr>
-        <w:t>later importance calculations decide</w:t>
-      </w:r>
-      <w:proofErr w:type="gramEnd"/>
-      <w:r>
-        <w:rPr>
-          <w:rStyle w:val="BodyTextChar"/>
-          <w:lang w:val="en-US"/>
-        </w:rPr>
-        <w:t>.</w:t>
+        <w:t>We keep them as is, and let later importance calculations decide.</w:t>
       </w:r>
       <w:r>
         <w:rPr>
@@ -16158,41 +15784,13 @@
         <w:rPr>
           <w:lang w:val="en-US"/>
         </w:rPr>
-        <w:t xml:space="preserve"> deemed insignificant. </w:t>
-      </w:r>
-      <w:proofErr w:type="gramStart"/>
-      <w:r>
-        <w:rPr>
-          <w:lang w:val="en-US"/>
-        </w:rPr>
-        <w:t>So</w:t>
-      </w:r>
-      <w:proofErr w:type="gramEnd"/>
-      <w:r>
-        <w:rPr>
-          <w:lang w:val="en-US"/>
-        </w:rPr>
-        <w:t xml:space="preserve"> we used the rest of the features. </w:t>
-      </w:r>
-      <w:r>
-        <w:rPr>
-          <w:lang w:val="en-US"/>
-        </w:rPr>
-        <w:t xml:space="preserve">On the following plot we can see that there is </w:t>
-      </w:r>
-      <w:proofErr w:type="gramStart"/>
-      <w:r>
-        <w:rPr>
-          <w:lang w:val="en-US"/>
-        </w:rPr>
-        <w:t>really high</w:t>
-      </w:r>
-      <w:proofErr w:type="gramEnd"/>
-      <w:r>
-        <w:rPr>
-          <w:lang w:val="en-US"/>
-        </w:rPr>
-        <w:t xml:space="preserve"> correlation between the vesta features (even after dropping many of them).</w:t>
+        <w:t xml:space="preserve"> deemed insignificant. So we used the rest of the features. </w:t>
+      </w:r>
+      <w:r>
+        <w:rPr>
+          <w:lang w:val="en-US"/>
+        </w:rPr>
+        <w:t>On the following plot we can see that there is really high correlation between the vesta features (even after dropping many of them).</w:t>
       </w:r>
     </w:p>
     <w:p>
@@ -17644,65 +17242,25 @@
           <w:lang w:val="en-US"/>
         </w:rPr>
       </w:pPr>
-      <w:proofErr w:type="gramStart"/>
-      <w:r>
-        <w:rPr>
-          <w:lang w:val="en-US"/>
-        </w:rPr>
-        <w:t>Finally</w:t>
-      </w:r>
-      <w:proofErr w:type="gramEnd"/>
-      <w:r>
-        <w:rPr>
-          <w:lang w:val="en-US"/>
-        </w:rPr>
-        <w:t xml:space="preserve"> we used the calculated mean std and z-score for a</w:t>
-      </w:r>
-      <w:r>
-        <w:rPr>
-          <w:lang w:val="en-US"/>
-        </w:rPr>
-        <w:t>ll</w:t>
-      </w:r>
-      <w:r>
-        <w:rPr>
-          <w:lang w:val="en-US"/>
-        </w:rPr>
-        <w:t xml:space="preserve"> other</w:t>
-      </w:r>
-      <w:r>
-        <w:rPr>
-          <w:lang w:val="en-US"/>
-        </w:rPr>
-        <w:t xml:space="preserve"> numerical features based on user ID</w:t>
-      </w:r>
-    </w:p>
-    <w:p>
-      <w:pPr>
-        <w:pStyle w:val="BodyText"/>
+      <w:r>
+        <w:rPr>
+          <w:lang w:val="en-US"/>
+        </w:rPr>
+        <w:t>Furthermore,</w:t>
+      </w:r>
+      <w:r>
+        <w:rPr>
+          <w:lang w:val="en-US"/>
+        </w:rPr>
+        <w:t xml:space="preserve"> we used the </w:t>
+      </w:r>
+      <w:r>
         <w:rPr>
           <w:b/>
           <w:bCs/>
           <w:lang w:val="en-US"/>
         </w:rPr>
-      </w:pPr>
-      <w:r>
-        <w:rPr>
-          <w:lang w:val="en-US"/>
-        </w:rPr>
-        <w:t>Also</w:t>
-      </w:r>
-      <w:r>
-        <w:rPr>
-          <w:lang w:val="en-US"/>
-        </w:rPr>
-        <w:t>,</w:t>
-      </w:r>
-      <w:r>
-        <w:rPr>
-          <w:lang w:val="en-US"/>
-        </w:rPr>
-        <w:t xml:space="preserve"> we used </w:t>
+        <w:t>calculated mean std and z-score for a</w:t>
       </w:r>
       <w:r>
         <w:rPr>
@@ -17710,7 +17268,7 @@
           <w:bCs/>
           <w:lang w:val="en-US"/>
         </w:rPr>
-        <w:t>C</w:t>
+        <w:t>ll</w:t>
       </w:r>
       <w:r>
         <w:rPr>
@@ -17718,7 +17276,7 @@
           <w:bCs/>
           <w:lang w:val="en-US"/>
         </w:rPr>
-        <w:t xml:space="preserve">oncept 2 </w:t>
+        <w:t xml:space="preserve"> other</w:t>
       </w:r>
       <w:r>
         <w:rPr>
@@ -17726,7 +17284,71 @@
           <w:bCs/>
           <w:lang w:val="en-US"/>
         </w:rPr>
-        <w:t>for all categorical features based on user ID.</w:t>
+        <w:t xml:space="preserve"> numerical features</w:t>
+      </w:r>
+      <w:r>
+        <w:rPr>
+          <w:b/>
+          <w:bCs/>
+          <w:lang w:val="en-US"/>
+        </w:rPr>
+        <w:t xml:space="preserve"> </w:t>
+      </w:r>
+      <w:r>
+        <w:rPr>
+          <w:b/>
+          <w:bCs/>
+          <w:lang w:val="en-US"/>
+        </w:rPr>
+        <w:t>based on user ID</w:t>
+      </w:r>
+      <w:r>
+        <w:rPr>
+          <w:lang w:val="en-US"/>
+        </w:rPr>
+        <w:t xml:space="preserve"> and </w:t>
+      </w:r>
+      <w:r>
+        <w:rPr>
+          <w:b/>
+          <w:bCs/>
+          <w:lang w:val="en-US"/>
+        </w:rPr>
+        <w:t>C</w:t>
+      </w:r>
+      <w:r>
+        <w:rPr>
+          <w:b/>
+          <w:bCs/>
+          <w:lang w:val="en-US"/>
+        </w:rPr>
+        <w:t xml:space="preserve">oncept 2 </w:t>
+      </w:r>
+      <w:r>
+        <w:rPr>
+          <w:b/>
+          <w:bCs/>
+          <w:lang w:val="en-US"/>
+        </w:rPr>
+        <w:t>for all categorical features based on user ID</w:t>
+      </w:r>
+      <w:r>
+        <w:rPr>
+          <w:lang w:val="en-US"/>
+        </w:rPr>
+        <w:t xml:space="preserve">. This generates a large number of relational features. Many of them are proven to be redundant, but again we rely on later feature importance calculations to </w:t>
+      </w:r>
+      <w:r>
+        <w:rPr>
+          <w:lang w:val="en-US"/>
+        </w:rPr>
+        <w:t>dispose of</w:t>
+      </w:r>
+      <w:r>
+        <w:rPr>
+          <w:lang w:val="en-US"/>
+        </w:rPr>
+        <w:t xml:space="preserve"> them.</w:t>
       </w:r>
       <w:r>
         <w:rPr>
@@ -21160,21 +20782,7 @@
         <w:rPr>
           <w:lang w:val="en-US"/>
         </w:rPr>
-        <w:t xml:space="preserve">LightGBM remained the best performant model, even though it’s ROC-AUC did not improve. </w:t>
-      </w:r>
-      <w:proofErr w:type="gramStart"/>
-      <w:r>
-        <w:rPr>
-          <w:lang w:val="en-US"/>
-        </w:rPr>
-        <w:t>However</w:t>
-      </w:r>
-      <w:proofErr w:type="gramEnd"/>
-      <w:r>
-        <w:rPr>
-          <w:lang w:val="en-US"/>
-        </w:rPr>
-        <w:t xml:space="preserve"> we can see that average precision metric</w:t>
+        <w:t>LightGBM remained the best performant model, even though it’s ROC-AUC did not improve. However we can see that average precision metric</w:t>
       </w:r>
       <w:r>
         <w:rPr>
@@ -21283,21 +20891,7 @@
         <w:rPr>
           <w:lang w:val="en-US"/>
         </w:rPr>
-        <w:t xml:space="preserve"> The final features selected were the ones that were </w:t>
-      </w:r>
-      <w:proofErr w:type="gramStart"/>
-      <w:r>
-        <w:rPr>
-          <w:lang w:val="en-US"/>
-        </w:rPr>
-        <w:t>on</w:t>
-      </w:r>
-      <w:proofErr w:type="gramEnd"/>
-      <w:r>
-        <w:rPr>
-          <w:lang w:val="en-US"/>
-        </w:rPr>
-        <w:t xml:space="preserve"> the top 30% of most important features for at least 2 of the 3 models.</w:t>
+        <w:t xml:space="preserve"> The final features selected were the ones that were on the top 30% of most important features for at least 2 of the 3 models.</w:t>
       </w:r>
     </w:p>
     <w:tbl>
@@ -26096,21 +25690,7 @@
         <w:rPr>
           <w:lang w:val="en-US"/>
         </w:rPr>
-        <w:t xml:space="preserve">aggregated user behavioral statistics, and device-related features, indicating that both transactional characteristics and historical user </w:t>
-      </w:r>
-      <w:proofErr w:type="gramStart"/>
-      <w:r>
-        <w:rPr>
-          <w:lang w:val="en-US"/>
-        </w:rPr>
-        <w:t>behavior</w:t>
-      </w:r>
-      <w:proofErr w:type="gramEnd"/>
-      <w:r>
-        <w:rPr>
-          <w:lang w:val="en-US"/>
-        </w:rPr>
-        <w:t xml:space="preserve"> are critical for effective fraud detection.</w:t>
+        <w:t>aggregated user behavioral statistics, and device-related features, indicating that both transactional characteristics and historical user behavior are critical for effective fraud detection.</w:t>
       </w:r>
       <w:r>
         <w:rPr>
@@ -28145,7 +27725,6 @@
                 <w:lang w:val="en-US"/>
               </w:rPr>
             </w:pPr>
-            <w:proofErr w:type="gramStart"/>
             <w:r>
               <w:rPr>
                 <w:rFonts w:ascii="Calibri" w:eastAsia="Times New Roman" w:hAnsi="Calibri" w:cs="Calibri"/>
@@ -28154,18 +27733,7 @@
                 <w:szCs w:val="22"/>
                 <w:lang w:val="en-US"/>
               </w:rPr>
-              <w:t>XGBoost @</w:t>
-            </w:r>
-            <w:proofErr w:type="gramEnd"/>
-            <w:r>
-              <w:rPr>
-                <w:rFonts w:ascii="Calibri" w:eastAsia="Times New Roman" w:hAnsi="Calibri" w:cs="Calibri"/>
-                <w:color w:val="000000"/>
-                <w:sz w:val="22"/>
-                <w:szCs w:val="22"/>
-                <w:lang w:val="en-US"/>
-              </w:rPr>
-              <w:t xml:space="preserve"> threshold = 0.1</w:t>
+              <w:t>XGBoost @ threshold = 0.1</w:t>
             </w:r>
           </w:p>
         </w:tc>
@@ -28309,7 +27877,6 @@
                 <w:lang w:val="en-US"/>
               </w:rPr>
             </w:pPr>
-            <w:proofErr w:type="gramStart"/>
             <w:r>
               <w:rPr>
                 <w:rFonts w:ascii="Calibri" w:eastAsia="Times New Roman" w:hAnsi="Calibri" w:cs="Calibri"/>
@@ -28318,18 +27885,7 @@
                 <w:szCs w:val="22"/>
                 <w:lang w:val="en-US"/>
               </w:rPr>
-              <w:t>LGBM @</w:t>
-            </w:r>
-            <w:proofErr w:type="gramEnd"/>
-            <w:r>
-              <w:rPr>
-                <w:rFonts w:ascii="Calibri" w:eastAsia="Times New Roman" w:hAnsi="Calibri" w:cs="Calibri"/>
-                <w:color w:val="000000"/>
-                <w:sz w:val="22"/>
-                <w:szCs w:val="22"/>
-                <w:lang w:val="en-US"/>
-              </w:rPr>
-              <w:t xml:space="preserve"> threshold = 0.1</w:t>
+              <w:t>LGBM @ threshold = 0.1</w:t>
             </w:r>
           </w:p>
         </w:tc>
@@ -28474,7 +28030,6 @@
               </w:rPr>
             </w:pPr>
             <w:proofErr w:type="spellStart"/>
-            <w:proofErr w:type="gramStart"/>
             <w:r>
               <w:rPr>
                 <w:rFonts w:ascii="Calibri" w:eastAsia="Times New Roman" w:hAnsi="Calibri" w:cs="Calibri"/>
@@ -28494,18 +28049,7 @@
                 <w:szCs w:val="22"/>
                 <w:lang w:val="en-US"/>
               </w:rPr>
-              <w:t xml:space="preserve"> @</w:t>
-            </w:r>
-            <w:proofErr w:type="gramEnd"/>
-            <w:r>
-              <w:rPr>
-                <w:rFonts w:ascii="Calibri" w:eastAsia="Times New Roman" w:hAnsi="Calibri" w:cs="Calibri"/>
-                <w:color w:val="000000"/>
-                <w:sz w:val="22"/>
-                <w:szCs w:val="22"/>
-                <w:lang w:val="en-US"/>
-              </w:rPr>
-              <w:t xml:space="preserve"> threshold = 0.1</w:t>
+              <w:t xml:space="preserve"> @ threshold = 0.1</w:t>
             </w:r>
           </w:p>
         </w:tc>
@@ -29244,21 +28788,7 @@
         <w:rPr>
           <w:lang w:val="en-US"/>
         </w:rPr>
-        <w:t xml:space="preserve"> This drastic change can also be seen in the confusion matrix and false positive vs false negative rates plots. For </w:t>
-      </w:r>
-      <w:proofErr w:type="gramStart"/>
-      <w:r>
-        <w:rPr>
-          <w:lang w:val="en-US"/>
-        </w:rPr>
-        <w:t>example</w:t>
-      </w:r>
-      <w:proofErr w:type="gramEnd"/>
-      <w:r>
-        <w:rPr>
-          <w:lang w:val="en-US"/>
-        </w:rPr>
-        <w:t xml:space="preserve"> in the LGBM plots (which is the best performing model), we can see that </w:t>
+        <w:t xml:space="preserve"> This drastic change can also be seen in the confusion matrix and false positive vs false negative rates plots. For example in the LGBM plots (which is the best performing model), we can see that </w:t>
       </w:r>
       <w:r>
         <w:rPr>
@@ -29708,7 +29238,7 @@
         <w:pStyle w:val="BodyText"/>
         <w:numPr>
           <w:ilvl w:val="0"/>
-          <w:numId w:val="45"/>
+          <w:numId w:val="46"/>
         </w:numPr>
         <w:rPr>
           <w:lang w:val="en-US"/>
@@ -29784,7 +29314,7 @@
         <w:pStyle w:val="BodyText"/>
         <w:numPr>
           <w:ilvl w:val="0"/>
-          <w:numId w:val="45"/>
+          <w:numId w:val="46"/>
         </w:numPr>
         <w:rPr>
           <w:lang w:val="en-US"/>
@@ -29846,7 +29376,7 @@
         <w:pStyle w:val="BodyText"/>
         <w:numPr>
           <w:ilvl w:val="0"/>
-          <w:numId w:val="45"/>
+          <w:numId w:val="46"/>
         </w:numPr>
         <w:rPr>
           <w:lang w:val="en-US"/>
@@ -29922,7 +29452,7 @@
         <w:pStyle w:val="BodyText"/>
         <w:numPr>
           <w:ilvl w:val="0"/>
-          <w:numId w:val="45"/>
+          <w:numId w:val="46"/>
         </w:numPr>
         <w:rPr>
           <w:lang w:val="en-US"/>
@@ -29984,7 +29514,7 @@
         <w:pStyle w:val="BodyText"/>
         <w:numPr>
           <w:ilvl w:val="0"/>
-          <w:numId w:val="45"/>
+          <w:numId w:val="46"/>
         </w:numPr>
         <w:rPr>
           <w:lang w:val="en-US"/>
@@ -30060,7 +29590,7 @@
         <w:pStyle w:val="BodyText"/>
         <w:numPr>
           <w:ilvl w:val="0"/>
-          <w:numId w:val="45"/>
+          <w:numId w:val="46"/>
         </w:numPr>
         <w:rPr>
           <w:lang w:val="en-US"/>
@@ -30122,7 +29652,7 @@
         <w:pStyle w:val="BodyText"/>
         <w:numPr>
           <w:ilvl w:val="0"/>
-          <w:numId w:val="45"/>
+          <w:numId w:val="46"/>
         </w:numPr>
         <w:rPr>
           <w:lang w:val="en-US"/>
@@ -30184,7 +29714,7 @@
         <w:pStyle w:val="BodyText"/>
         <w:numPr>
           <w:ilvl w:val="0"/>
-          <w:numId w:val="45"/>
+          <w:numId w:val="46"/>
         </w:numPr>
         <w:rPr>
           <w:lang w:val="en-US"/>
@@ -30240,7 +29770,7 @@
         <w:pStyle w:val="BodyText"/>
         <w:numPr>
           <w:ilvl w:val="0"/>
-          <w:numId w:val="45"/>
+          <w:numId w:val="46"/>
         </w:numPr>
         <w:rPr>
           <w:lang w:val="en-US"/>
@@ -30302,7 +29832,7 @@
         <w:pStyle w:val="BodyText"/>
         <w:numPr>
           <w:ilvl w:val="0"/>
-          <w:numId w:val="45"/>
+          <w:numId w:val="46"/>
         </w:numPr>
         <w:rPr>
           <w:lang w:val="en-US"/>
@@ -30327,21 +29857,7 @@
         <w:rPr>
           <w:lang w:val="en-US"/>
         </w:rPr>
-        <w:t xml:space="preserve"> (2022) “Feature Engineering and Resampling Strategies for Fund Transfer Fraud </w:t>
-      </w:r>
-      <w:proofErr w:type="gramStart"/>
-      <w:r>
-        <w:rPr>
-          <w:lang w:val="en-US"/>
-        </w:rPr>
-        <w:t>With</w:t>
-      </w:r>
-      <w:proofErr w:type="gramEnd"/>
-      <w:r>
-        <w:rPr>
-          <w:lang w:val="en-US"/>
-        </w:rPr>
-        <w:t xml:space="preserve"> Limited Transaction Data and a Time-Inhomogeneous Modi Operandi,” </w:t>
+        <w:t xml:space="preserve"> (2022) “Feature Engineering and Resampling Strategies for Fund Transfer Fraud With Limited Transaction Data and a Time-Inhomogeneous Modi Operandi,” </w:t>
       </w:r>
       <w:r>
         <w:rPr>
@@ -30379,7 +29895,7 @@
         <w:pStyle w:val="BodyText"/>
         <w:numPr>
           <w:ilvl w:val="0"/>
-          <w:numId w:val="45"/>
+          <w:numId w:val="46"/>
         </w:numPr>
         <w:rPr>
           <w:lang w:val="en-US"/>
@@ -30441,7 +29957,7 @@
         <w:pStyle w:val="BodyText"/>
         <w:numPr>
           <w:ilvl w:val="0"/>
-          <w:numId w:val="45"/>
+          <w:numId w:val="46"/>
         </w:numPr>
         <w:rPr>
           <w:lang w:val="en-US"/>
@@ -30459,7 +29975,7 @@
         <w:pStyle w:val="BodyText"/>
         <w:numPr>
           <w:ilvl w:val="0"/>
-          <w:numId w:val="45"/>
+          <w:numId w:val="46"/>
         </w:numPr>
         <w:rPr>
           <w:lang w:val="en-US"/>
@@ -30477,57 +29993,21 @@
           <w:iCs/>
           <w:lang w:val="en-US"/>
         </w:rPr>
-        <w:t xml:space="preserve">2017 Third International Conference on Advances in Electrical, Electronics, Information, Communication and </w:t>
-      </w:r>
-      <w:proofErr w:type="gramStart"/>
+        <w:t>2017 Third International Conference on Advances in Electrical, Electronics, Information, Communication and Bio-Informatics (AEEICB)</w:t>
+      </w:r>
+      <w:r>
+        <w:rPr>
+          <w:lang w:val="en-US"/>
+        </w:rPr>
+        <w:t xml:space="preserve">. </w:t>
+      </w:r>
       <w:r>
         <w:rPr>
           <w:i/>
           <w:iCs/>
           <w:lang w:val="en-US"/>
         </w:rPr>
-        <w:t>Bio-Informatics</w:t>
-      </w:r>
-      <w:proofErr w:type="gramEnd"/>
-      <w:r>
-        <w:rPr>
-          <w:i/>
-          <w:iCs/>
-          <w:lang w:val="en-US"/>
-        </w:rPr>
-        <w:t xml:space="preserve"> (AEEICB)</w:t>
-      </w:r>
-      <w:r>
-        <w:rPr>
-          <w:lang w:val="en-US"/>
-        </w:rPr>
-        <w:t xml:space="preserve">. </w:t>
-      </w:r>
-      <w:r>
-        <w:rPr>
-          <w:i/>
-          <w:iCs/>
-          <w:lang w:val="en-US"/>
-        </w:rPr>
-        <w:t xml:space="preserve">2017 Third International Conference on Advances in Electrical, Electronics, Information, Communication and </w:t>
-      </w:r>
-      <w:proofErr w:type="gramStart"/>
-      <w:r>
-        <w:rPr>
-          <w:i/>
-          <w:iCs/>
-          <w:lang w:val="en-US"/>
-        </w:rPr>
-        <w:t>Bio-Informatics</w:t>
-      </w:r>
-      <w:proofErr w:type="gramEnd"/>
-      <w:r>
-        <w:rPr>
-          <w:i/>
-          <w:iCs/>
-          <w:lang w:val="en-US"/>
-        </w:rPr>
-        <w:t xml:space="preserve"> (AEEICB)</w:t>
+        <w:t>2017 Third International Conference on Advances in Electrical, Electronics, Information, Communication and Bio-Informatics (AEEICB)</w:t>
       </w:r>
       <w:r>
         <w:rPr>
@@ -30557,7 +30037,7 @@
         <w:pStyle w:val="BodyText"/>
         <w:numPr>
           <w:ilvl w:val="0"/>
-          <w:numId w:val="45"/>
+          <w:numId w:val="46"/>
         </w:numPr>
         <w:rPr>
           <w:lang w:val="en-US"/>
@@ -30619,7 +30099,7 @@
         <w:pStyle w:val="BodyText"/>
         <w:numPr>
           <w:ilvl w:val="0"/>
-          <w:numId w:val="45"/>
+          <w:numId w:val="46"/>
         </w:numPr>
         <w:rPr>
           <w:lang w:val="en-US"/>
@@ -30681,7 +30161,7 @@
         <w:pStyle w:val="BodyText"/>
         <w:numPr>
           <w:ilvl w:val="0"/>
-          <w:numId w:val="45"/>
+          <w:numId w:val="46"/>
         </w:numPr>
         <w:rPr>
           <w:lang w:val="en-US"/>
@@ -30765,7 +30245,7 @@
         <w:pStyle w:val="BodyText"/>
         <w:numPr>
           <w:ilvl w:val="0"/>
-          <w:numId w:val="45"/>
+          <w:numId w:val="46"/>
         </w:numPr>
         <w:rPr>
           <w:lang w:val="en-US"/>
@@ -30827,7 +30307,7 @@
         <w:pStyle w:val="BodyText"/>
         <w:numPr>
           <w:ilvl w:val="0"/>
-          <w:numId w:val="45"/>
+          <w:numId w:val="46"/>
         </w:numPr>
         <w:rPr>
           <w:lang w:val="en-US"/>
@@ -30876,7 +30356,7 @@
         <w:pStyle w:val="BodyText"/>
         <w:numPr>
           <w:ilvl w:val="0"/>
-          <w:numId w:val="45"/>
+          <w:numId w:val="46"/>
         </w:numPr>
         <w:rPr>
           <w:lang w:val="en-US"/>
@@ -30946,7 +30426,7 @@
         <w:pStyle w:val="BodyText"/>
         <w:numPr>
           <w:ilvl w:val="0"/>
-          <w:numId w:val="45"/>
+          <w:numId w:val="46"/>
         </w:numPr>
         <w:rPr>
           <w:lang w:val="en-US"/>
@@ -31056,13 +30536,88 @@
     <w:p>
       <w:pPr>
         <w:pStyle w:val="BodyText"/>
-        <w:rPr>
-          <w:lang w:val="en-US"/>
-        </w:rPr>
-      </w:pPr>
+        <w:numPr>
+          <w:ilvl w:val="0"/>
+          <w:numId w:val="46"/>
+        </w:numPr>
+        <w:rPr>
+          <w:lang w:val="en-US"/>
+        </w:rPr>
+      </w:pPr>
+      <w:proofErr w:type="spellStart"/>
+      <w:r>
+        <w:rPr>
+          <w:lang w:val="en-US"/>
+        </w:rPr>
+        <w:t>Bouchti</w:t>
+      </w:r>
+      <w:proofErr w:type="spellEnd"/>
+      <w:r>
+        <w:rPr>
+          <w:lang w:val="en-US"/>
+        </w:rPr>
+        <w:t xml:space="preserve">, A.E. </w:t>
+      </w:r>
+      <w:r>
+        <w:rPr>
+          <w:i/>
+          <w:iCs/>
+          <w:lang w:val="en-US"/>
+        </w:rPr>
+        <w:t>et al.</w:t>
+      </w:r>
+      <w:r>
+        <w:rPr>
+          <w:lang w:val="en-US"/>
+        </w:rPr>
+        <w:t xml:space="preserve"> (2017) “Fraud detection in banking using deep reinforcement learning,” in </w:t>
+      </w:r>
+      <w:r>
+        <w:rPr>
+          <w:i/>
+          <w:iCs/>
+          <w:lang w:val="en-US"/>
+        </w:rPr>
+        <w:t>2017 Seventh International Conference on Innovative Computing Technology (INTECH)</w:t>
+      </w:r>
+      <w:r>
+        <w:rPr>
+          <w:lang w:val="en-US"/>
+        </w:rPr>
+        <w:t xml:space="preserve">. </w:t>
+      </w:r>
+      <w:r>
+        <w:rPr>
+          <w:i/>
+          <w:iCs/>
+          <w:lang w:val="en-US"/>
+        </w:rPr>
+        <w:t>2017 Seventh International Conference on Innovative Computing Technology (INTECH)</w:t>
+      </w:r>
+      <w:r>
+        <w:rPr>
+          <w:lang w:val="en-US"/>
+        </w:rPr>
+        <w:t xml:space="preserve">, pp. 58–63. Available at: </w:t>
+      </w:r>
+      <w:hyperlink r:id="rId81" w:history="1">
+        <w:r>
+          <w:rPr>
+            <w:rStyle w:val="Hyperlink"/>
+            <w:lang w:val="en-US"/>
+          </w:rPr>
+          <w:t>https://doi.org/10.1109/INTECH.2017.8102446</w:t>
+        </w:r>
+      </w:hyperlink>
+      <w:r>
+        <w:rPr>
+          <w:lang w:val="en-US"/>
+        </w:rPr>
+        <w:t>.</w:t>
+      </w:r>
     </w:p>
     <w:sectPr>
-      <w:footerReference w:type="default" r:id="rId81"/>
+      <w:footerReference w:type="default" r:id="rId82"/>
       <w:footnotePr>
         <w:numRestart w:val="eachSect"/>
       </w:footnotePr>
@@ -35082,6 +34637,92 @@
     </w:lvl>
   </w:abstractNum>
   <w:abstractNum w:abstractNumId="36" w15:restartNumberingAfterBreak="0">
+    <w:nsid w:val="6388296B"/>
+    <w:multiLevelType w:val="hybridMultilevel"/>
+    <w:tmpl w:val="506A5CDA"/>
+    <w:lvl w:ilvl="0" w:tplc="0409000F">
+      <w:start w:val="1"/>
+      <w:numFmt w:val="decimal"/>
+      <w:lvlText w:val="%1."/>
+      <w:lvlJc w:val="left"/>
+      <w:pPr>
+        <w:ind w:left="360" w:hanging="360"/>
+      </w:pPr>
+    </w:lvl>
+    <w:lvl w:ilvl="1" w:tplc="04090019" w:tentative="1">
+      <w:start w:val="1"/>
+      <w:numFmt w:val="lowerLetter"/>
+      <w:lvlText w:val="%2."/>
+      <w:lvlJc w:val="left"/>
+      <w:pPr>
+        <w:ind w:left="1080" w:hanging="360"/>
+      </w:pPr>
+    </w:lvl>
+    <w:lvl w:ilvl="2" w:tplc="0409001B" w:tentative="1">
+      <w:start w:val="1"/>
+      <w:numFmt w:val="lowerRoman"/>
+      <w:lvlText w:val="%3."/>
+      <w:lvlJc w:val="right"/>
+      <w:pPr>
+        <w:ind w:left="1800" w:hanging="180"/>
+      </w:pPr>
+    </w:lvl>
+    <w:lvl w:ilvl="3" w:tplc="0409000F" w:tentative="1">
+      <w:start w:val="1"/>
+      <w:numFmt w:val="decimal"/>
+      <w:lvlText w:val="%4."/>
+      <w:lvlJc w:val="left"/>
+      <w:pPr>
+        <w:ind w:left="2520" w:hanging="360"/>
+      </w:pPr>
+    </w:lvl>
+    <w:lvl w:ilvl="4" w:tplc="04090019" w:tentative="1">
+      <w:start w:val="1"/>
+      <w:numFmt w:val="lowerLetter"/>
+      <w:lvlText w:val="%5."/>
+      <w:lvlJc w:val="left"/>
+      <w:pPr>
+        <w:ind w:left="3240" w:hanging="360"/>
+      </w:pPr>
+    </w:lvl>
+    <w:lvl w:ilvl="5" w:tplc="0409001B" w:tentative="1">
+      <w:start w:val="1"/>
+      <w:numFmt w:val="lowerRoman"/>
+      <w:lvlText w:val="%6."/>
+      <w:lvlJc w:val="right"/>
+      <w:pPr>
+        <w:ind w:left="3960" w:hanging="180"/>
+      </w:pPr>
+    </w:lvl>
+    <w:lvl w:ilvl="6" w:tplc="0409000F" w:tentative="1">
+      <w:start w:val="1"/>
+      <w:numFmt w:val="decimal"/>
+      <w:lvlText w:val="%7."/>
+      <w:lvlJc w:val="left"/>
+      <w:pPr>
+        <w:ind w:left="4680" w:hanging="360"/>
+      </w:pPr>
+    </w:lvl>
+    <w:lvl w:ilvl="7" w:tplc="04090019" w:tentative="1">
+      <w:start w:val="1"/>
+      <w:numFmt w:val="lowerLetter"/>
+      <w:lvlText w:val="%8."/>
+      <w:lvlJc w:val="left"/>
+      <w:pPr>
+        <w:ind w:left="5400" w:hanging="360"/>
+      </w:pPr>
+    </w:lvl>
+    <w:lvl w:ilvl="8" w:tplc="0409001B" w:tentative="1">
+      <w:start w:val="1"/>
+      <w:numFmt w:val="lowerRoman"/>
+      <w:lvlText w:val="%9."/>
+      <w:lvlJc w:val="right"/>
+      <w:pPr>
+        <w:ind w:left="6120" w:hanging="180"/>
+      </w:pPr>
+    </w:lvl>
+  </w:abstractNum>
+  <w:abstractNum w:abstractNumId="37" w15:restartNumberingAfterBreak="0">
     <w:nsid w:val="648D3FC4"/>
     <w:multiLevelType w:val="hybridMultilevel"/>
     <w:tmpl w:val="000C175C"/>
@@ -35194,7 +34835,7 @@
       </w:rPr>
     </w:lvl>
   </w:abstractNum>
-  <w:abstractNum w:abstractNumId="37" w15:restartNumberingAfterBreak="0">
+  <w:abstractNum w:abstractNumId="38" w15:restartNumberingAfterBreak="0">
     <w:nsid w:val="6A86646E"/>
     <w:multiLevelType w:val="hybridMultilevel"/>
     <w:tmpl w:val="287A4192"/>
@@ -35307,7 +34948,7 @@
       </w:rPr>
     </w:lvl>
   </w:abstractNum>
-  <w:abstractNum w:abstractNumId="38" w15:restartNumberingAfterBreak="0">
+  <w:abstractNum w:abstractNumId="39" w15:restartNumberingAfterBreak="0">
     <w:nsid w:val="6D12089D"/>
     <w:multiLevelType w:val="hybridMultilevel"/>
     <w:tmpl w:val="6E62FD3E"/>
@@ -35420,7 +35061,7 @@
       </w:rPr>
     </w:lvl>
   </w:abstractNum>
-  <w:abstractNum w:abstractNumId="39" w15:restartNumberingAfterBreak="0">
+  <w:abstractNum w:abstractNumId="40" w15:restartNumberingAfterBreak="0">
     <w:nsid w:val="707048E6"/>
     <w:multiLevelType w:val="hybridMultilevel"/>
     <w:tmpl w:val="447480C8"/>
@@ -35533,7 +35174,7 @@
       </w:rPr>
     </w:lvl>
   </w:abstractNum>
-  <w:abstractNum w:abstractNumId="40" w15:restartNumberingAfterBreak="0">
+  <w:abstractNum w:abstractNumId="41" w15:restartNumberingAfterBreak="0">
     <w:nsid w:val="72D82201"/>
     <w:multiLevelType w:val="hybridMultilevel"/>
     <w:tmpl w:val="0936C8A6"/>
@@ -35646,7 +35287,7 @@
       </w:rPr>
     </w:lvl>
   </w:abstractNum>
-  <w:abstractNum w:abstractNumId="41" w15:restartNumberingAfterBreak="0">
+  <w:abstractNum w:abstractNumId="42" w15:restartNumberingAfterBreak="0">
     <w:nsid w:val="76600DB1"/>
     <w:multiLevelType w:val="hybridMultilevel"/>
     <w:tmpl w:val="7BE6B49A"/>
@@ -35759,7 +35400,7 @@
       </w:rPr>
     </w:lvl>
   </w:abstractNum>
-  <w:abstractNum w:abstractNumId="42" w15:restartNumberingAfterBreak="0">
+  <w:abstractNum w:abstractNumId="43" w15:restartNumberingAfterBreak="0">
     <w:nsid w:val="77E96B79"/>
     <w:multiLevelType w:val="hybridMultilevel"/>
     <w:tmpl w:val="A0F446D4"/>
@@ -35872,7 +35513,7 @@
       </w:rPr>
     </w:lvl>
   </w:abstractNum>
-  <w:abstractNum w:abstractNumId="43" w15:restartNumberingAfterBreak="0">
+  <w:abstractNum w:abstractNumId="44" w15:restartNumberingAfterBreak="0">
     <w:nsid w:val="7A7408F0"/>
     <w:multiLevelType w:val="hybridMultilevel"/>
     <w:tmpl w:val="949836F2"/>
@@ -36025,7 +35666,7 @@
     <w:abstractNumId w:val="11"/>
   </w:num>
   <w:num w:numId="14" w16cid:durableId="625089808">
-    <w:abstractNumId w:val="37"/>
+    <w:abstractNumId w:val="38"/>
   </w:num>
   <w:num w:numId="15" w16cid:durableId="1763721463">
     <w:abstractNumId w:val="3"/>
@@ -36034,25 +35675,25 @@
     <w:abstractNumId w:val="26"/>
   </w:num>
   <w:num w:numId="17" w16cid:durableId="389887795">
-    <w:abstractNumId w:val="36"/>
+    <w:abstractNumId w:val="37"/>
   </w:num>
   <w:num w:numId="18" w16cid:durableId="286745057">
     <w:abstractNumId w:val="21"/>
   </w:num>
   <w:num w:numId="19" w16cid:durableId="1081101736">
-    <w:abstractNumId w:val="42"/>
+    <w:abstractNumId w:val="43"/>
   </w:num>
   <w:num w:numId="20" w16cid:durableId="1501313775">
-    <w:abstractNumId w:val="39"/>
+    <w:abstractNumId w:val="40"/>
   </w:num>
   <w:num w:numId="21" w16cid:durableId="389112533">
-    <w:abstractNumId w:val="43"/>
+    <w:abstractNumId w:val="44"/>
   </w:num>
   <w:num w:numId="22" w16cid:durableId="1555581882">
     <w:abstractNumId w:val="6"/>
   </w:num>
   <w:num w:numId="23" w16cid:durableId="460541115">
-    <w:abstractNumId w:val="38"/>
+    <w:abstractNumId w:val="39"/>
   </w:num>
   <w:num w:numId="24" w16cid:durableId="1397707071">
     <w:abstractNumId w:val="4"/>
@@ -36079,13 +35720,13 @@
     <w:abstractNumId w:val="25"/>
   </w:num>
   <w:num w:numId="32" w16cid:durableId="58283822">
-    <w:abstractNumId w:val="41"/>
+    <w:abstractNumId w:val="42"/>
   </w:num>
   <w:num w:numId="33" w16cid:durableId="190995657">
     <w:abstractNumId w:val="31"/>
   </w:num>
   <w:num w:numId="34" w16cid:durableId="1177185780">
-    <w:abstractNumId w:val="40"/>
+    <w:abstractNumId w:val="41"/>
   </w:num>
   <w:num w:numId="35" w16cid:durableId="1134298176">
     <w:abstractNumId w:val="19"/>
@@ -36119,6 +35760,9 @@
   </w:num>
   <w:num w:numId="45" w16cid:durableId="1995837314">
     <w:abstractNumId w:val="15"/>
+  </w:num>
+  <w:num w:numId="46" w16cid:durableId="1211916410">
+    <w:abstractNumId w:val="36"/>
   </w:num>
 </w:numbering>
 </file>
@@ -36600,6 +36244,7 @@
   <w:style w:type="character" w:default="1" w:styleId="DefaultParagraphFont">
     <w:name w:val="Default Paragraph Font"/>
     <w:uiPriority w:val="1"/>
+    <w:semiHidden/>
     <w:unhideWhenUsed/>
   </w:style>
   <w:style w:type="table" w:default="1" w:styleId="TableNormal">

</xml_diff>

<commit_message>
minor refinements and polishing
</commit_message>
<xml_diff>
--- a/Machine_Learning_for_Fraud_Detection_in_Online_Financial_Transactions.docx
+++ b/Machine_Learning_for_Fraud_Detection_in_Online_Financial_Transactions.docx
@@ -1039,21 +1039,7 @@
         <w:rPr>
           <w:lang w:val="en-US"/>
         </w:rPr>
-        <w:t xml:space="preserve">Firstly, I would like to express my sincere gratitude to Mr. Athanasios Argyriou, my thesis supervisor, for his guidance, constructive feedback, and continuous support throughout this work. His assistance not only improved the quality of this </w:t>
-      </w:r>
-      <w:proofErr w:type="gramStart"/>
-      <w:r>
-        <w:rPr>
-          <w:lang w:val="en-US"/>
-        </w:rPr>
-        <w:t>thesis, but</w:t>
-      </w:r>
-      <w:proofErr w:type="gramEnd"/>
-      <w:r>
-        <w:rPr>
-          <w:lang w:val="en-US"/>
-        </w:rPr>
-        <w:t xml:space="preserve"> also helped me gain valuable knowledge and practical experience in machine learning and data analysis, as well as in developing robust research-driven pipelines.</w:t>
+        <w:t>Firstly, I would like to express my sincere gratitude to Mr. Athanasios Argyriou, my thesis supervisor, for his guidance, constructive feedback, and continuous support throughout this work. His assistance not only improved the quality of this thesis, but also helped me gain valuable knowledge and practical experience in machine learning and data analysis, as well as in developing robust research-driven pipelines.</w:t>
       </w:r>
     </w:p>
     <w:p>
@@ -1174,7 +1160,7 @@
           <w:r>
             <w:fldChar w:fldCharType="separate"/>
           </w:r>
-          <w:hyperlink w:anchor="_Toc222255040" w:history="1">
+          <w:hyperlink w:anchor="_Toc222327463" w:history="1">
             <w:r>
               <w:rPr>
                 <w:rStyle w:val="Hyperlink"/>
@@ -1202,7 +1188,7 @@
                 <w:noProof/>
                 <w:webHidden/>
               </w:rPr>
-              <w:instrText xml:space="preserve"> PAGEREF _Toc222255040 \h </w:instrText>
+              <w:instrText xml:space="preserve"> PAGEREF _Toc222327463 \h </w:instrText>
             </w:r>
             <w:r>
               <w:rPr>
@@ -1247,7 +1233,7 @@
               <w14:ligatures w14:val="standardContextual"/>
             </w:rPr>
           </w:pPr>
-          <w:hyperlink w:anchor="_Toc222255041" w:history="1">
+          <w:hyperlink w:anchor="_Toc222327464" w:history="1">
             <w:r>
               <w:rPr>
                 <w:rStyle w:val="Hyperlink"/>
@@ -1275,7 +1261,7 @@
                 <w:noProof/>
                 <w:webHidden/>
               </w:rPr>
-              <w:instrText xml:space="preserve"> PAGEREF _Toc222255041 \h </w:instrText>
+              <w:instrText xml:space="preserve"> PAGEREF _Toc222327464 \h </w:instrText>
             </w:r>
             <w:r>
               <w:rPr>
@@ -1320,7 +1306,7 @@
               <w14:ligatures w14:val="standardContextual"/>
             </w:rPr>
           </w:pPr>
-          <w:hyperlink w:anchor="_Toc222255042" w:history="1">
+          <w:hyperlink w:anchor="_Toc222327465" w:history="1">
             <w:r>
               <w:rPr>
                 <w:rStyle w:val="Hyperlink"/>
@@ -1348,7 +1334,7 @@
                 <w:noProof/>
                 <w:webHidden/>
               </w:rPr>
-              <w:instrText xml:space="preserve"> PAGEREF _Toc222255042 \h </w:instrText>
+              <w:instrText xml:space="preserve"> PAGEREF _Toc222327465 \h </w:instrText>
             </w:r>
             <w:r>
               <w:rPr>
@@ -1393,7 +1379,7 @@
               <w14:ligatures w14:val="standardContextual"/>
             </w:rPr>
           </w:pPr>
-          <w:hyperlink w:anchor="_Toc222255043" w:history="1">
+          <w:hyperlink w:anchor="_Toc222327466" w:history="1">
             <w:r>
               <w:rPr>
                 <w:rStyle w:val="Hyperlink"/>
@@ -1421,7 +1407,7 @@
                 <w:noProof/>
                 <w:webHidden/>
               </w:rPr>
-              <w:instrText xml:space="preserve"> PAGEREF _Toc222255043 \h </w:instrText>
+              <w:instrText xml:space="preserve"> PAGEREF _Toc222327466 \h </w:instrText>
             </w:r>
             <w:r>
               <w:rPr>
@@ -1466,7 +1452,7 @@
               <w14:ligatures w14:val="standardContextual"/>
             </w:rPr>
           </w:pPr>
-          <w:hyperlink w:anchor="_Toc222255044" w:history="1">
+          <w:hyperlink w:anchor="_Toc222327467" w:history="1">
             <w:r>
               <w:rPr>
                 <w:rStyle w:val="Hyperlink"/>
@@ -1493,7 +1479,7 @@
                 <w:noProof/>
                 <w:webHidden/>
               </w:rPr>
-              <w:instrText xml:space="preserve"> PAGEREF _Toc222255044 \h </w:instrText>
+              <w:instrText xml:space="preserve"> PAGEREF _Toc222327467 \h </w:instrText>
             </w:r>
             <w:r>
               <w:rPr>
@@ -1538,7 +1524,7 @@
               <w14:ligatures w14:val="standardContextual"/>
             </w:rPr>
           </w:pPr>
-          <w:hyperlink w:anchor="_Toc222255045" w:history="1">
+          <w:hyperlink w:anchor="_Toc222327468" w:history="1">
             <w:r>
               <w:rPr>
                 <w:rStyle w:val="Hyperlink"/>
@@ -1565,7 +1551,7 @@
                 <w:noProof/>
                 <w:webHidden/>
               </w:rPr>
-              <w:instrText xml:space="preserve"> PAGEREF _Toc222255045 \h </w:instrText>
+              <w:instrText xml:space="preserve"> PAGEREF _Toc222327468 \h </w:instrText>
             </w:r>
             <w:r>
               <w:rPr>
@@ -1610,7 +1596,7 @@
               <w14:ligatures w14:val="standardContextual"/>
             </w:rPr>
           </w:pPr>
-          <w:hyperlink w:anchor="_Toc222255046" w:history="1">
+          <w:hyperlink w:anchor="_Toc222327469" w:history="1">
             <w:r>
               <w:rPr>
                 <w:rStyle w:val="Hyperlink"/>
@@ -1638,7 +1624,7 @@
                 <w:noProof/>
                 <w:webHidden/>
               </w:rPr>
-              <w:instrText xml:space="preserve"> PAGEREF _Toc222255046 \h </w:instrText>
+              <w:instrText xml:space="preserve"> PAGEREF _Toc222327469 \h </w:instrText>
             </w:r>
             <w:r>
               <w:rPr>
@@ -1683,7 +1669,7 @@
               <w14:ligatures w14:val="standardContextual"/>
             </w:rPr>
           </w:pPr>
-          <w:hyperlink w:anchor="_Toc222255047" w:history="1">
+          <w:hyperlink w:anchor="_Toc222327470" w:history="1">
             <w:r>
               <w:rPr>
                 <w:rStyle w:val="Hyperlink"/>
@@ -1711,7 +1697,7 @@
                 <w:noProof/>
                 <w:webHidden/>
               </w:rPr>
-              <w:instrText xml:space="preserve"> PAGEREF _Toc222255047 \h </w:instrText>
+              <w:instrText xml:space="preserve"> PAGEREF _Toc222327470 \h </w:instrText>
             </w:r>
             <w:r>
               <w:rPr>
@@ -1756,7 +1742,7 @@
               <w14:ligatures w14:val="standardContextual"/>
             </w:rPr>
           </w:pPr>
-          <w:hyperlink w:anchor="_Toc222255048" w:history="1">
+          <w:hyperlink w:anchor="_Toc222327471" w:history="1">
             <w:r>
               <w:rPr>
                 <w:rStyle w:val="Hyperlink"/>
@@ -1784,7 +1770,7 @@
                 <w:noProof/>
                 <w:webHidden/>
               </w:rPr>
-              <w:instrText xml:space="preserve"> PAGEREF _Toc222255048 \h </w:instrText>
+              <w:instrText xml:space="preserve"> PAGEREF _Toc222327471 \h </w:instrText>
             </w:r>
             <w:r>
               <w:rPr>
@@ -1829,7 +1815,7 @@
               <w14:ligatures w14:val="standardContextual"/>
             </w:rPr>
           </w:pPr>
-          <w:hyperlink w:anchor="_Toc222255049" w:history="1">
+          <w:hyperlink w:anchor="_Toc222327472" w:history="1">
             <w:r>
               <w:rPr>
                 <w:rStyle w:val="Hyperlink"/>
@@ -1857,7 +1843,7 @@
                 <w:noProof/>
                 <w:webHidden/>
               </w:rPr>
-              <w:instrText xml:space="preserve"> PAGEREF _Toc222255049 \h </w:instrText>
+              <w:instrText xml:space="preserve"> PAGEREF _Toc222327472 \h </w:instrText>
             </w:r>
             <w:r>
               <w:rPr>
@@ -1902,14 +1888,14 @@
               <w14:ligatures w14:val="standardContextual"/>
             </w:rPr>
           </w:pPr>
-          <w:hyperlink w:anchor="_Toc222255050" w:history="1">
+          <w:hyperlink w:anchor="_Toc222327473" w:history="1">
             <w:r>
               <w:rPr>
                 <w:rStyle w:val="Hyperlink"/>
                 <w:noProof/>
                 <w:lang w:val="en-US"/>
               </w:rPr>
-              <w:t>2.2.6. Comparison of Approaches</w:t>
+              <w:t>2.2.5. Comparison of Approaches</w:t>
             </w:r>
             <w:r>
               <w:rPr>
@@ -1930,7 +1916,7 @@
                 <w:noProof/>
                 <w:webHidden/>
               </w:rPr>
-              <w:instrText xml:space="preserve"> PAGEREF _Toc222255050 \h </w:instrText>
+              <w:instrText xml:space="preserve"> PAGEREF _Toc222327473 \h </w:instrText>
             </w:r>
             <w:r>
               <w:rPr>
@@ -1975,7 +1961,7 @@
               <w14:ligatures w14:val="standardContextual"/>
             </w:rPr>
           </w:pPr>
-          <w:hyperlink w:anchor="_Toc222255051" w:history="1">
+          <w:hyperlink w:anchor="_Toc222327474" w:history="1">
             <w:r>
               <w:rPr>
                 <w:rStyle w:val="Hyperlink"/>
@@ -2002,7 +1988,7 @@
                 <w:noProof/>
                 <w:webHidden/>
               </w:rPr>
-              <w:instrText xml:space="preserve"> PAGEREF _Toc222255051 \h </w:instrText>
+              <w:instrText xml:space="preserve"> PAGEREF _Toc222327474 \h </w:instrText>
             </w:r>
             <w:r>
               <w:rPr>
@@ -2047,7 +2033,7 @@
               <w14:ligatures w14:val="standardContextual"/>
             </w:rPr>
           </w:pPr>
-          <w:hyperlink w:anchor="_Toc222255052" w:history="1">
+          <w:hyperlink w:anchor="_Toc222327475" w:history="1">
             <w:r>
               <w:rPr>
                 <w:rStyle w:val="Hyperlink"/>
@@ -2074,7 +2060,7 @@
                 <w:noProof/>
                 <w:webHidden/>
               </w:rPr>
-              <w:instrText xml:space="preserve"> PAGEREF _Toc222255052 \h </w:instrText>
+              <w:instrText xml:space="preserve"> PAGEREF _Toc222327475 \h </w:instrText>
             </w:r>
             <w:r>
               <w:rPr>
@@ -2119,7 +2105,7 @@
               <w14:ligatures w14:val="standardContextual"/>
             </w:rPr>
           </w:pPr>
-          <w:hyperlink w:anchor="_Toc222255053" w:history="1">
+          <w:hyperlink w:anchor="_Toc222327476" w:history="1">
             <w:r>
               <w:rPr>
                 <w:rStyle w:val="Hyperlink"/>
@@ -2146,7 +2132,7 @@
                 <w:noProof/>
                 <w:webHidden/>
               </w:rPr>
-              <w:instrText xml:space="preserve"> PAGEREF _Toc222255053 \h </w:instrText>
+              <w:instrText xml:space="preserve"> PAGEREF _Toc222327476 \h </w:instrText>
             </w:r>
             <w:r>
               <w:rPr>
@@ -2191,7 +2177,7 @@
               <w14:ligatures w14:val="standardContextual"/>
             </w:rPr>
           </w:pPr>
-          <w:hyperlink w:anchor="_Toc222255054" w:history="1">
+          <w:hyperlink w:anchor="_Toc222327477" w:history="1">
             <w:r>
               <w:rPr>
                 <w:rStyle w:val="Hyperlink"/>
@@ -2218,7 +2204,7 @@
                 <w:noProof/>
                 <w:webHidden/>
               </w:rPr>
-              <w:instrText xml:space="preserve"> PAGEREF _Toc222255054 \h </w:instrText>
+              <w:instrText xml:space="preserve"> PAGEREF _Toc222327477 \h </w:instrText>
             </w:r>
             <w:r>
               <w:rPr>
@@ -2263,7 +2249,7 @@
               <w14:ligatures w14:val="standardContextual"/>
             </w:rPr>
           </w:pPr>
-          <w:hyperlink w:anchor="_Toc222255055" w:history="1">
+          <w:hyperlink w:anchor="_Toc222327478" w:history="1">
             <w:r>
               <w:rPr>
                 <w:rStyle w:val="Hyperlink"/>
@@ -2290,7 +2276,7 @@
                 <w:noProof/>
                 <w:webHidden/>
               </w:rPr>
-              <w:instrText xml:space="preserve"> PAGEREF _Toc222255055 \h </w:instrText>
+              <w:instrText xml:space="preserve"> PAGEREF _Toc222327478 \h </w:instrText>
             </w:r>
             <w:r>
               <w:rPr>
@@ -2335,7 +2321,7 @@
               <w14:ligatures w14:val="standardContextual"/>
             </w:rPr>
           </w:pPr>
-          <w:hyperlink w:anchor="_Toc222255056" w:history="1">
+          <w:hyperlink w:anchor="_Toc222327479" w:history="1">
             <w:r>
               <w:rPr>
                 <w:rStyle w:val="Hyperlink"/>
@@ -2363,7 +2349,7 @@
                 <w:noProof/>
                 <w:webHidden/>
               </w:rPr>
-              <w:instrText xml:space="preserve"> PAGEREF _Toc222255056 \h </w:instrText>
+              <w:instrText xml:space="preserve"> PAGEREF _Toc222327479 \h </w:instrText>
             </w:r>
             <w:r>
               <w:rPr>
@@ -2408,7 +2394,7 @@
               <w14:ligatures w14:val="standardContextual"/>
             </w:rPr>
           </w:pPr>
-          <w:hyperlink w:anchor="_Toc222255057" w:history="1">
+          <w:hyperlink w:anchor="_Toc222327480" w:history="1">
             <w:r>
               <w:rPr>
                 <w:rStyle w:val="Hyperlink"/>
@@ -2436,7 +2422,7 @@
                 <w:noProof/>
                 <w:webHidden/>
               </w:rPr>
-              <w:instrText xml:space="preserve"> PAGEREF _Toc222255057 \h </w:instrText>
+              <w:instrText xml:space="preserve"> PAGEREF _Toc222327480 \h </w:instrText>
             </w:r>
             <w:r>
               <w:rPr>
@@ -2481,7 +2467,7 @@
               <w14:ligatures w14:val="standardContextual"/>
             </w:rPr>
           </w:pPr>
-          <w:hyperlink w:anchor="_Toc222255058" w:history="1">
+          <w:hyperlink w:anchor="_Toc222327481" w:history="1">
             <w:r>
               <w:rPr>
                 <w:rStyle w:val="Hyperlink"/>
@@ -2509,7 +2495,7 @@
                 <w:noProof/>
                 <w:webHidden/>
               </w:rPr>
-              <w:instrText xml:space="preserve"> PAGEREF _Toc222255058 \h </w:instrText>
+              <w:instrText xml:space="preserve"> PAGEREF _Toc222327481 \h </w:instrText>
             </w:r>
             <w:r>
               <w:rPr>
@@ -2554,7 +2540,7 @@
               <w14:ligatures w14:val="standardContextual"/>
             </w:rPr>
           </w:pPr>
-          <w:hyperlink w:anchor="_Toc222255059" w:history="1">
+          <w:hyperlink w:anchor="_Toc222327482" w:history="1">
             <w:r>
               <w:rPr>
                 <w:rStyle w:val="Hyperlink"/>
@@ -2582,7 +2568,7 @@
                 <w:noProof/>
                 <w:webHidden/>
               </w:rPr>
-              <w:instrText xml:space="preserve"> PAGEREF _Toc222255059 \h </w:instrText>
+              <w:instrText xml:space="preserve"> PAGEREF _Toc222327482 \h </w:instrText>
             </w:r>
             <w:r>
               <w:rPr>
@@ -2627,7 +2613,7 @@
               <w14:ligatures w14:val="standardContextual"/>
             </w:rPr>
           </w:pPr>
-          <w:hyperlink w:anchor="_Toc222255060" w:history="1">
+          <w:hyperlink w:anchor="_Toc222327483" w:history="1">
             <w:r>
               <w:rPr>
                 <w:rStyle w:val="Hyperlink"/>
@@ -2655,7 +2641,7 @@
                 <w:noProof/>
                 <w:webHidden/>
               </w:rPr>
-              <w:instrText xml:space="preserve"> PAGEREF _Toc222255060 \h </w:instrText>
+              <w:instrText xml:space="preserve"> PAGEREF _Toc222327483 \h </w:instrText>
             </w:r>
             <w:r>
               <w:rPr>
@@ -2700,7 +2686,7 @@
               <w14:ligatures w14:val="standardContextual"/>
             </w:rPr>
           </w:pPr>
-          <w:hyperlink w:anchor="_Toc222255061" w:history="1">
+          <w:hyperlink w:anchor="_Toc222327484" w:history="1">
             <w:r>
               <w:rPr>
                 <w:rStyle w:val="Hyperlink"/>
@@ -2728,7 +2714,7 @@
                 <w:noProof/>
                 <w:webHidden/>
               </w:rPr>
-              <w:instrText xml:space="preserve"> PAGEREF _Toc222255061 \h </w:instrText>
+              <w:instrText xml:space="preserve"> PAGEREF _Toc222327484 \h </w:instrText>
             </w:r>
             <w:r>
               <w:rPr>
@@ -2773,7 +2759,7 @@
               <w14:ligatures w14:val="standardContextual"/>
             </w:rPr>
           </w:pPr>
-          <w:hyperlink w:anchor="_Toc222255062" w:history="1">
+          <w:hyperlink w:anchor="_Toc222327485" w:history="1">
             <w:r>
               <w:rPr>
                 <w:rStyle w:val="Hyperlink"/>
@@ -2801,7 +2787,7 @@
                 <w:noProof/>
                 <w:webHidden/>
               </w:rPr>
-              <w:instrText xml:space="preserve"> PAGEREF _Toc222255062 \h </w:instrText>
+              <w:instrText xml:space="preserve"> PAGEREF _Toc222327485 \h </w:instrText>
             </w:r>
             <w:r>
               <w:rPr>
@@ -2846,7 +2832,7 @@
               <w14:ligatures w14:val="standardContextual"/>
             </w:rPr>
           </w:pPr>
-          <w:hyperlink w:anchor="_Toc222255063" w:history="1">
+          <w:hyperlink w:anchor="_Toc222327486" w:history="1">
             <w:r>
               <w:rPr>
                 <w:rStyle w:val="Hyperlink"/>
@@ -2874,7 +2860,7 @@
                 <w:noProof/>
                 <w:webHidden/>
               </w:rPr>
-              <w:instrText xml:space="preserve"> PAGEREF _Toc222255063 \h </w:instrText>
+              <w:instrText xml:space="preserve"> PAGEREF _Toc222327486 \h </w:instrText>
             </w:r>
             <w:r>
               <w:rPr>
@@ -2919,7 +2905,7 @@
               <w14:ligatures w14:val="standardContextual"/>
             </w:rPr>
           </w:pPr>
-          <w:hyperlink w:anchor="_Toc222255064" w:history="1">
+          <w:hyperlink w:anchor="_Toc222327487" w:history="1">
             <w:r>
               <w:rPr>
                 <w:rStyle w:val="Hyperlink"/>
@@ -2947,7 +2933,7 @@
                 <w:noProof/>
                 <w:webHidden/>
               </w:rPr>
-              <w:instrText xml:space="preserve"> PAGEREF _Toc222255064 \h </w:instrText>
+              <w:instrText xml:space="preserve"> PAGEREF _Toc222327487 \h </w:instrText>
             </w:r>
             <w:r>
               <w:rPr>
@@ -2992,7 +2978,7 @@
               <w14:ligatures w14:val="standardContextual"/>
             </w:rPr>
           </w:pPr>
-          <w:hyperlink w:anchor="_Toc222255065" w:history="1">
+          <w:hyperlink w:anchor="_Toc222327488" w:history="1">
             <w:r>
               <w:rPr>
                 <w:rStyle w:val="Hyperlink"/>
@@ -3019,7 +3005,7 @@
                 <w:noProof/>
                 <w:webHidden/>
               </w:rPr>
-              <w:instrText xml:space="preserve"> PAGEREF _Toc222255065 \h </w:instrText>
+              <w:instrText xml:space="preserve"> PAGEREF _Toc222327488 \h </w:instrText>
             </w:r>
             <w:r>
               <w:rPr>
@@ -3064,7 +3050,7 @@
               <w14:ligatures w14:val="standardContextual"/>
             </w:rPr>
           </w:pPr>
-          <w:hyperlink w:anchor="_Toc222255066" w:history="1">
+          <w:hyperlink w:anchor="_Toc222327489" w:history="1">
             <w:r>
               <w:rPr>
                 <w:rStyle w:val="Hyperlink"/>
@@ -3092,7 +3078,7 @@
                 <w:noProof/>
                 <w:webHidden/>
               </w:rPr>
-              <w:instrText xml:space="preserve"> PAGEREF _Toc222255066 \h </w:instrText>
+              <w:instrText xml:space="preserve"> PAGEREF _Toc222327489 \h </w:instrText>
             </w:r>
             <w:r>
               <w:rPr>
@@ -3137,7 +3123,7 @@
               <w14:ligatures w14:val="standardContextual"/>
             </w:rPr>
           </w:pPr>
-          <w:hyperlink w:anchor="_Toc222255067" w:history="1">
+          <w:hyperlink w:anchor="_Toc222327490" w:history="1">
             <w:r>
               <w:rPr>
                 <w:rStyle w:val="Hyperlink"/>
@@ -3165,7 +3151,7 @@
                 <w:noProof/>
                 <w:webHidden/>
               </w:rPr>
-              <w:instrText xml:space="preserve"> PAGEREF _Toc222255067 \h </w:instrText>
+              <w:instrText xml:space="preserve"> PAGEREF _Toc222327490 \h </w:instrText>
             </w:r>
             <w:r>
               <w:rPr>
@@ -3210,7 +3196,7 @@
               <w14:ligatures w14:val="standardContextual"/>
             </w:rPr>
           </w:pPr>
-          <w:hyperlink w:anchor="_Toc222255068" w:history="1">
+          <w:hyperlink w:anchor="_Toc222327491" w:history="1">
             <w:r>
               <w:rPr>
                 <w:rStyle w:val="Hyperlink"/>
@@ -3237,7 +3223,7 @@
                 <w:noProof/>
                 <w:webHidden/>
               </w:rPr>
-              <w:instrText xml:space="preserve"> PAGEREF _Toc222255068 \h </w:instrText>
+              <w:instrText xml:space="preserve"> PAGEREF _Toc222327491 \h </w:instrText>
             </w:r>
             <w:r>
               <w:rPr>
@@ -3282,7 +3268,7 @@
               <w14:ligatures w14:val="standardContextual"/>
             </w:rPr>
           </w:pPr>
-          <w:hyperlink w:anchor="_Toc222255069" w:history="1">
+          <w:hyperlink w:anchor="_Toc222327492" w:history="1">
             <w:r>
               <w:rPr>
                 <w:rStyle w:val="Hyperlink"/>
@@ -3310,7 +3296,7 @@
                 <w:noProof/>
                 <w:webHidden/>
               </w:rPr>
-              <w:instrText xml:space="preserve"> PAGEREF _Toc222255069 \h </w:instrText>
+              <w:instrText xml:space="preserve"> PAGEREF _Toc222327492 \h </w:instrText>
             </w:r>
             <w:r>
               <w:rPr>
@@ -3355,7 +3341,7 @@
               <w14:ligatures w14:val="standardContextual"/>
             </w:rPr>
           </w:pPr>
-          <w:hyperlink w:anchor="_Toc222255070" w:history="1">
+          <w:hyperlink w:anchor="_Toc222327493" w:history="1">
             <w:r>
               <w:rPr>
                 <w:rStyle w:val="Hyperlink"/>
@@ -3390,7 +3376,7 @@
                 <w:noProof/>
                 <w:webHidden/>
               </w:rPr>
-              <w:instrText xml:space="preserve"> PAGEREF _Toc222255070 \h </w:instrText>
+              <w:instrText xml:space="preserve"> PAGEREF _Toc222327493 \h </w:instrText>
             </w:r>
             <w:r>
               <w:rPr>
@@ -3435,7 +3421,7 @@
               <w14:ligatures w14:val="standardContextual"/>
             </w:rPr>
           </w:pPr>
-          <w:hyperlink w:anchor="_Toc222255071" w:history="1">
+          <w:hyperlink w:anchor="_Toc222327494" w:history="1">
             <w:r>
               <w:rPr>
                 <w:rStyle w:val="Hyperlink"/>
@@ -3463,7 +3449,7 @@
                 <w:noProof/>
                 <w:webHidden/>
               </w:rPr>
-              <w:instrText xml:space="preserve"> PAGEREF _Toc222255071 \h </w:instrText>
+              <w:instrText xml:space="preserve"> PAGEREF _Toc222327494 \h </w:instrText>
             </w:r>
             <w:r>
               <w:rPr>
@@ -3508,7 +3494,7 @@
               <w14:ligatures w14:val="standardContextual"/>
             </w:rPr>
           </w:pPr>
-          <w:hyperlink w:anchor="_Toc222255072" w:history="1">
+          <w:hyperlink w:anchor="_Toc222327495" w:history="1">
             <w:r>
               <w:rPr>
                 <w:rStyle w:val="Hyperlink"/>
@@ -3536,7 +3522,7 @@
                 <w:noProof/>
                 <w:webHidden/>
               </w:rPr>
-              <w:instrText xml:space="preserve"> PAGEREF _Toc222255072 \h </w:instrText>
+              <w:instrText xml:space="preserve"> PAGEREF _Toc222327495 \h </w:instrText>
             </w:r>
             <w:r>
               <w:rPr>
@@ -3581,7 +3567,7 @@
               <w14:ligatures w14:val="standardContextual"/>
             </w:rPr>
           </w:pPr>
-          <w:hyperlink w:anchor="_Toc222255073" w:history="1">
+          <w:hyperlink w:anchor="_Toc222327496" w:history="1">
             <w:r>
               <w:rPr>
                 <w:rStyle w:val="Hyperlink"/>
@@ -3609,7 +3595,7 @@
                 <w:noProof/>
                 <w:webHidden/>
               </w:rPr>
-              <w:instrText xml:space="preserve"> PAGEREF _Toc222255073 \h </w:instrText>
+              <w:instrText xml:space="preserve"> PAGEREF _Toc222327496 \h </w:instrText>
             </w:r>
             <w:r>
               <w:rPr>
@@ -3654,7 +3640,7 @@
               <w14:ligatures w14:val="standardContextual"/>
             </w:rPr>
           </w:pPr>
-          <w:hyperlink w:anchor="_Toc222255074" w:history="1">
+          <w:hyperlink w:anchor="_Toc222327497" w:history="1">
             <w:r>
               <w:rPr>
                 <w:rStyle w:val="Hyperlink"/>
@@ -3682,7 +3668,7 @@
                 <w:noProof/>
                 <w:webHidden/>
               </w:rPr>
-              <w:instrText xml:space="preserve"> PAGEREF _Toc222255074 \h </w:instrText>
+              <w:instrText xml:space="preserve"> PAGEREF _Toc222327497 \h </w:instrText>
             </w:r>
             <w:r>
               <w:rPr>
@@ -3727,7 +3713,7 @@
               <w14:ligatures w14:val="standardContextual"/>
             </w:rPr>
           </w:pPr>
-          <w:hyperlink w:anchor="_Toc222255075" w:history="1">
+          <w:hyperlink w:anchor="_Toc222327498" w:history="1">
             <w:r>
               <w:rPr>
                 <w:rStyle w:val="Hyperlink"/>
@@ -3755,7 +3741,7 @@
                 <w:noProof/>
                 <w:webHidden/>
               </w:rPr>
-              <w:instrText xml:space="preserve"> PAGEREF _Toc222255075 \h </w:instrText>
+              <w:instrText xml:space="preserve"> PAGEREF _Toc222327498 \h </w:instrText>
             </w:r>
             <w:r>
               <w:rPr>
@@ -3800,7 +3786,7 @@
               <w14:ligatures w14:val="standardContextual"/>
             </w:rPr>
           </w:pPr>
-          <w:hyperlink w:anchor="_Toc222255076" w:history="1">
+          <w:hyperlink w:anchor="_Toc222327499" w:history="1">
             <w:r>
               <w:rPr>
                 <w:rStyle w:val="Hyperlink"/>
@@ -3828,7 +3814,7 @@
                 <w:noProof/>
                 <w:webHidden/>
               </w:rPr>
-              <w:instrText xml:space="preserve"> PAGEREF _Toc222255076 \h </w:instrText>
+              <w:instrText xml:space="preserve"> PAGEREF _Toc222327499 \h </w:instrText>
             </w:r>
             <w:r>
               <w:rPr>
@@ -3873,7 +3859,7 @@
               <w14:ligatures w14:val="standardContextual"/>
             </w:rPr>
           </w:pPr>
-          <w:hyperlink w:anchor="_Toc222255077" w:history="1">
+          <w:hyperlink w:anchor="_Toc222327500" w:history="1">
             <w:r>
               <w:rPr>
                 <w:rStyle w:val="Hyperlink"/>
@@ -3900,7 +3886,7 @@
                 <w:noProof/>
                 <w:webHidden/>
               </w:rPr>
-              <w:instrText xml:space="preserve"> PAGEREF _Toc222255077 \h </w:instrText>
+              <w:instrText xml:space="preserve"> PAGEREF _Toc222327500 \h </w:instrText>
             </w:r>
             <w:r>
               <w:rPr>
@@ -3945,7 +3931,7 @@
               <w14:ligatures w14:val="standardContextual"/>
             </w:rPr>
           </w:pPr>
-          <w:hyperlink w:anchor="_Toc222255078" w:history="1">
+          <w:hyperlink w:anchor="_Toc222327501" w:history="1">
             <w:r>
               <w:rPr>
                 <w:rStyle w:val="Hyperlink"/>
@@ -3973,7 +3959,7 @@
                 <w:noProof/>
                 <w:webHidden/>
               </w:rPr>
-              <w:instrText xml:space="preserve"> PAGEREF _Toc222255078 \h </w:instrText>
+              <w:instrText xml:space="preserve"> PAGEREF _Toc222327501 \h </w:instrText>
             </w:r>
             <w:r>
               <w:rPr>
@@ -4018,7 +4004,7 @@
               <w14:ligatures w14:val="standardContextual"/>
             </w:rPr>
           </w:pPr>
-          <w:hyperlink w:anchor="_Toc222255079" w:history="1">
+          <w:hyperlink w:anchor="_Toc222327502" w:history="1">
             <w:r>
               <w:rPr>
                 <w:rStyle w:val="Hyperlink"/>
@@ -4046,7 +4032,7 @@
                 <w:noProof/>
                 <w:webHidden/>
               </w:rPr>
-              <w:instrText xml:space="preserve"> PAGEREF _Toc222255079 \h </w:instrText>
+              <w:instrText xml:space="preserve"> PAGEREF _Toc222327502 \h </w:instrText>
             </w:r>
             <w:r>
               <w:rPr>
@@ -4091,7 +4077,7 @@
               <w14:ligatures w14:val="standardContextual"/>
             </w:rPr>
           </w:pPr>
-          <w:hyperlink w:anchor="_Toc222255080" w:history="1">
+          <w:hyperlink w:anchor="_Toc222327503" w:history="1">
             <w:r>
               <w:rPr>
                 <w:rStyle w:val="Hyperlink"/>
@@ -4119,7 +4105,7 @@
                 <w:noProof/>
                 <w:webHidden/>
               </w:rPr>
-              <w:instrText xml:space="preserve"> PAGEREF _Toc222255080 \h </w:instrText>
+              <w:instrText xml:space="preserve"> PAGEREF _Toc222327503 \h </w:instrText>
             </w:r>
             <w:r>
               <w:rPr>
@@ -4164,7 +4150,7 @@
               <w14:ligatures w14:val="standardContextual"/>
             </w:rPr>
           </w:pPr>
-          <w:hyperlink w:anchor="_Toc222255081" w:history="1">
+          <w:hyperlink w:anchor="_Toc222327504" w:history="1">
             <w:r>
               <w:rPr>
                 <w:rStyle w:val="Hyperlink"/>
@@ -4191,7 +4177,7 @@
                 <w:noProof/>
                 <w:webHidden/>
               </w:rPr>
-              <w:instrText xml:space="preserve"> PAGEREF _Toc222255081 \h </w:instrText>
+              <w:instrText xml:space="preserve"> PAGEREF _Toc222327504 \h </w:instrText>
             </w:r>
             <w:r>
               <w:rPr>
@@ -4236,7 +4222,7 @@
               <w14:ligatures w14:val="standardContextual"/>
             </w:rPr>
           </w:pPr>
-          <w:hyperlink w:anchor="_Toc222255082" w:history="1">
+          <w:hyperlink w:anchor="_Toc222327505" w:history="1">
             <w:r>
               <w:rPr>
                 <w:rStyle w:val="Hyperlink"/>
@@ -4263,7 +4249,7 @@
                 <w:noProof/>
                 <w:webHidden/>
               </w:rPr>
-              <w:instrText xml:space="preserve"> PAGEREF _Toc222255082 \h </w:instrText>
+              <w:instrText xml:space="preserve"> PAGEREF _Toc222327505 \h </w:instrText>
             </w:r>
             <w:r>
               <w:rPr>
@@ -4308,7 +4294,7 @@
               <w14:ligatures w14:val="standardContextual"/>
             </w:rPr>
           </w:pPr>
-          <w:hyperlink w:anchor="_Toc222255083" w:history="1">
+          <w:hyperlink w:anchor="_Toc222327506" w:history="1">
             <w:r>
               <w:rPr>
                 <w:rStyle w:val="Hyperlink"/>
@@ -4335,7 +4321,7 @@
                 <w:noProof/>
                 <w:webHidden/>
               </w:rPr>
-              <w:instrText xml:space="preserve"> PAGEREF _Toc222255083 \h </w:instrText>
+              <w:instrText xml:space="preserve"> PAGEREF _Toc222327506 \h </w:instrText>
             </w:r>
             <w:r>
               <w:rPr>
@@ -4380,7 +4366,7 @@
               <w14:ligatures w14:val="standardContextual"/>
             </w:rPr>
           </w:pPr>
-          <w:hyperlink w:anchor="_Toc222255084" w:history="1">
+          <w:hyperlink w:anchor="_Toc222327507" w:history="1">
             <w:r>
               <w:rPr>
                 <w:rStyle w:val="Hyperlink"/>
@@ -4407,7 +4393,7 @@
                 <w:noProof/>
                 <w:webHidden/>
               </w:rPr>
-              <w:instrText xml:space="preserve"> PAGEREF _Toc222255084 \h </w:instrText>
+              <w:instrText xml:space="preserve"> PAGEREF _Toc222327507 \h </w:instrText>
             </w:r>
             <w:r>
               <w:rPr>
@@ -4452,7 +4438,7 @@
               <w14:ligatures w14:val="standardContextual"/>
             </w:rPr>
           </w:pPr>
-          <w:hyperlink w:anchor="_Toc222255085" w:history="1">
+          <w:hyperlink w:anchor="_Toc222327508" w:history="1">
             <w:r>
               <w:rPr>
                 <w:rStyle w:val="Hyperlink"/>
@@ -4479,7 +4465,7 @@
                 <w:noProof/>
                 <w:webHidden/>
               </w:rPr>
-              <w:instrText xml:space="preserve"> PAGEREF _Toc222255085 \h </w:instrText>
+              <w:instrText xml:space="preserve"> PAGEREF _Toc222327508 \h </w:instrText>
             </w:r>
             <w:r>
               <w:rPr>
@@ -4499,7 +4485,7 @@
                 <w:noProof/>
                 <w:webHidden/>
               </w:rPr>
-              <w:t>55</w:t>
+              <w:t>56</w:t>
             </w:r>
             <w:r>
               <w:rPr>
@@ -4524,7 +4510,7 @@
               <w14:ligatures w14:val="standardContextual"/>
             </w:rPr>
           </w:pPr>
-          <w:hyperlink w:anchor="_Toc222255086" w:history="1">
+          <w:hyperlink w:anchor="_Toc222327509" w:history="1">
             <w:r>
               <w:rPr>
                 <w:rStyle w:val="Hyperlink"/>
@@ -4552,7 +4538,7 @@
                 <w:noProof/>
                 <w:webHidden/>
               </w:rPr>
-              <w:instrText xml:space="preserve"> PAGEREF _Toc222255086 \h </w:instrText>
+              <w:instrText xml:space="preserve"> PAGEREF _Toc222327509 \h </w:instrText>
             </w:r>
             <w:r>
               <w:rPr>
@@ -4572,7 +4558,7 @@
                 <w:noProof/>
                 <w:webHidden/>
               </w:rPr>
-              <w:t>56</w:t>
+              <w:t>57</w:t>
             </w:r>
             <w:r>
               <w:rPr>
@@ -4597,7 +4583,7 @@
               <w14:ligatures w14:val="standardContextual"/>
             </w:rPr>
           </w:pPr>
-          <w:hyperlink w:anchor="_Toc222255087" w:history="1">
+          <w:hyperlink w:anchor="_Toc222327510" w:history="1">
             <w:r>
               <w:rPr>
                 <w:rStyle w:val="Hyperlink"/>
@@ -4624,7 +4610,7 @@
                 <w:noProof/>
                 <w:webHidden/>
               </w:rPr>
-              <w:instrText xml:space="preserve"> PAGEREF _Toc222255087 \h </w:instrText>
+              <w:instrText xml:space="preserve"> PAGEREF _Toc222327510 \h </w:instrText>
             </w:r>
             <w:r>
               <w:rPr>
@@ -4644,7 +4630,7 @@
                 <w:noProof/>
                 <w:webHidden/>
               </w:rPr>
-              <w:t>56</w:t>
+              <w:t>57</w:t>
             </w:r>
             <w:r>
               <w:rPr>
@@ -4669,7 +4655,7 @@
               <w14:ligatures w14:val="standardContextual"/>
             </w:rPr>
           </w:pPr>
-          <w:hyperlink w:anchor="_Toc222255088" w:history="1">
+          <w:hyperlink w:anchor="_Toc222327511" w:history="1">
             <w:r>
               <w:rPr>
                 <w:rStyle w:val="Hyperlink"/>
@@ -4696,7 +4682,7 @@
                 <w:noProof/>
                 <w:webHidden/>
               </w:rPr>
-              <w:instrText xml:space="preserve"> PAGEREF _Toc222255088 \h </w:instrText>
+              <w:instrText xml:space="preserve"> PAGEREF _Toc222327511 \h </w:instrText>
             </w:r>
             <w:r>
               <w:rPr>
@@ -4716,7 +4702,7 @@
                 <w:noProof/>
                 <w:webHidden/>
               </w:rPr>
-              <w:t>56</w:t>
+              <w:t>57</w:t>
             </w:r>
             <w:r>
               <w:rPr>
@@ -4741,7 +4727,7 @@
               <w14:ligatures w14:val="standardContextual"/>
             </w:rPr>
           </w:pPr>
-          <w:hyperlink w:anchor="_Toc222255089" w:history="1">
+          <w:hyperlink w:anchor="_Toc222327512" w:history="1">
             <w:r>
               <w:rPr>
                 <w:rStyle w:val="Hyperlink"/>
@@ -4769,7 +4755,7 @@
                 <w:noProof/>
                 <w:webHidden/>
               </w:rPr>
-              <w:instrText xml:space="preserve"> PAGEREF _Toc222255089 \h </w:instrText>
+              <w:instrText xml:space="preserve"> PAGEREF _Toc222327512 \h </w:instrText>
             </w:r>
             <w:r>
               <w:rPr>
@@ -4789,7 +4775,7 @@
                 <w:noProof/>
                 <w:webHidden/>
               </w:rPr>
-              <w:t>57</w:t>
+              <w:t>58</w:t>
             </w:r>
             <w:r>
               <w:rPr>
@@ -4814,7 +4800,7 @@
               <w14:ligatures w14:val="standardContextual"/>
             </w:rPr>
           </w:pPr>
-          <w:hyperlink w:anchor="_Toc222255090" w:history="1">
+          <w:hyperlink w:anchor="_Toc222327513" w:history="1">
             <w:r>
               <w:rPr>
                 <w:rStyle w:val="Hyperlink"/>
@@ -4842,7 +4828,7 @@
                 <w:noProof/>
                 <w:webHidden/>
               </w:rPr>
-              <w:instrText xml:space="preserve"> PAGEREF _Toc222255090 \h </w:instrText>
+              <w:instrText xml:space="preserve"> PAGEREF _Toc222327513 \h </w:instrText>
             </w:r>
             <w:r>
               <w:rPr>
@@ -4862,7 +4848,7 @@
                 <w:noProof/>
                 <w:webHidden/>
               </w:rPr>
-              <w:t>58</w:t>
+              <w:t>59</w:t>
             </w:r>
             <w:r>
               <w:rPr>
@@ -7765,7 +7751,7 @@
           <w:lang w:val="en-US"/>
         </w:rPr>
       </w:pPr>
-      <w:bookmarkStart w:id="3" w:name="_Toc222255040"/>
+      <w:bookmarkStart w:id="3" w:name="_Toc222327463"/>
       <w:r>
         <w:rPr>
           <w:noProof/>
@@ -7967,7 +7953,7 @@
           <w:lang w:val="el-GR"/>
         </w:rPr>
       </w:pPr>
-      <w:bookmarkStart w:id="4" w:name="_Toc222255041"/>
+      <w:bookmarkStart w:id="4" w:name="_Toc222327464"/>
       <w:r>
         <w:rPr>
           <w:noProof/>
@@ -8167,7 +8153,7 @@
           <w:lang w:val="en-US"/>
         </w:rPr>
       </w:pPr>
-      <w:bookmarkStart w:id="5" w:name="_Toc222255042"/>
+      <w:bookmarkStart w:id="5" w:name="_Toc222327465"/>
       <w:r>
         <w:rPr>
           <w:noProof/>
@@ -8437,7 +8423,7 @@
         </w:rPr>
       </w:pPr>
       <w:bookmarkStart w:id="6" w:name="_Hlk219926088"/>
-      <w:bookmarkStart w:id="7" w:name="_Toc222255043"/>
+      <w:bookmarkStart w:id="7" w:name="_Toc222327466"/>
       <w:r>
         <w:rPr>
           <w:lang w:val="en-US"/>
@@ -8458,7 +8444,7 @@
         <w:pStyle w:val="Subheading"/>
       </w:pPr>
       <w:bookmarkStart w:id="8" w:name="introduction-and-overview-of-the-domain"/>
-      <w:bookmarkStart w:id="9" w:name="_Toc222255044"/>
+      <w:bookmarkStart w:id="9" w:name="_Toc222327467"/>
       <w:r>
         <w:t>2.1. Introduction and Overview of the Domain</w:t>
       </w:r>
@@ -8569,7 +8555,7 @@
         <w:pStyle w:val="Subheading"/>
       </w:pPr>
       <w:bookmarkStart w:id="10" w:name="X1d76c13c2b160250e7b235f19ff0b4f198dab0a"/>
-      <w:bookmarkStart w:id="11" w:name="_Toc222255045"/>
+      <w:bookmarkStart w:id="11" w:name="_Toc222327468"/>
       <w:bookmarkEnd w:id="8"/>
       <w:r>
         <w:t xml:space="preserve">2.2. </w:t>
@@ -8672,7 +8658,7 @@
           <w:lang w:val="en-US"/>
         </w:rPr>
       </w:pPr>
-      <w:bookmarkStart w:id="12" w:name="_Toc222255046"/>
+      <w:bookmarkStart w:id="12" w:name="_Toc222327469"/>
       <w:r>
         <w:rPr>
           <w:rStyle w:val="SubheadingChar"/>
@@ -8727,48 +8713,138 @@
           <w:bCs/>
           <w:lang w:val="en-US"/>
         </w:rPr>
-        <w:t xml:space="preserve">logistic regression, </w:t>
-      </w:r>
-      <w:proofErr w:type="gramStart"/>
+        <w:t>logistic regression, decision trees, random forests,</w:t>
+      </w:r>
       <w:r>
         <w:rPr>
           <w:b/>
           <w:bCs/>
           <w:lang w:val="en-US"/>
         </w:rPr>
-        <w:t>decision</w:t>
-      </w:r>
-      <w:proofErr w:type="gramEnd"/>
+        <w:t xml:space="preserve"> </w:t>
+      </w:r>
       <w:r>
         <w:rPr>
           <w:b/>
           <w:bCs/>
           <w:lang w:val="en-US"/>
         </w:rPr>
-        <w:t xml:space="preserve"> trees, random forests,</w:t>
-      </w:r>
+        <w:t>support vector machines (SVMs), and neural networks</w:t>
+      </w:r>
+      <w:r>
+        <w:rPr>
+          <w:lang w:val="en-US"/>
+        </w:rPr>
+        <w:t>. Supervised classifiers tend to achieve high accuracy when ample labeled examples of fraud are available, and they can directly optimize metrics like classification accuracy or F1-score</w:t>
+      </w:r>
+    </w:p>
+    <w:p>
+      <w:pPr>
+        <w:pStyle w:val="BodyText"/>
+        <w:rPr>
+          <w:lang w:val="en-US"/>
+        </w:rPr>
+      </w:pPr>
       <w:r>
         <w:rPr>
           <w:b/>
           <w:bCs/>
           <w:lang w:val="en-US"/>
         </w:rPr>
-        <w:t xml:space="preserve"> </w:t>
-      </w:r>
+        <w:t>Strengths:</w:t>
+      </w:r>
+      <w:r>
+        <w:rPr>
+          <w:lang w:val="en-US"/>
+        </w:rPr>
+        <w:t xml:space="preserve"> Supervised models can leverage well-understood algorithms and yield high detection performance if trained on representative data. They produce a clear decision output (fraud or not) for each transaction and can incorporate cost-sensitive learning to penalize misclassification of fraud heavily. </w:t>
+      </w:r>
+    </w:p>
+    <w:p>
+      <w:pPr>
+        <w:pStyle w:val="BodyText"/>
+        <w:rPr>
+          <w:lang w:val="en-US"/>
+        </w:rPr>
+      </w:pPr>
       <w:r>
         <w:rPr>
           <w:b/>
           <w:bCs/>
           <w:lang w:val="en-US"/>
         </w:rPr>
-        <w:t>support vector machines (SVMs), and neural networks</w:t>
-      </w:r>
-      <w:r>
-        <w:rPr>
-          <w:lang w:val="en-US"/>
-        </w:rPr>
-        <w:t>. Supervised classifiers tend to achieve high accuracy when ample labeled examples of fraud are available, and they can directly optimize metrics like classification accuracy or F1-score</w:t>
-      </w:r>
+        <w:t>Weaknesses:</w:t>
+      </w:r>
+      <w:r>
+        <w:rPr>
+          <w:lang w:val="en-US"/>
+        </w:rPr>
+        <w:t xml:space="preserve"> They require large quantities of labeled fraud data, which is often scarce. By nature, supervised models struggle with new fraud patterns not present in the training data</w:t>
+      </w:r>
+      <w:r>
+        <w:rPr>
+          <w:lang w:val="en-US"/>
+        </w:rPr>
+        <w:t>,</w:t>
+      </w:r>
+      <w:r>
+        <w:rPr>
+          <w:lang w:val="en-US"/>
+        </w:rPr>
+        <w:t xml:space="preserve"> they tend to detect “known” fraud </w:t>
+      </w:r>
+      <w:r>
+        <w:rPr>
+          <w:lang w:val="en-US"/>
+        </w:rPr>
+        <w:t xml:space="preserve">patterns </w:t>
+      </w:r>
+      <w:r>
+        <w:rPr>
+          <w:lang w:val="en-US"/>
+        </w:rPr>
+        <w:t xml:space="preserve">but can miss novel schemes. Moreover, in highly imbalanced </w:t>
+      </w:r>
+      <w:r>
+        <w:rPr>
+          <w:lang w:val="en-US"/>
+        </w:rPr>
+        <w:t xml:space="preserve">datasets, which is quite common on fraud detection cases, </w:t>
+      </w:r>
+      <w:r>
+        <w:rPr>
+          <w:lang w:val="en-US"/>
+        </w:rPr>
+        <w:t xml:space="preserve">supervised learners may </w:t>
+      </w:r>
+      <w:r>
+        <w:rPr>
+          <w:lang w:val="en-US"/>
+        </w:rPr>
+        <w:t>be biased</w:t>
+      </w:r>
+      <w:r>
+        <w:rPr>
+          <w:lang w:val="en-US"/>
+        </w:rPr>
+        <w:t xml:space="preserve"> toward the majority class without special handling. Many studies address this via resampling or algorithmic techniques but it remains a challenge.</w:t>
+      </w:r>
+    </w:p>
+    <w:p>
+      <w:pPr>
+        <w:pStyle w:val="subsubheading"/>
+        <w:rPr>
+          <w:lang w:val="en-US"/>
+        </w:rPr>
+      </w:pPr>
+      <w:bookmarkStart w:id="13" w:name="_Toc222327470"/>
+      <w:r>
+        <w:rPr>
+          <w:lang w:val="en-US"/>
+        </w:rPr>
+        <w:t>2.2.2. Unsupervised and Semi-Supervised Learning (Anomaly Detection)</w:t>
+      </w:r>
+      <w:bookmarkEnd w:id="13"/>
     </w:p>
     <w:p>
       <w:pPr>
@@ -8777,185 +8853,63 @@
           <w:lang w:val="en-US"/>
         </w:rPr>
       </w:pPr>
+      <w:r>
+        <w:rPr>
+          <w:lang w:val="en-US"/>
+        </w:rPr>
+        <w:t xml:space="preserve">Because fraudulent transactions are rare and evolving, unsupervised learning techniques are crucial to detect anomalies without relying on labeled examples (Ali et al., 2022; </w:t>
+      </w:r>
+      <w:r>
+        <w:rPr>
+          <w:lang w:val="en-US"/>
+        </w:rPr>
+        <w:t>Waleed Hilal, S. Andrew Gadsden, and John Yawney, 2021</w:t>
+      </w:r>
+      <w:r>
+        <w:rPr>
+          <w:lang w:val="en-US"/>
+        </w:rPr>
+        <w:t xml:space="preserve">). Unsupervised methods </w:t>
+      </w:r>
+      <w:r>
+        <w:rPr>
+          <w:lang w:val="en-US"/>
+        </w:rPr>
+        <w:t>attempt</w:t>
+      </w:r>
+      <w:r>
+        <w:rPr>
+          <w:lang w:val="en-US"/>
+        </w:rPr>
+        <w:t xml:space="preserve"> to model the distribution of normal transactions and flag outliers as potential fraud. Common approaches include </w:t>
+      </w:r>
       <w:r>
         <w:rPr>
           <w:b/>
           <w:bCs/>
           <w:lang w:val="en-US"/>
         </w:rPr>
-        <w:t>Strengths:</w:t>
-      </w:r>
-      <w:r>
-        <w:rPr>
-          <w:lang w:val="en-US"/>
-        </w:rPr>
-        <w:t xml:space="preserve"> Supervised models can leverage well-understood algorithms and yield high detection performance if trained on representative data. They produce a clear decision output (fraud or not) for each transaction and can incorporate cost-sensitive learning to penalize misclassification of fraud heavily. </w:t>
-      </w:r>
-    </w:p>
-    <w:p>
-      <w:pPr>
-        <w:pStyle w:val="BodyText"/>
-        <w:rPr>
-          <w:lang w:val="en-US"/>
-        </w:rPr>
-      </w:pPr>
+        <w:t>clustering algorithms</w:t>
+      </w:r>
+      <w:r>
+        <w:rPr>
+          <w:lang w:val="en-US"/>
+        </w:rPr>
+        <w:t xml:space="preserve"> (k-means, DBSCAN), </w:t>
+      </w:r>
       <w:r>
         <w:rPr>
           <w:b/>
           <w:bCs/>
           <w:lang w:val="en-US"/>
         </w:rPr>
-        <w:t>Weaknesses:</w:t>
-      </w:r>
-      <w:r>
-        <w:rPr>
-          <w:lang w:val="en-US"/>
-        </w:rPr>
-        <w:t xml:space="preserve"> They require large quantities of labeled fraud data, which is often scarce. By nature, supervised models struggle with new fraud patterns </w:t>
-      </w:r>
-      <w:proofErr w:type="gramStart"/>
-      <w:r>
-        <w:rPr>
-          <w:lang w:val="en-US"/>
-        </w:rPr>
-        <w:t>not present</w:t>
-      </w:r>
-      <w:proofErr w:type="gramEnd"/>
-      <w:r>
-        <w:rPr>
-          <w:lang w:val="en-US"/>
-        </w:rPr>
-        <w:t xml:space="preserve"> in the training data</w:t>
-      </w:r>
-      <w:r>
-        <w:rPr>
-          <w:lang w:val="en-US"/>
-        </w:rPr>
-        <w:t>,</w:t>
-      </w:r>
-      <w:r>
-        <w:rPr>
-          <w:lang w:val="en-US"/>
-        </w:rPr>
-        <w:t xml:space="preserve"> they tend to detect “known” fraud </w:t>
-      </w:r>
-      <w:r>
-        <w:rPr>
-          <w:lang w:val="en-US"/>
-        </w:rPr>
-        <w:t xml:space="preserve">patterns </w:t>
-      </w:r>
-      <w:r>
-        <w:rPr>
-          <w:lang w:val="en-US"/>
-        </w:rPr>
-        <w:t xml:space="preserve">but can miss novel schemes. Moreover, in highly imbalanced </w:t>
-      </w:r>
-      <w:r>
-        <w:rPr>
-          <w:lang w:val="en-US"/>
-        </w:rPr>
-        <w:t xml:space="preserve">datasets, which </w:t>
-      </w:r>
-      <w:proofErr w:type="gramStart"/>
-      <w:r>
-        <w:rPr>
-          <w:lang w:val="en-US"/>
-        </w:rPr>
-        <w:t>is</w:t>
-      </w:r>
-      <w:proofErr w:type="gramEnd"/>
-      <w:r>
-        <w:rPr>
-          <w:lang w:val="en-US"/>
-        </w:rPr>
-        <w:t xml:space="preserve"> quite common on fraud detection cases, </w:t>
-      </w:r>
-      <w:r>
-        <w:rPr>
-          <w:lang w:val="en-US"/>
-        </w:rPr>
-        <w:t xml:space="preserve">supervised learners may </w:t>
-      </w:r>
-      <w:r>
-        <w:rPr>
-          <w:lang w:val="en-US"/>
-        </w:rPr>
-        <w:t>be biased</w:t>
-      </w:r>
-      <w:r>
-        <w:rPr>
-          <w:lang w:val="en-US"/>
-        </w:rPr>
-        <w:t xml:space="preserve"> toward the majority class without special handling. Many studies address this via resampling or algorithmic </w:t>
-      </w:r>
-      <w:proofErr w:type="gramStart"/>
-      <w:r>
-        <w:rPr>
-          <w:lang w:val="en-US"/>
-        </w:rPr>
-        <w:t>techniques</w:t>
-      </w:r>
-      <w:proofErr w:type="gramEnd"/>
-      <w:r>
-        <w:rPr>
-          <w:lang w:val="en-US"/>
-        </w:rPr>
-        <w:t xml:space="preserve"> but it remains a challenge.</w:t>
-      </w:r>
-    </w:p>
-    <w:p>
-      <w:pPr>
-        <w:pStyle w:val="subsubheading"/>
-        <w:rPr>
-          <w:lang w:val="en-US"/>
-        </w:rPr>
-      </w:pPr>
-      <w:bookmarkStart w:id="13" w:name="_Toc222255047"/>
-      <w:r>
-        <w:rPr>
-          <w:lang w:val="en-US"/>
-        </w:rPr>
-        <w:t>2.2.2. Unsupervised and Semi-Supervised Learning (Anomaly Detection)</w:t>
-      </w:r>
-      <w:bookmarkEnd w:id="13"/>
-    </w:p>
-    <w:p>
-      <w:pPr>
-        <w:pStyle w:val="BodyText"/>
-        <w:rPr>
-          <w:lang w:val="en-US"/>
-        </w:rPr>
-      </w:pPr>
-      <w:r>
-        <w:rPr>
-          <w:lang w:val="en-US"/>
-        </w:rPr>
-        <w:t xml:space="preserve">Because fraudulent transactions are rare and evolving, unsupervised learning techniques are crucial to detect anomalies without relying on labeled examples (Ali et al., 2022; </w:t>
-      </w:r>
-      <w:r>
-        <w:rPr>
-          <w:lang w:val="en-US"/>
-        </w:rPr>
-        <w:t>Waleed Hilal, S. Andrew Gadsden, and John Yawney, 2021</w:t>
-      </w:r>
-      <w:r>
-        <w:rPr>
-          <w:lang w:val="en-US"/>
-        </w:rPr>
-        <w:t xml:space="preserve">). Unsupervised methods </w:t>
-      </w:r>
-      <w:r>
-        <w:rPr>
-          <w:lang w:val="en-US"/>
-        </w:rPr>
-        <w:t>attempt</w:t>
-      </w:r>
-      <w:r>
-        <w:rPr>
-          <w:lang w:val="en-US"/>
-        </w:rPr>
-        <w:t xml:space="preserve"> to model the distribution of normal transactions and flag outliers as potential fraud. Common approaches include </w:t>
+        <w:t>density estimation</w:t>
+      </w:r>
+      <w:r>
+        <w:rPr>
+          <w:lang w:val="en-US"/>
+        </w:rPr>
+        <w:t xml:space="preserve">, and </w:t>
       </w:r>
       <w:r>
         <w:rPr>
@@ -8963,64 +8917,121 @@
           <w:bCs/>
           <w:lang w:val="en-US"/>
         </w:rPr>
-        <w:t>clustering algorithms</w:t>
-      </w:r>
-      <w:r>
-        <w:rPr>
-          <w:lang w:val="en-US"/>
-        </w:rPr>
-        <w:t xml:space="preserve"> (k-means, DBSCAN), </w:t>
-      </w:r>
+        <w:t>one-class classification</w:t>
+      </w:r>
+      <w:r>
+        <w:rPr>
+          <w:lang w:val="en-US"/>
+        </w:rPr>
+        <w:t xml:space="preserve"> methods (One-Class SVM, Isolation Forest). </w:t>
+      </w:r>
+    </w:p>
+    <w:p>
+      <w:pPr>
+        <w:pStyle w:val="BodyText"/>
+        <w:rPr>
+          <w:lang w:val="en-US"/>
+        </w:rPr>
+      </w:pPr>
       <w:r>
         <w:rPr>
           <w:b/>
           <w:bCs/>
           <w:lang w:val="en-US"/>
         </w:rPr>
-        <w:t>density estimation</w:t>
-      </w:r>
-      <w:r>
-        <w:rPr>
-          <w:lang w:val="en-US"/>
-        </w:rPr>
-        <w:t xml:space="preserve">, and </w:t>
-      </w:r>
+        <w:t>Strengths:</w:t>
+      </w:r>
+      <w:r>
+        <w:rPr>
+          <w:lang w:val="en-US"/>
+        </w:rPr>
+        <w:t xml:space="preserve"> Unsupervised anomaly detection can potentially identify previously unseen fraud patterns, making it adaptive to emerging threats. It does not require annotated fraud data, which is useful when labels are expensive or delayed (a common situation in financial fraud, where only some frauds are ever confirmed). </w:t>
+      </w:r>
+    </w:p>
+    <w:p>
+      <w:pPr>
+        <w:pStyle w:val="BodyText"/>
+        <w:rPr>
+          <w:lang w:val="en-US"/>
+        </w:rPr>
+      </w:pPr>
       <w:r>
         <w:rPr>
           <w:b/>
           <w:bCs/>
           <w:lang w:val="en-US"/>
         </w:rPr>
-        <w:t>one-class classification</w:t>
-      </w:r>
-      <w:r>
-        <w:rPr>
-          <w:lang w:val="en-US"/>
-        </w:rPr>
-        <w:t xml:space="preserve"> methods (One-Class SVM, Isolation Forest). </w:t>
-      </w:r>
-    </w:p>
-    <w:p>
-      <w:pPr>
-        <w:pStyle w:val="BodyText"/>
-        <w:rPr>
-          <w:lang w:val="en-US"/>
-        </w:rPr>
-      </w:pPr>
+        <w:t>Weaknesses:</w:t>
+      </w:r>
+      <w:r>
+        <w:rPr>
+          <w:lang w:val="en-US"/>
+        </w:rPr>
+        <w:t xml:space="preserve"> These methods can suffer from higher false positive rates, since not every statistical outlier is fraudulent. Tuning them can be difficult, and evaluating their performance is tricky </w:t>
+      </w:r>
+      <w:r>
+        <w:rPr>
+          <w:lang w:val="en-US"/>
+        </w:rPr>
+        <w:lastRenderedPageBreak/>
+        <w:t xml:space="preserve">without ground-truth labels (often requiring manual review). Indeed, surveys report that unsupervised techniques, while studied, have been used </w:t>
+      </w:r>
       <w:r>
         <w:rPr>
           <w:b/>
           <w:bCs/>
           <w:lang w:val="en-US"/>
         </w:rPr>
-        <w:t>Strengths:</w:t>
-      </w:r>
-      <w:r>
-        <w:rPr>
-          <w:lang w:val="en-US"/>
-        </w:rPr>
-        <w:t xml:space="preserve"> Unsupervised anomaly detection can potentially identify previously unseen fraud patterns, making it adaptive to emerging threats. It does not require annotated fraud data, which is useful when labels are expensive or delayed (a common situation in financial fraud, where only some frauds are ever confirmed). </w:t>
-      </w:r>
+        <w:t>less frequently than supervised ones in the literature</w:t>
+      </w:r>
+      <w:r>
+        <w:rPr>
+          <w:lang w:val="en-US"/>
+        </w:rPr>
+        <w:t xml:space="preserve"> </w:t>
+      </w:r>
+      <w:r>
+        <w:rPr>
+          <w:lang w:val="en-US"/>
+        </w:rPr>
+        <w:t xml:space="preserve">(Ngai </w:t>
+      </w:r>
+      <w:r>
+        <w:rPr>
+          <w:i/>
+          <w:iCs/>
+          <w:lang w:val="en-US"/>
+        </w:rPr>
+        <w:t>et al.</w:t>
+      </w:r>
+      <w:r>
+        <w:rPr>
+          <w:lang w:val="en-US"/>
+        </w:rPr>
+        <w:t>, 2011)</w:t>
+      </w:r>
+      <w:r>
+        <w:rPr>
+          <w:lang w:val="en-US"/>
+        </w:rPr>
+        <w:t xml:space="preserve">. </w:t>
+      </w:r>
+    </w:p>
+    <w:p>
+      <w:pPr>
+        <w:pStyle w:val="subsubheading"/>
+        <w:rPr>
+          <w:lang w:val="en-US"/>
+        </w:rPr>
+      </w:pPr>
+      <w:bookmarkStart w:id="14" w:name="_Toc222327471"/>
+      <w:r>
+        <w:rPr>
+          <w:lang w:val="en-US"/>
+        </w:rPr>
+        <w:t>2.2.3. Ensemble Methods</w:t>
+      </w:r>
+      <w:bookmarkEnd w:id="14"/>
     </w:p>
     <w:p>
       <w:pPr>
@@ -9029,46 +9040,249 @@
           <w:lang w:val="en-US"/>
         </w:rPr>
       </w:pPr>
+      <w:r>
+        <w:rPr>
+          <w:lang w:val="en-US"/>
+        </w:rPr>
+        <w:t xml:space="preserve">Ensemble learning </w:t>
+      </w:r>
+      <w:r>
+        <w:rPr>
+          <w:lang w:val="en-US"/>
+        </w:rPr>
+        <w:t xml:space="preserve">is a special sub-category of supervised learning, which </w:t>
+      </w:r>
+      <w:r>
+        <w:rPr>
+          <w:lang w:val="en-US"/>
+        </w:rPr>
+        <w:t>combines multiple models to improve predictive performance. Ensembles are widely used in fraud detection to boost accuracy and robustness. Techniques include bagging (e.g.</w:t>
+      </w:r>
+      <w:r>
+        <w:rPr>
+          <w:lang w:val="en-US"/>
+        </w:rPr>
+        <w:t>,</w:t>
+      </w:r>
+      <w:r>
+        <w:rPr>
+          <w:lang w:val="en-US"/>
+        </w:rPr>
+        <w:t xml:space="preserve"> Random Forest, which aggregates many decision trees), boosting (e.g.</w:t>
+      </w:r>
+      <w:r>
+        <w:rPr>
+          <w:lang w:val="en-US"/>
+        </w:rPr>
+        <w:t>,</w:t>
+      </w:r>
+      <w:r>
+        <w:rPr>
+          <w:lang w:val="en-US"/>
+        </w:rPr>
+        <w:t xml:space="preserve"> XGBoost, LightGBM), and stacking (blending different model types). Ensembles </w:t>
+      </w:r>
       <w:r>
         <w:rPr>
           <w:b/>
           <w:bCs/>
           <w:lang w:val="en-US"/>
         </w:rPr>
-        <w:t>Weaknesses:</w:t>
-      </w:r>
-      <w:r>
-        <w:rPr>
-          <w:lang w:val="en-US"/>
-        </w:rPr>
-        <w:t xml:space="preserve"> These methods can suffer from higher false positive rates, since not every statistical outlier is fraudulent. Tuning them can be difficult, and evaluating their performance is tricky </w:t>
-      </w:r>
-      <w:r>
-        <w:rPr>
-          <w:lang w:val="en-US"/>
-        </w:rPr>
-        <w:lastRenderedPageBreak/>
-        <w:t xml:space="preserve">without ground-truth labels (often requiring manual review). Indeed, surveys report that unsupervised techniques, while studied, have been used </w:t>
-      </w:r>
+        <w:t>often win data science competitions for fraud detection</w:t>
+      </w:r>
+      <w:r>
+        <w:rPr>
+          <w:lang w:val="en-US"/>
+        </w:rPr>
+        <w:t xml:space="preserve"> due to their ability to capture diverse patterns. For example, boosting algorithms have achieved top results on credit card fraud datasets by effectively handling imbalance and nonlinear interactions (Hernandez Aros et al., 2024).</w:t>
+      </w:r>
+      <w:r>
+        <w:rPr>
+          <w:lang w:val="en-US"/>
+        </w:rPr>
+        <w:t xml:space="preserve"> Also, top scores on one of the most recent fraud detection Kaggle competitions (</w:t>
+      </w:r>
+      <w:r>
+        <w:rPr>
+          <w:lang w:val="en-US"/>
+        </w:rPr>
+        <w:t>IEEE-CIS Fraud Detection</w:t>
+      </w:r>
+      <w:r>
+        <w:rPr>
+          <w:lang w:val="en-US"/>
+        </w:rPr>
+        <w:t xml:space="preserve">) have been achieved with such methods. </w:t>
+      </w:r>
+      <w:r>
+        <w:rPr>
+          <w:lang w:val="en-US"/>
+        </w:rPr>
+        <w:t xml:space="preserve">Ensembles can also incorporate different algorithms for different sub-tasks: one study used a hybrid of SVM, logistic regression, and linear regression as a composite model to classify transactions (Ali et al., 2022). </w:t>
+      </w:r>
+    </w:p>
+    <w:p>
+      <w:pPr>
+        <w:pStyle w:val="BodyText"/>
+        <w:rPr>
+          <w:lang w:val="en-US"/>
+        </w:rPr>
+      </w:pPr>
       <w:r>
         <w:rPr>
           <w:b/>
           <w:bCs/>
           <w:lang w:val="en-US"/>
         </w:rPr>
-        <w:t>less frequently than supervised ones in the literature</w:t>
-      </w:r>
+        <w:t>Strengths:</w:t>
+      </w:r>
+      <w:r>
+        <w:rPr>
+          <w:lang w:val="en-US"/>
+        </w:rPr>
+        <w:t xml:space="preserve"> Ensembles usually outperform individual models by reducing variance and bias – this is valuable in fraud detection</w:t>
+      </w:r>
+      <w:r>
+        <w:rPr>
+          <w:lang w:val="en-US"/>
+        </w:rPr>
+        <w:t>,</w:t>
+      </w:r>
+      <w:r>
+        <w:rPr>
+          <w:lang w:val="en-US"/>
+        </w:rPr>
+        <w:t xml:space="preserve"> where catching as many fraud cases as possible (high recall) while keeping false alarms low (high precision) requires a delicate balance. </w:t>
+      </w:r>
+    </w:p>
+    <w:p>
+      <w:pPr>
+        <w:pStyle w:val="BodyText"/>
+        <w:rPr>
+          <w:lang w:val="en-US"/>
+        </w:rPr>
+      </w:pPr>
+      <w:r>
+        <w:rPr>
+          <w:b/>
+          <w:bCs/>
+          <w:lang w:val="en-US"/>
+        </w:rPr>
+        <w:t>Weaknesses:</w:t>
+      </w:r>
+      <w:r>
+        <w:rPr>
+          <w:lang w:val="en-US"/>
+        </w:rPr>
+        <w:t xml:space="preserve"> The main downsides are increased complexity and reduced interpretability. A large ensemble (hundreds of trees or mixed models) can be a </w:t>
+      </w:r>
+      <w:r>
+        <w:rPr>
+          <w:b/>
+          <w:bCs/>
+          <w:lang w:val="en-US"/>
+        </w:rPr>
+        <w:t>“black box”</w:t>
+      </w:r>
+      <w:r>
+        <w:rPr>
+          <w:lang w:val="en-US"/>
+        </w:rPr>
+        <w:t xml:space="preserve"> that is hard to interpret, which </w:t>
+      </w:r>
+      <w:r>
+        <w:rPr>
+          <w:lang w:val="en-US"/>
+        </w:rPr>
+        <w:t xml:space="preserve">may be </w:t>
+      </w:r>
+      <w:r>
+        <w:rPr>
+          <w:lang w:val="en-US"/>
+        </w:rPr>
+        <w:t>problematic in regulated financial environments</w:t>
+      </w:r>
+      <w:r>
+        <w:rPr>
+          <w:lang w:val="en-US"/>
+        </w:rPr>
+        <w:t>.</w:t>
+      </w:r>
+    </w:p>
+    <w:p>
+      <w:pPr>
+        <w:pStyle w:val="subsubheading"/>
+        <w:rPr>
+          <w:lang w:val="en-US"/>
+        </w:rPr>
+      </w:pPr>
+      <w:bookmarkStart w:id="15" w:name="_Toc222327472"/>
+      <w:r>
+        <w:rPr>
+          <w:lang w:val="en-US"/>
+        </w:rPr>
+        <w:t>2.2.4. Deep Learning</w:t>
+      </w:r>
+      <w:bookmarkEnd w:id="15"/>
+    </w:p>
+    <w:p>
+      <w:pPr>
+        <w:pStyle w:val="BodyText"/>
+        <w:rPr>
+          <w:lang w:val="en-US"/>
+        </w:rPr>
+      </w:pPr>
+      <w:r>
+        <w:rPr>
+          <w:lang w:val="en-US"/>
+        </w:rPr>
+        <w:t>Deep</w:t>
+      </w:r>
+      <w:r>
+        <w:rPr>
+          <w:lang w:val="en-US"/>
+        </w:rPr>
+        <w:t xml:space="preserve"> learning techniques have been increasingly applied to fraud detection, thanks to their ability to model complex data patterns. Artificial Neural Networks (ANNs) in various forms (</w:t>
+      </w:r>
+      <w:r>
+        <w:rPr>
+          <w:b/>
+          <w:bCs/>
+          <w:lang w:val="en-US"/>
+        </w:rPr>
+        <w:t>multilayer perceptrons, convolutional networks, recurrent networks, graph neural networks</w:t>
+      </w:r>
+      <w:r>
+        <w:rPr>
+          <w:lang w:val="en-US"/>
+        </w:rPr>
+        <w:t>) have been explored. Early works used basic ANNs to classify fraudulent transactions (</w:t>
+      </w:r>
+      <w:r>
+        <w:rPr>
+          <w:lang w:val="en-US"/>
+        </w:rPr>
+        <w:t>Sahin and Duman, 2011</w:t>
+      </w:r>
+      <w:r>
+        <w:rPr>
+          <w:lang w:val="en-US"/>
+        </w:rPr>
+        <w:t xml:space="preserve">; </w:t>
+      </w:r>
+      <w:proofErr w:type="spellStart"/>
+      <w:r>
+        <w:rPr>
+          <w:lang w:val="en-US"/>
+        </w:rPr>
+        <w:t>Bouchti</w:t>
+      </w:r>
+      <w:proofErr w:type="spellEnd"/>
       <w:r>
         <w:rPr>
           <w:lang w:val="en-US"/>
         </w:rPr>
         <w:t xml:space="preserve"> </w:t>
-      </w:r>
-      <w:r>
-        <w:rPr>
-          <w:lang w:val="en-US"/>
-        </w:rPr>
-        <w:t xml:space="preserve">(Ngai </w:t>
       </w:r>
       <w:r>
         <w:rPr>
@@ -9082,30 +9296,85 @@
         <w:rPr>
           <w:lang w:val="en-US"/>
         </w:rPr>
-        <w:t>, 2011)</w:t>
-      </w:r>
-      <w:r>
-        <w:rPr>
-          <w:lang w:val="en-US"/>
-        </w:rPr>
-        <w:t xml:space="preserve">. </w:t>
-      </w:r>
-    </w:p>
-    <w:p>
-      <w:pPr>
-        <w:pStyle w:val="subsubheading"/>
-        <w:rPr>
-          <w:lang w:val="en-US"/>
-        </w:rPr>
-      </w:pPr>
-      <w:bookmarkStart w:id="14" w:name="_Toc222255048"/>
-      <w:r>
-        <w:rPr>
-          <w:lang w:val="en-US"/>
-        </w:rPr>
-        <w:t>2.2.3. Ensemble Methods</w:t>
-      </w:r>
-      <w:bookmarkEnd w:id="14"/>
+        <w:t>, 2017</w:t>
+      </w:r>
+      <w:r>
+        <w:rPr>
+          <w:lang w:val="en-US"/>
+        </w:rPr>
+        <w:t xml:space="preserve">; </w:t>
+      </w:r>
+      <w:r>
+        <w:rPr>
+          <w:lang w:val="en-US"/>
+        </w:rPr>
+        <w:t xml:space="preserve">Dang </w:t>
+      </w:r>
+      <w:r>
+        <w:rPr>
+          <w:i/>
+          <w:iCs/>
+          <w:lang w:val="en-US"/>
+        </w:rPr>
+        <w:t>et al.</w:t>
+      </w:r>
+      <w:r>
+        <w:rPr>
+          <w:lang w:val="en-US"/>
+        </w:rPr>
+        <w:t>, 2021</w:t>
+      </w:r>
+      <w:r>
+        <w:rPr>
+          <w:lang w:val="en-US"/>
+        </w:rPr>
+        <w:t>), while newer studies leverage specialized architectures. For example, recurrent neural networks (RNNs) and long short-term memory (LSTM) networks can capture sequential patterns in transaction streams (useful for detecting sequential fraud behavior or repeated offenses). Graph Neural Networks (GNNs) have emerged to detect fraud by modeling transactions as graphs (e.g.</w:t>
+      </w:r>
+      <w:r>
+        <w:rPr>
+          <w:lang w:val="en-US"/>
+        </w:rPr>
+        <w:t>,</w:t>
+      </w:r>
+      <w:r>
+        <w:rPr>
+          <w:lang w:val="en-US"/>
+        </w:rPr>
+        <w:t xml:space="preserve"> linking customers, merchants, IP </w:t>
+      </w:r>
+      <w:r>
+        <w:rPr>
+          <w:lang w:val="en-US"/>
+        </w:rPr>
+        <w:lastRenderedPageBreak/>
+        <w:t>addresses)</w:t>
+      </w:r>
+      <w:r>
+        <w:rPr>
+          <w:lang w:val="en-US"/>
+        </w:rPr>
+        <w:t>,</w:t>
+      </w:r>
+      <w:r>
+        <w:rPr>
+          <w:lang w:val="en-US"/>
+        </w:rPr>
+        <w:t xml:space="preserve"> graph-based approaches can uncover organized fraud rings or money laundering patterns by relational analysis (Nicholls et al., 2021). Deep learning has also been combined with other methods: autoencoder networks for anomaly detection (unsupervised) or hybrid deep models with feature extraction followed by classification (</w:t>
+      </w:r>
+      <w:proofErr w:type="spellStart"/>
+      <w:r>
+        <w:rPr>
+          <w:lang w:val="en-US"/>
+        </w:rPr>
+        <w:t>Jurgovsky</w:t>
+      </w:r>
+      <w:proofErr w:type="spellEnd"/>
+      <w:r>
+        <w:rPr>
+          <w:lang w:val="en-US"/>
+        </w:rPr>
+        <w:t xml:space="preserve"> et al., 2018). </w:t>
+      </w:r>
     </w:p>
     <w:p>
       <w:pPr>
@@ -9114,99 +9383,31 @@
           <w:lang w:val="en-US"/>
         </w:rPr>
       </w:pPr>
-      <w:r>
-        <w:rPr>
-          <w:lang w:val="en-US"/>
-        </w:rPr>
-        <w:t xml:space="preserve">Ensemble learning </w:t>
-      </w:r>
-      <w:r>
-        <w:rPr>
-          <w:lang w:val="en-US"/>
-        </w:rPr>
-        <w:t xml:space="preserve">is a special sub-category of supervised learning, which </w:t>
-      </w:r>
-      <w:r>
-        <w:rPr>
-          <w:lang w:val="en-US"/>
-        </w:rPr>
-        <w:t>combines multiple models to improve predictive performance. Ensembles are widely used in fraud detection to boost accuracy and robustness. Techniques include bagging (e.g.</w:t>
-      </w:r>
-      <w:r>
-        <w:rPr>
-          <w:lang w:val="en-US"/>
-        </w:rPr>
-        <w:t>,</w:t>
-      </w:r>
-      <w:r>
-        <w:rPr>
-          <w:lang w:val="en-US"/>
-        </w:rPr>
-        <w:t xml:space="preserve"> Random Forest, which aggregates many decision trees), boosting (e.g.</w:t>
-      </w:r>
-      <w:r>
-        <w:rPr>
-          <w:lang w:val="en-US"/>
-        </w:rPr>
-        <w:t>,</w:t>
-      </w:r>
-      <w:r>
-        <w:rPr>
-          <w:lang w:val="en-US"/>
-        </w:rPr>
-        <w:t xml:space="preserve"> XGBoost, LightGBM), and stacking (blending different model types). Ensembles </w:t>
-      </w:r>
       <w:r>
         <w:rPr>
           <w:b/>
           <w:bCs/>
           <w:lang w:val="en-US"/>
         </w:rPr>
-        <w:t>often win data science competitions for fraud detection</w:t>
-      </w:r>
-      <w:r>
-        <w:rPr>
-          <w:lang w:val="en-US"/>
-        </w:rPr>
-        <w:t xml:space="preserve"> due to their ability to capture diverse patterns. For example, boosting algorithms have achieved top results on credit card fraud datasets by effectively handling imbalance and nonlinear interactions (Hernandez Aros et al., 2024).</w:t>
-      </w:r>
-      <w:r>
-        <w:rPr>
-          <w:lang w:val="en-US"/>
-        </w:rPr>
-        <w:t xml:space="preserve"> Also, top scores on one of the most recent fraud </w:t>
-      </w:r>
-      <w:proofErr w:type="gramStart"/>
-      <w:r>
-        <w:rPr>
-          <w:lang w:val="en-US"/>
-        </w:rPr>
-        <w:t>detection</w:t>
-      </w:r>
-      <w:proofErr w:type="gramEnd"/>
-      <w:r>
-        <w:rPr>
-          <w:lang w:val="en-US"/>
-        </w:rPr>
-        <w:t xml:space="preserve"> Kaggle competitions (</w:t>
-      </w:r>
-      <w:r>
-        <w:rPr>
-          <w:lang w:val="en-US"/>
-        </w:rPr>
-        <w:t>IEEE-CIS Fraud Detection</w:t>
-      </w:r>
-      <w:r>
-        <w:rPr>
-          <w:lang w:val="en-US"/>
-        </w:rPr>
-        <w:t xml:space="preserve">) have been achieved with such methods. </w:t>
-      </w:r>
-      <w:r>
-        <w:rPr>
-          <w:lang w:val="en-US"/>
-        </w:rPr>
-        <w:t xml:space="preserve">Ensembles can also incorporate different algorithms for different sub-tasks: one study used a hybrid of SVM, logistic regression, and linear regression as a composite model to classify transactions (Ali et al., 2022). </w:t>
+        <w:t>Strengths:</w:t>
+      </w:r>
+      <w:r>
+        <w:rPr>
+          <w:lang w:val="en-US"/>
+        </w:rPr>
+        <w:t xml:space="preserve"> Deep learning models can capture highly nonlinear and intricate patterns that shallow models might miss. They are adept at processing large-scale data and can learn feature representations automatically (reducing the need for manual feature engineering). Some deep models (like GNNs) naturally incorporate network information that is crucial for certain fraud types (e.g.</w:t>
+      </w:r>
+      <w:r>
+        <w:rPr>
+          <w:lang w:val="en-US"/>
+        </w:rPr>
+        <w:t>,</w:t>
+      </w:r>
+      <w:r>
+        <w:rPr>
+          <w:lang w:val="en-US"/>
+        </w:rPr>
+        <w:t xml:space="preserve"> collusive networks). </w:t>
       </w:r>
     </w:p>
     <w:p>
@@ -9222,47 +9423,161 @@
           <w:bCs/>
           <w:lang w:val="en-US"/>
         </w:rPr>
-        <w:t>Strengths:</w:t>
-      </w:r>
-      <w:r>
-        <w:rPr>
-          <w:lang w:val="en-US"/>
-        </w:rPr>
-        <w:t xml:space="preserve"> Ensembles usually outperform individual models by reducing variance and bias – this is valuable in fraud detection</w:t>
-      </w:r>
-      <w:r>
-        <w:rPr>
-          <w:lang w:val="en-US"/>
-        </w:rPr>
-        <w:t>,</w:t>
-      </w:r>
-      <w:r>
-        <w:rPr>
-          <w:lang w:val="en-US"/>
-        </w:rPr>
-        <w:t xml:space="preserve"> where catching as many fraud cases as possible (high recall) while keeping false alarms low (high precision) requires a delicate balance. </w:t>
-      </w:r>
-    </w:p>
-    <w:p>
-      <w:pPr>
-        <w:pStyle w:val="BodyText"/>
-        <w:rPr>
-          <w:lang w:val="en-US"/>
-        </w:rPr>
-      </w:pPr>
+        <w:t>Weaknesses:</w:t>
+      </w:r>
+      <w:r>
+        <w:rPr>
+          <w:lang w:val="en-US"/>
+        </w:rPr>
+        <w:t xml:space="preserve"> Deep models typically require even larger training datasets and computational resources</w:t>
+      </w:r>
+      <w:r>
+        <w:rPr>
+          <w:lang w:val="en-US"/>
+        </w:rPr>
+        <w:t xml:space="preserve">, </w:t>
+      </w:r>
+      <w:r>
+        <w:rPr>
+          <w:lang w:val="en-US"/>
+        </w:rPr>
+        <w:t>while, in</w:t>
+      </w:r>
+      <w:r>
+        <w:rPr>
+          <w:lang w:val="en-US"/>
+        </w:rPr>
+        <w:t xml:space="preserve"> the same time, </w:t>
+      </w:r>
+      <w:r>
+        <w:rPr>
+          <w:lang w:val="en-US"/>
+        </w:rPr>
+        <w:t>performance gains depend on feature availability, scale, and constraints.</w:t>
+      </w:r>
+      <w:r>
+        <w:rPr>
+          <w:lang w:val="en-US"/>
+        </w:rPr>
+        <w:t xml:space="preserve"> They also tend to be </w:t>
+      </w:r>
       <w:r>
         <w:rPr>
           <w:b/>
           <w:bCs/>
           <w:lang w:val="en-US"/>
         </w:rPr>
-        <w:t>Weaknesses:</w:t>
-      </w:r>
-      <w:r>
-        <w:rPr>
-          <w:lang w:val="en-US"/>
-        </w:rPr>
-        <w:t xml:space="preserve"> The main downsides are increased complexity and reduced interpretability. A large ensemble (hundreds of trees or mixed models) can be a </w:t>
+        <w:t>black-box</w:t>
+      </w:r>
+      <w:r>
+        <w:rPr>
+          <w:lang w:val="en-US"/>
+        </w:rPr>
+        <w:t xml:space="preserve"> in nature, raising explainability concerns.  </w:t>
+      </w:r>
+      <w:r>
+        <w:rPr>
+          <w:lang w:val="en-US"/>
+        </w:rPr>
+        <w:t xml:space="preserve">Also deep learning algorithms have very high capacity and are more likely to overfit, if not treated with caution. </w:t>
+      </w:r>
+    </w:p>
+    <w:p>
+      <w:pPr>
+        <w:pStyle w:val="subsubheading"/>
+        <w:rPr>
+          <w:rStyle w:val="subsubheadingChar"/>
+          <w:b/>
+          <w:lang w:val="en-US"/>
+        </w:rPr>
+      </w:pPr>
+      <w:bookmarkStart w:id="16" w:name="_Toc222327473"/>
+      <w:r>
+        <w:rPr>
+          <w:rStyle w:val="subsubheadingChar"/>
+          <w:b/>
+          <w:lang w:val="en-US"/>
+        </w:rPr>
+        <w:t>2.2.</w:t>
+      </w:r>
+      <w:r>
+        <w:rPr>
+          <w:rStyle w:val="subsubheadingChar"/>
+          <w:b/>
+          <w:lang w:val="en-US"/>
+        </w:rPr>
+        <w:t>5</w:t>
+      </w:r>
+      <w:r>
+        <w:rPr>
+          <w:rStyle w:val="subsubheadingChar"/>
+          <w:b/>
+          <w:lang w:val="en-US"/>
+        </w:rPr>
+        <w:t>. Comparison of Approaches</w:t>
+      </w:r>
+      <w:bookmarkEnd w:id="16"/>
+    </w:p>
+    <w:p>
+      <w:pPr>
+        <w:pStyle w:val="BodyText"/>
+        <w:rPr>
+          <w:lang w:val="en-US"/>
+        </w:rPr>
+      </w:pPr>
+      <w:r>
+        <w:rPr>
+          <w:lang w:val="en-US"/>
+        </w:rPr>
+        <w:t>In practice, the choice of approach depends on label availability, operational constraints, and the expected rate of novel fraud. Supervised models and ensembles typically perform strongly when representative labeled data are available, while unsupervised methods are often used to surface anomalies and previously unseen patterns, at the cost of higher false-positive rates. Deep learning approaches can be beneficial when richer structure is available (e.g., sequences or relational graphs), but they require careful design and sufficient data to avoid overfitting. Consequently, hybrid systems</w:t>
+      </w:r>
+      <w:r>
+        <w:rPr>
+          <w:lang w:val="en-US"/>
+        </w:rPr>
+        <w:t xml:space="preserve">, </w:t>
+      </w:r>
+      <w:r>
+        <w:rPr>
+          <w:lang w:val="en-US"/>
+        </w:rPr>
+        <w:t>combining supervised learning with complementary anomaly signals and continuous monitoring</w:t>
+      </w:r>
+      <w:r>
+        <w:rPr>
+          <w:lang w:val="en-US"/>
+        </w:rPr>
+        <w:t xml:space="preserve">, </w:t>
+      </w:r>
+      <w:r>
+        <w:rPr>
+          <w:lang w:val="en-US"/>
+        </w:rPr>
+        <w:t>are common in applied fraud detection settings (Ali et al., 2022).</w:t>
+      </w:r>
+      <w:r>
+        <w:rPr>
+          <w:lang w:val="en-US"/>
+        </w:rPr>
+        <w:t xml:space="preserve"> </w:t>
+      </w:r>
+      <w:r>
+        <w:rPr>
+          <w:lang w:val="en-US"/>
+        </w:rPr>
+        <w:t>Overall, the literature suggests that no single modeling paradigm is universally optimal for fraud detection</w:t>
+      </w:r>
+      <w:r>
+        <w:rPr>
+          <w:lang w:val="en-US"/>
+        </w:rPr>
+        <w:t>,</w:t>
+      </w:r>
+      <w:r>
+        <w:rPr>
+          <w:lang w:val="en-US"/>
+        </w:rPr>
+        <w:t xml:space="preserve"> instead, </w:t>
       </w:r>
       <w:r>
         <w:rPr>
@@ -9270,411 +9585,6 @@
           <w:bCs/>
           <w:lang w:val="en-US"/>
         </w:rPr>
-        <w:t>“black box”</w:t>
-      </w:r>
-      <w:r>
-        <w:rPr>
-          <w:lang w:val="en-US"/>
-        </w:rPr>
-        <w:t xml:space="preserve"> that is hard to interpret, which </w:t>
-      </w:r>
-      <w:r>
-        <w:rPr>
-          <w:lang w:val="en-US"/>
-        </w:rPr>
-        <w:t xml:space="preserve">may be </w:t>
-      </w:r>
-      <w:r>
-        <w:rPr>
-          <w:lang w:val="en-US"/>
-        </w:rPr>
-        <w:t>problematic in regulated financial environments</w:t>
-      </w:r>
-      <w:r>
-        <w:rPr>
-          <w:lang w:val="en-US"/>
-        </w:rPr>
-        <w:t>.</w:t>
-      </w:r>
-    </w:p>
-    <w:p>
-      <w:pPr>
-        <w:pStyle w:val="subsubheading"/>
-        <w:rPr>
-          <w:lang w:val="en-US"/>
-        </w:rPr>
-      </w:pPr>
-      <w:bookmarkStart w:id="15" w:name="_Toc222255049"/>
-      <w:r>
-        <w:rPr>
-          <w:lang w:val="en-US"/>
-        </w:rPr>
-        <w:t>2.2.4. Deep Learning</w:t>
-      </w:r>
-      <w:bookmarkEnd w:id="15"/>
-    </w:p>
-    <w:p>
-      <w:pPr>
-        <w:pStyle w:val="BodyText"/>
-        <w:rPr>
-          <w:lang w:val="en-US"/>
-        </w:rPr>
-      </w:pPr>
-      <w:r>
-        <w:rPr>
-          <w:lang w:val="en-US"/>
-        </w:rPr>
-        <w:t>Deep</w:t>
-      </w:r>
-      <w:r>
-        <w:rPr>
-          <w:lang w:val="en-US"/>
-        </w:rPr>
-        <w:t xml:space="preserve"> learning techniques have been increasingly applied to fraud detection, thanks to their ability to model complex data patterns. Artificial Neural Networks (ANNs) in various forms (</w:t>
-      </w:r>
-      <w:r>
-        <w:rPr>
-          <w:b/>
-          <w:bCs/>
-          <w:lang w:val="en-US"/>
-        </w:rPr>
-        <w:t>multilayer perceptrons, convolutional networks, recurrent networks, graph neural networks</w:t>
-      </w:r>
-      <w:r>
-        <w:rPr>
-          <w:lang w:val="en-US"/>
-        </w:rPr>
-        <w:t>) have been explored. Early works used basic ANNs to classify fraudulent transactions (</w:t>
-      </w:r>
-      <w:r>
-        <w:rPr>
-          <w:lang w:val="en-US"/>
-        </w:rPr>
-        <w:t>Sahin and Duman, 2011</w:t>
-      </w:r>
-      <w:r>
-        <w:rPr>
-          <w:lang w:val="en-US"/>
-        </w:rPr>
-        <w:t xml:space="preserve">; </w:t>
-      </w:r>
-      <w:proofErr w:type="spellStart"/>
-      <w:r>
-        <w:rPr>
-          <w:lang w:val="en-US"/>
-        </w:rPr>
-        <w:t>Bouchti</w:t>
-      </w:r>
-      <w:proofErr w:type="spellEnd"/>
-      <w:r>
-        <w:rPr>
-          <w:lang w:val="en-US"/>
-        </w:rPr>
-        <w:t xml:space="preserve"> </w:t>
-      </w:r>
-      <w:r>
-        <w:rPr>
-          <w:i/>
-          <w:iCs/>
-          <w:lang w:val="en-US"/>
-        </w:rPr>
-        <w:t>et al.</w:t>
-      </w:r>
-      <w:r>
-        <w:rPr>
-          <w:lang w:val="en-US"/>
-        </w:rPr>
-        <w:t>, 2017</w:t>
-      </w:r>
-      <w:r>
-        <w:rPr>
-          <w:lang w:val="en-US"/>
-        </w:rPr>
-        <w:t xml:space="preserve">; </w:t>
-      </w:r>
-      <w:r>
-        <w:rPr>
-          <w:lang w:val="en-US"/>
-        </w:rPr>
-        <w:t xml:space="preserve">Dang </w:t>
-      </w:r>
-      <w:r>
-        <w:rPr>
-          <w:i/>
-          <w:iCs/>
-          <w:lang w:val="en-US"/>
-        </w:rPr>
-        <w:t>et al.</w:t>
-      </w:r>
-      <w:r>
-        <w:rPr>
-          <w:lang w:val="en-US"/>
-        </w:rPr>
-        <w:t>, 2021</w:t>
-      </w:r>
-      <w:r>
-        <w:rPr>
-          <w:lang w:val="en-US"/>
-        </w:rPr>
-        <w:t>), while newer studies leverage specialized architectures. For example, recurrent neural networks (RNNs) and long short-term memory (LSTM) networks can capture sequential patterns in transaction streams (useful for detecting sequential fraud behavior or repeated offenses). Graph Neural Networks (GNNs) have emerged to detect fraud by modeling transactions as graphs (e.g.</w:t>
-      </w:r>
-      <w:r>
-        <w:rPr>
-          <w:lang w:val="en-US"/>
-        </w:rPr>
-        <w:t>,</w:t>
-      </w:r>
-      <w:r>
-        <w:rPr>
-          <w:lang w:val="en-US"/>
-        </w:rPr>
-        <w:t xml:space="preserve"> linking customers, merchants, IP </w:t>
-      </w:r>
-      <w:r>
-        <w:rPr>
-          <w:lang w:val="en-US"/>
-        </w:rPr>
-        <w:lastRenderedPageBreak/>
-        <w:t>addresses)</w:t>
-      </w:r>
-      <w:r>
-        <w:rPr>
-          <w:lang w:val="en-US"/>
-        </w:rPr>
-        <w:t>,</w:t>
-      </w:r>
-      <w:r>
-        <w:rPr>
-          <w:lang w:val="en-US"/>
-        </w:rPr>
-        <w:t xml:space="preserve"> graph-based approaches can uncover organized fraud rings or money laundering patterns by relational analysis (Nicholls et al., 2021). Deep learning has also been combined with other methods: autoencoder networks for anomaly detection (unsupervised) or hybrid deep models with feature extraction followed by classification (</w:t>
-      </w:r>
-      <w:proofErr w:type="spellStart"/>
-      <w:r>
-        <w:rPr>
-          <w:lang w:val="en-US"/>
-        </w:rPr>
-        <w:t>Jurgovsky</w:t>
-      </w:r>
-      <w:proofErr w:type="spellEnd"/>
-      <w:r>
-        <w:rPr>
-          <w:lang w:val="en-US"/>
-        </w:rPr>
-        <w:t xml:space="preserve"> et al., 2018). </w:t>
-      </w:r>
-    </w:p>
-    <w:p>
-      <w:pPr>
-        <w:pStyle w:val="BodyText"/>
-        <w:rPr>
-          <w:lang w:val="en-US"/>
-        </w:rPr>
-      </w:pPr>
-      <w:r>
-        <w:rPr>
-          <w:b/>
-          <w:bCs/>
-          <w:lang w:val="en-US"/>
-        </w:rPr>
-        <w:t>Strengths:</w:t>
-      </w:r>
-      <w:r>
-        <w:rPr>
-          <w:lang w:val="en-US"/>
-        </w:rPr>
-        <w:t xml:space="preserve"> Deep learning models can capture highly nonlinear and intricate patterns that shallow models might miss. They are adept at processing large-scale data and can learn feature representations automatically (reducing the need for manual feature engineering). Some deep models (like GNNs) naturally incorporate network information that is crucial for certain fraud types (e.g.</w:t>
-      </w:r>
-      <w:r>
-        <w:rPr>
-          <w:lang w:val="en-US"/>
-        </w:rPr>
-        <w:t>,</w:t>
-      </w:r>
-      <w:r>
-        <w:rPr>
-          <w:lang w:val="en-US"/>
-        </w:rPr>
-        <w:t xml:space="preserve"> collusive networks). </w:t>
-      </w:r>
-    </w:p>
-    <w:p>
-      <w:pPr>
-        <w:pStyle w:val="BodyText"/>
-        <w:rPr>
-          <w:lang w:val="en-US"/>
-        </w:rPr>
-      </w:pPr>
-      <w:r>
-        <w:rPr>
-          <w:b/>
-          <w:bCs/>
-          <w:lang w:val="en-US"/>
-        </w:rPr>
-        <w:t>Weaknesses:</w:t>
-      </w:r>
-      <w:r>
-        <w:rPr>
-          <w:lang w:val="en-US"/>
-        </w:rPr>
-        <w:t xml:space="preserve"> Deep models typically require even larger training datasets and computational resources</w:t>
-      </w:r>
-      <w:r>
-        <w:rPr>
-          <w:lang w:val="en-US"/>
-        </w:rPr>
-        <w:t xml:space="preserve">, </w:t>
-      </w:r>
-      <w:r>
-        <w:rPr>
-          <w:lang w:val="en-US"/>
-        </w:rPr>
-        <w:t xml:space="preserve">while, </w:t>
-      </w:r>
-      <w:proofErr w:type="gramStart"/>
-      <w:r>
-        <w:rPr>
-          <w:lang w:val="en-US"/>
-        </w:rPr>
-        <w:t>in</w:t>
-      </w:r>
-      <w:proofErr w:type="gramEnd"/>
-      <w:r>
-        <w:rPr>
-          <w:lang w:val="en-US"/>
-        </w:rPr>
-        <w:t xml:space="preserve"> the same time, </w:t>
-      </w:r>
-      <w:r>
-        <w:rPr>
-          <w:lang w:val="en-US"/>
-        </w:rPr>
-        <w:t>performance gains depend on feature availability, scale, and constraints.</w:t>
-      </w:r>
-      <w:r>
-        <w:rPr>
-          <w:lang w:val="en-US"/>
-        </w:rPr>
-        <w:t xml:space="preserve"> They also tend to be </w:t>
-      </w:r>
-      <w:proofErr w:type="gramStart"/>
-      <w:r>
-        <w:rPr>
-          <w:b/>
-          <w:bCs/>
-          <w:lang w:val="en-US"/>
-        </w:rPr>
-        <w:t>black-box</w:t>
-      </w:r>
-      <w:proofErr w:type="gramEnd"/>
-      <w:r>
-        <w:rPr>
-          <w:lang w:val="en-US"/>
-        </w:rPr>
-        <w:t xml:space="preserve"> in nature, raising explainability concerns.  </w:t>
-      </w:r>
-      <w:proofErr w:type="gramStart"/>
-      <w:r>
-        <w:rPr>
-          <w:lang w:val="en-US"/>
-        </w:rPr>
-        <w:t>Also</w:t>
-      </w:r>
-      <w:proofErr w:type="gramEnd"/>
-      <w:r>
-        <w:rPr>
-          <w:lang w:val="en-US"/>
-        </w:rPr>
-        <w:t xml:space="preserve"> deep learning algorithms have very high capacity and are more likely to overfit, if not treated with caution. </w:t>
-      </w:r>
-    </w:p>
-    <w:p>
-      <w:pPr>
-        <w:pStyle w:val="subsubheading"/>
-        <w:rPr>
-          <w:rStyle w:val="subsubheadingChar"/>
-          <w:b/>
-          <w:lang w:val="en-US"/>
-        </w:rPr>
-      </w:pPr>
-      <w:bookmarkStart w:id="16" w:name="_Toc222255050"/>
-      <w:r>
-        <w:rPr>
-          <w:rStyle w:val="subsubheadingChar"/>
-          <w:b/>
-          <w:lang w:val="en-US"/>
-        </w:rPr>
-        <w:t>2.2.6. Comparison of Approaches</w:t>
-      </w:r>
-      <w:bookmarkEnd w:id="16"/>
-    </w:p>
-    <w:p>
-      <w:pPr>
-        <w:pStyle w:val="BodyText"/>
-        <w:rPr>
-          <w:lang w:val="en-US"/>
-        </w:rPr>
-      </w:pPr>
-      <w:r>
-        <w:rPr>
-          <w:lang w:val="en-US"/>
-        </w:rPr>
-        <w:t>In practice, the choice of approach depends on label availability, operational constraints, and the expected rate of novel fraud. Supervised models and ensembles typically perform strongly when representative labeled data are available, while unsupervised methods are often used to surface anomalies and previously unseen patterns, at the cost of higher false-positive rates. Deep learning approaches can be beneficial when richer structure is available (e.g., sequences or relational graphs), but they require careful design and sufficient data to avoid overfitting. Consequently, hybrid systems</w:t>
-      </w:r>
-      <w:r>
-        <w:rPr>
-          <w:lang w:val="en-US"/>
-        </w:rPr>
-        <w:t xml:space="preserve">, </w:t>
-      </w:r>
-      <w:r>
-        <w:rPr>
-          <w:lang w:val="en-US"/>
-        </w:rPr>
-        <w:t>combining supervised learning with complementary anomaly signals and continuous monitoring</w:t>
-      </w:r>
-      <w:r>
-        <w:rPr>
-          <w:lang w:val="en-US"/>
-        </w:rPr>
-        <w:t xml:space="preserve">, </w:t>
-      </w:r>
-      <w:r>
-        <w:rPr>
-          <w:lang w:val="en-US"/>
-        </w:rPr>
-        <w:t>are common in applied fraud detection settings (Ali et al., 2022).</w:t>
-      </w:r>
-      <w:r>
-        <w:rPr>
-          <w:lang w:val="en-US"/>
-        </w:rPr>
-        <w:t xml:space="preserve"> </w:t>
-      </w:r>
-      <w:r>
-        <w:rPr>
-          <w:lang w:val="en-US"/>
-        </w:rPr>
-        <w:t>Overall, the literature suggests that no single modeling paradigm is universally optimal for fraud detection</w:t>
-      </w:r>
-      <w:r>
-        <w:rPr>
-          <w:lang w:val="en-US"/>
-        </w:rPr>
-        <w:t>,</w:t>
-      </w:r>
-      <w:r>
-        <w:rPr>
-          <w:lang w:val="en-US"/>
-        </w:rPr>
-        <w:t xml:space="preserve"> instead, </w:t>
-      </w:r>
-      <w:r>
-        <w:rPr>
-          <w:b/>
-          <w:bCs/>
-          <w:lang w:val="en-US"/>
-        </w:rPr>
         <w:t>ensemble-based supervised approaches tend to offer the most favorable balance</w:t>
       </w:r>
       <w:r>
@@ -9704,7 +9614,7 @@
         <w:pStyle w:val="Subheading"/>
       </w:pPr>
       <w:bookmarkStart w:id="17" w:name="datasets-and-benchmarks"/>
-      <w:bookmarkStart w:id="18" w:name="_Toc222255051"/>
+      <w:bookmarkStart w:id="18" w:name="_Toc222327474"/>
       <w:bookmarkEnd w:id="10"/>
       <w:r>
         <w:lastRenderedPageBreak/>
@@ -9780,21 +9690,7 @@
         <w:rPr>
           <w:lang w:val="en-US"/>
         </w:rPr>
-        <w:t xml:space="preserve"> </w:t>
-      </w:r>
-      <w:proofErr w:type="gramStart"/>
-      <w:r>
-        <w:rPr>
-          <w:lang w:val="en-US"/>
-        </w:rPr>
-        <w:t>datasets</w:t>
-      </w:r>
-      <w:proofErr w:type="gramEnd"/>
-      <w:r>
-        <w:rPr>
-          <w:lang w:val="en-US"/>
-        </w:rPr>
-        <w:t xml:space="preserve"> and benchmarks in the field:</w:t>
+        <w:t xml:space="preserve"> datasets and benchmarks in the field:</w:t>
       </w:r>
     </w:p>
     <w:p>
@@ -10036,21 +9932,7 @@
         <w:rPr>
           <w:lang w:val="en-US"/>
         </w:rPr>
-        <w:t xml:space="preserve"> is valuable for research because it provides large-scale data with realistic behavior for fraud (though </w:t>
-      </w:r>
-      <w:proofErr w:type="gramStart"/>
-      <w:r>
-        <w:rPr>
-          <w:lang w:val="en-US"/>
-        </w:rPr>
-        <w:t>the fraud</w:t>
-      </w:r>
-      <w:proofErr w:type="gramEnd"/>
-      <w:r>
-        <w:rPr>
-          <w:lang w:val="en-US"/>
-        </w:rPr>
-        <w:t xml:space="preserve"> instances are simulated). Several studies have used </w:t>
+        <w:t xml:space="preserve"> is valuable for research because it provides large-scale data with realistic behavior for fraud (though the fraud instances are simulated). Several studies have used </w:t>
       </w:r>
       <w:proofErr w:type="spellStart"/>
       <w:r>
@@ -10147,21 +10029,7 @@
         <w:rPr>
           <w:lang w:val="en-US"/>
         </w:rPr>
-        <w:t xml:space="preserve"> is another simulator-based dataset (simulated from a Spanish bank’s data sample) that provides transactions with attributes like customer ID, merchant, location, etc., along with fraud labels (Lopez-Rojas et al., 2014). It has been used in studies focusing on fraud detection in banking transactions and often for testing pattern recognition algorithms in a controlled environment (Hernandez Aros et al., 2024). </w:t>
-      </w:r>
-      <w:proofErr w:type="gramStart"/>
-      <w:r>
-        <w:rPr>
-          <w:lang w:val="en-US"/>
-        </w:rPr>
-        <w:t>Similar to</w:t>
-      </w:r>
-      <w:proofErr w:type="gramEnd"/>
-      <w:r>
-        <w:rPr>
-          <w:lang w:val="en-US"/>
-        </w:rPr>
-        <w:t xml:space="preserve"> </w:t>
+        <w:t xml:space="preserve"> is another simulator-based dataset (simulated from a Spanish bank’s data sample) that provides transactions with attributes like customer ID, merchant, location, etc., along with fraud labels (Lopez-Rojas et al., 2014). It has been used in studies focusing on fraud detection in banking transactions and often for testing pattern recognition algorithms in a controlled environment (Hernandez Aros et al., 2024). Similar to </w:t>
       </w:r>
       <w:proofErr w:type="spellStart"/>
       <w:r>
@@ -10235,21 +10103,7 @@
         <w:rPr>
           <w:lang w:val="en-US"/>
         </w:rPr>
-        <w:t xml:space="preserve"> literature reviews have found that </w:t>
-      </w:r>
-      <w:proofErr w:type="gramStart"/>
-      <w:r>
-        <w:rPr>
-          <w:lang w:val="en-US"/>
-        </w:rPr>
-        <w:t>a majority of</w:t>
-      </w:r>
-      <w:proofErr w:type="gramEnd"/>
-      <w:r>
-        <w:rPr>
-          <w:lang w:val="en-US"/>
-        </w:rPr>
-        <w:t xml:space="preserve"> studies now use real datasets in experiments, with relatively few relying solely on synthetic data (Hernandez Aros et al., 2024). This suggests a push towards evaluating models on realistic data distributions. The availability of open datasets like the ULB credit card data and various Kaggle datasets has facilitated this. However, obtaining real fraud data beyond these public sets remains a challenge – many researchers collaborate with financial institutions to test their models on private datasets (e.g., a bank’s internal transaction logs), but such results may not be fully public. Synthetic datasets (like </w:t>
+        <w:t xml:space="preserve"> literature reviews have found that a majority of studies now use real datasets in experiments, with relatively few relying solely on synthetic data (Hernandez Aros et al., 2024). This suggests a push towards evaluating models on realistic data distributions. The availability of open datasets like the ULB credit card data and various Kaggle datasets has facilitated this. However, obtaining real fraud data beyond these public sets remains a challenge – many researchers collaborate with financial institutions to test their models on private datasets (e.g., a bank’s internal transaction logs), but such results may not be fully public. Synthetic datasets (like </w:t>
       </w:r>
       <w:proofErr w:type="spellStart"/>
       <w:r>
@@ -10271,7 +10125,7 @@
         <w:pStyle w:val="Subheading"/>
       </w:pPr>
       <w:bookmarkStart w:id="19" w:name="feature-engineering-for-fraud-detection"/>
-      <w:bookmarkStart w:id="20" w:name="_Toc222255052"/>
+      <w:bookmarkStart w:id="20" w:name="_Toc222327475"/>
       <w:bookmarkEnd w:id="17"/>
       <w:r>
         <w:lastRenderedPageBreak/>
@@ -10347,21 +10201,7 @@
         <w:rPr>
           <w:lang w:val="en-US"/>
         </w:rPr>
-        <w:t xml:space="preserve">. Prior studies often derive features based on how </w:t>
-      </w:r>
-      <w:proofErr w:type="gramStart"/>
-      <w:r>
-        <w:rPr>
-          <w:lang w:val="en-US"/>
-        </w:rPr>
-        <w:t>recently</w:t>
-      </w:r>
-      <w:proofErr w:type="gramEnd"/>
-      <w:r>
-        <w:rPr>
-          <w:lang w:val="en-US"/>
-        </w:rPr>
-        <w:t xml:space="preserve"> transactions have occurred, how frequently they </w:t>
+        <w:t xml:space="preserve">. Prior studies often derive features based on how recently transactions have occurred, how frequently they </w:t>
       </w:r>
       <w:r>
         <w:rPr>
@@ -10373,21 +10213,7 @@
         <w:rPr>
           <w:lang w:val="en-US"/>
         </w:rPr>
-        <w:t xml:space="preserve"> </w:t>
-      </w:r>
-      <w:proofErr w:type="gramStart"/>
-      <w:r>
-        <w:rPr>
-          <w:lang w:val="en-US"/>
-        </w:rPr>
-        <w:t>in a given</w:t>
-      </w:r>
-      <w:proofErr w:type="gramEnd"/>
-      <w:r>
-        <w:rPr>
-          <w:lang w:val="en-US"/>
-        </w:rPr>
-        <w:t xml:space="preserve"> period, and the monetary values involved (Ti et al., 2022). For example, features can include the time since last transaction, number of transactions in the past 24 hours (or past week, month, etc.), average transaction amount, and maximum transaction amount. These RFM features help characterize if an account’s recent behavior deviates from its usual pattern. </w:t>
+        <w:t xml:space="preserve"> in a given period, and the monetary values involved (Ti et al., 2022). For example, features can include the time since last transaction, number of transactions in the past 24 hours (or past week, month, etc.), average transaction amount, and maximum transaction amount. These RFM features help characterize if an account’s recent behavior deviates from its usual pattern. </w:t>
       </w:r>
     </w:p>
     <w:p>
@@ -10455,21 +10281,7 @@
         <w:rPr>
           <w:lang w:val="en-US"/>
         </w:rPr>
-        <w:t xml:space="preserve"> Timing is critical in fraud. Features capturing temporal patterns include time-of-day or day-of-</w:t>
-      </w:r>
-      <w:proofErr w:type="gramStart"/>
-      <w:r>
-        <w:rPr>
-          <w:lang w:val="en-US"/>
-        </w:rPr>
-        <w:t>week of</w:t>
-      </w:r>
-      <w:proofErr w:type="gramEnd"/>
-      <w:r>
-        <w:rPr>
-          <w:lang w:val="en-US"/>
-        </w:rPr>
-        <w:t xml:space="preserve"> transactions (fraud might happen at unusual times for a given user), velocity features (e.g., number of transactions in the last hour), and sequence patterns (like rapid successive transactions at different merchants). ML models can learn such thresholds if provided </w:t>
+        <w:t xml:space="preserve"> Timing is critical in fraud. Features capturing temporal patterns include time-of-day or day-of-week of transactions (fraud might happen at unusual times for a given user), velocity features (e.g., number of transactions in the last hour), and sequence patterns (like rapid successive transactions at different merchants). ML models can learn such thresholds if provided </w:t>
       </w:r>
       <w:r>
         <w:rPr>
@@ -10651,7 +10463,7 @@
       <w:pPr>
         <w:pStyle w:val="Subheading"/>
       </w:pPr>
-      <w:bookmarkStart w:id="22" w:name="_Toc222255053"/>
+      <w:bookmarkStart w:id="22" w:name="_Toc222327476"/>
       <w:r>
         <w:t xml:space="preserve">2.5. </w:t>
       </w:r>
@@ -10770,7 +10582,7 @@
       <w:pPr>
         <w:pStyle w:val="Subheading"/>
       </w:pPr>
-      <w:bookmarkStart w:id="24" w:name="_Toc222255054"/>
+      <w:bookmarkStart w:id="24" w:name="_Toc222327477"/>
       <w:r>
         <w:lastRenderedPageBreak/>
         <w:t xml:space="preserve">2.6. </w:t>
@@ -10791,21 +10603,7 @@
         <w:rPr>
           <w:lang w:val="en-US"/>
         </w:rPr>
-        <w:t xml:space="preserve">Despite substantial progress, deploying machine learning for fraud detection in online financial systems faces numerous challenges and limitations. These arise from the inherent nature of fraud (adaptive adversaries, rarity of events) and practical constraints (data privacy, system scalability, etc.). We outline the key challenges identified in </w:t>
-      </w:r>
-      <w:proofErr w:type="gramStart"/>
-      <w:r>
-        <w:rPr>
-          <w:lang w:val="en-US"/>
-        </w:rPr>
-        <w:t>the literature</w:t>
-      </w:r>
-      <w:proofErr w:type="gramEnd"/>
-      <w:r>
-        <w:rPr>
-          <w:lang w:val="en-US"/>
-        </w:rPr>
-        <w:t xml:space="preserve"> and their implications:</w:t>
+        <w:t>Despite substantial progress, deploying machine learning for fraud detection in online financial systems faces numerous challenges and limitations. These arise from the inherent nature of fraud (adaptive adversaries, rarity of events) and practical constraints (data privacy, system scalability, etc.). We outline the key challenges identified in the literature and their implications:</w:t>
       </w:r>
     </w:p>
     <w:p>
@@ -10827,36 +10625,14 @@
         <w:rPr>
           <w:lang w:val="en-US"/>
         </w:rPr>
-        <w:t xml:space="preserve"> As </w:t>
-      </w:r>
-      <w:proofErr w:type="gramStart"/>
-      <w:r>
-        <w:rPr>
-          <w:lang w:val="en-US"/>
-        </w:rPr>
-        <w:t>noted</w:t>
-      </w:r>
-      <w:proofErr w:type="gramEnd"/>
-      <w:r>
-        <w:rPr>
-          <w:lang w:val="en-US"/>
-        </w:rPr>
-        <w:t xml:space="preserve"> multiple times, fraud datasets are extremely imbalanced – genuine transactions vastly outnumber fraudulent ones (Hernandez Aros et al., 2024). ML models tend to be biased towards predicting the majority class (“not fraud”), potentially missing many frauds unless carefully trained</w:t>
-      </w:r>
-      <w:r>
-        <w:rPr>
-          <w:lang w:val="en-US"/>
-        </w:rPr>
-        <w:t xml:space="preserve">. </w:t>
-      </w:r>
-      <w:proofErr w:type="gramStart"/>
-      <w:r>
-        <w:rPr>
-          <w:lang w:val="en-US"/>
-        </w:rPr>
-        <w:t>Also</w:t>
-      </w:r>
-      <w:proofErr w:type="gramEnd"/>
+        <w:t xml:space="preserve"> As noted multiple times, fraud datasets are extremely imbalanced – genuine transactions vastly outnumber fraudulent ones (Hernandez Aros et al., 2024). ML models tend to be biased towards predicting the majority class (“not fraud”), potentially missing many frauds unless carefully trained</w:t>
+      </w:r>
+      <w:r>
+        <w:rPr>
+          <w:lang w:val="en-US"/>
+        </w:rPr>
+        <w:t>. Also</w:t>
+      </w:r>
       <w:r>
         <w:rPr>
           <w:lang w:val="en-US"/>
@@ -10955,28 +10731,7 @@
         <w:rPr>
           <w:lang w:val="en-US"/>
         </w:rPr>
-        <w:t xml:space="preserve"> models must be updated frequently. Ali et al. (2022) </w:t>
-      </w:r>
-      <w:proofErr w:type="gramStart"/>
-      <w:r>
-        <w:rPr>
-          <w:lang w:val="en-US"/>
-        </w:rPr>
-        <w:t>observe</w:t>
-      </w:r>
-      <w:proofErr w:type="gramEnd"/>
-      <w:r>
-        <w:rPr>
-          <w:lang w:val="en-US"/>
-        </w:rPr>
-        <w:t xml:space="preserve"> that addressing concept drift by retraining periodically incurs high overhead, and model performance can suffer between retraining cycles. Online learning algorithms or incremental updates are potential </w:t>
-      </w:r>
-      <w:proofErr w:type="gramStart"/>
-      <w:r>
-        <w:rPr>
-          <w:lang w:val="en-US"/>
-        </w:rPr>
-        <w:t>solutions</w:t>
+        <w:t xml:space="preserve"> models must be updated frequently. Ali et al. (2022) observe that addressing concept drift by retraining periodically incurs high overhead, and model performance can suffer between retraining cycles. Online learning algorithms or incremental updates are potential solutions</w:t>
       </w:r>
       <w:r>
         <w:rPr>
@@ -10988,48 +10743,13 @@
         <w:rPr>
           <w:lang w:val="en-US"/>
         </w:rPr>
-        <w:t xml:space="preserve"> but</w:t>
-      </w:r>
-      <w:proofErr w:type="gramEnd"/>
-      <w:r>
-        <w:rPr>
-          <w:lang w:val="en-US"/>
-        </w:rPr>
-        <w:t xml:space="preserve"> are complex to </w:t>
-      </w:r>
-      <w:proofErr w:type="gramStart"/>
-      <w:r>
-        <w:rPr>
-          <w:lang w:val="en-US"/>
-        </w:rPr>
-        <w:t>engineer</w:t>
-      </w:r>
-      <w:proofErr w:type="gramEnd"/>
-      <w:r>
-        <w:rPr>
-          <w:lang w:val="en-US"/>
-        </w:rPr>
-        <w:t xml:space="preserve">. Reinforcement learning approaches are one idea to handle non-stationarity by continuous adaptation (Patel et al., 2025), but this is still nascent. In practice, a combination of human analyst feedback and model retraining on recent data is used to tackle drift, but this lag means new fraud types can still cause damage before models catch up. The challenge is essentially a cat-and-mouse game with </w:t>
-      </w:r>
-      <w:proofErr w:type="gramStart"/>
-      <w:r>
-        <w:rPr>
-          <w:lang w:val="en-US"/>
-        </w:rPr>
-        <w:t>adversaries</w:t>
-      </w:r>
-      <w:r>
-        <w:rPr>
-          <w:lang w:val="en-US"/>
-        </w:rPr>
-        <w:t>,</w:t>
-      </w:r>
-      <w:proofErr w:type="gramEnd"/>
-      <w:r>
-        <w:rPr>
-          <w:lang w:val="en-US"/>
-        </w:rPr>
-        <w:t xml:space="preserve"> </w:t>
+        <w:t xml:space="preserve"> but are complex to engineer. Reinforcement learning approaches are one idea to handle non-stationarity by continuous adaptation (Patel et al., 2025), but this is still nascent. In practice, a combination of human analyst feedback and model retraining on recent data is used to tackle drift, but this lag means new fraud types can still cause damage before models catch up. The challenge is essentially a cat-and-mouse game with adversaries</w:t>
+      </w:r>
+      <w:r>
+        <w:rPr>
+          <w:lang w:val="en-US"/>
+        </w:rPr>
+        <w:t xml:space="preserve">, </w:t>
       </w:r>
       <w:r>
         <w:rPr>
@@ -11253,7 +10973,7 @@
       <w:pPr>
         <w:pStyle w:val="Subheading"/>
       </w:pPr>
-      <w:bookmarkStart w:id="26" w:name="_Toc222255055"/>
+      <w:bookmarkStart w:id="26" w:name="_Toc222327478"/>
       <w:r>
         <w:t>2.7. Tools, Libraries, and Frameworks</w:t>
       </w:r>
@@ -11332,7 +11052,7 @@
           <w:lang w:val="en-US"/>
         </w:rPr>
       </w:pPr>
-      <w:bookmarkStart w:id="27" w:name="_Toc222255056"/>
+      <w:bookmarkStart w:id="27" w:name="_Toc222327479"/>
       <w:r>
         <w:rPr>
           <w:lang w:val="en-US"/>
@@ -11367,21 +11087,7 @@
           <w:lang w:val="en-US"/>
         </w:rPr>
         <w:lastRenderedPageBreak/>
-        <w:t xml:space="preserve">learning algorithms, and the flexibility it provides for experimentation. In fraud detection, Python is commonly used for: (a) data processing and feature engineering, (b) training and evaluating models, (c) interpreting model behavior, and (d) experiment tracking and reproducibility. </w:t>
-      </w:r>
-      <w:proofErr w:type="gramStart"/>
-      <w:r>
-        <w:rPr>
-          <w:lang w:val="en-US"/>
-        </w:rPr>
-        <w:t>The literature</w:t>
-      </w:r>
-      <w:proofErr w:type="gramEnd"/>
-      <w:r>
-        <w:rPr>
-          <w:lang w:val="en-US"/>
-        </w:rPr>
-        <w:t xml:space="preserve"> frequently adopts Python because it lowers the implementation barrier and enables direct reuse of standard evaluation pipelines.</w:t>
+        <w:t>learning algorithms, and the flexibility it provides for experimentation. In fraud detection, Python is commonly used for: (a) data processing and feature engineering, (b) training and evaluating models, (c) interpreting model behavior, and (d) experiment tracking and reproducibility. The literature frequently adopts Python because it lowers the implementation barrier and enables direct reuse of standard evaluation pipelines.</w:t>
       </w:r>
     </w:p>
     <w:p>
@@ -11455,7 +11161,7 @@
           <w:lang w:val="en-US"/>
         </w:rPr>
       </w:pPr>
-      <w:bookmarkStart w:id="28" w:name="_Toc222255057"/>
+      <w:bookmarkStart w:id="28" w:name="_Toc222327480"/>
       <w:r>
         <w:rPr>
           <w:lang w:val="en-US"/>
@@ -11495,7 +11201,6 @@
           <w:lang w:val="en-US"/>
         </w:rPr>
       </w:pPr>
-      <w:proofErr w:type="gramStart"/>
       <w:r>
         <w:rPr>
           <w:b/>
@@ -11504,26 +11209,11 @@
         </w:rPr>
         <w:t>pandas</w:t>
       </w:r>
-      <w:proofErr w:type="gramEnd"/>
-      <w:r>
-        <w:rPr>
-          <w:lang w:val="en-US"/>
-        </w:rPr>
-        <w:t xml:space="preserve"> </w:t>
-      </w:r>
-      <w:proofErr w:type="gramStart"/>
-      <w:r>
-        <w:rPr>
-          <w:lang w:val="en-US"/>
-        </w:rPr>
-        <w:t>is</w:t>
-      </w:r>
-      <w:proofErr w:type="gramEnd"/>
-      <w:r>
-        <w:rPr>
-          <w:lang w:val="en-US"/>
-        </w:rPr>
-        <w:t xml:space="preserve"> widely used for data manipulation, joining tables, missing value treatment, aggregation, and feature creation. It supports rapid experimentation and readable transformations, which is why it dominates in notebook-based research workflows.</w:t>
+      <w:r>
+        <w:rPr>
+          <w:lang w:val="en-US"/>
+        </w:rPr>
+        <w:t xml:space="preserve"> is widely used for data manipulation, joining tables, missing value treatment, aggregation, and feature creation. It supports rapid experimentation and readable transformations, which is why it dominates in notebook-based research workflows.</w:t>
       </w:r>
     </w:p>
     <w:p>
@@ -11628,7 +11318,7 @@
           <w:lang w:val="en-US"/>
         </w:rPr>
       </w:pPr>
-      <w:bookmarkStart w:id="29" w:name="_Toc222255058"/>
+      <w:bookmarkStart w:id="29" w:name="_Toc222327481"/>
       <w:r>
         <w:rPr>
           <w:lang w:val="en-US"/>
@@ -11723,21 +11413,7 @@
         <w:rPr>
           <w:lang w:val="en-US"/>
         </w:rPr>
-        <w:t xml:space="preserve"> frameworks are among the most successful choices in practice. They handle mixed feature types well, capture nonlinear interactions, and often provide strong performance without requiring the very </w:t>
-      </w:r>
-      <w:proofErr w:type="gramStart"/>
-      <w:r>
-        <w:rPr>
-          <w:lang w:val="en-US"/>
-        </w:rPr>
-        <w:t>large labeled</w:t>
-      </w:r>
-      <w:proofErr w:type="gramEnd"/>
-      <w:r>
-        <w:rPr>
-          <w:lang w:val="en-US"/>
-        </w:rPr>
-        <w:t xml:space="preserve"> datasets typically needed by deep learning. </w:t>
+        <w:t xml:space="preserve"> frameworks are among the most successful choices in practice. They handle mixed feature types well, capture nonlinear interactions, and often provide strong performance without requiring the very large labeled datasets typically needed by deep learning. </w:t>
       </w:r>
       <w:r>
         <w:t xml:space="preserve">The </w:t>
@@ -11806,21 +11482,7 @@
         <w:rPr>
           <w:lang w:val="en-US"/>
         </w:rPr>
-        <w:t xml:space="preserve">, which is highly optimized and widely adopted in fraud detection competitions and production systems. It supports regularization, missing value handling, and efficient training, and it has been a </w:t>
-      </w:r>
-      <w:proofErr w:type="gramStart"/>
-      <w:r>
-        <w:rPr>
-          <w:lang w:val="en-US"/>
-        </w:rPr>
-        <w:t>common benchmark</w:t>
-      </w:r>
-      <w:proofErr w:type="gramEnd"/>
-      <w:r>
-        <w:rPr>
-          <w:lang w:val="en-US"/>
-        </w:rPr>
-        <w:t xml:space="preserve"> model in fraud literature.</w:t>
+        <w:t>, which is highly optimized and widely adopted in fraud detection competitions and production systems. It supports regularization, missing value handling, and efficient training, and it has been a common benchmark model in fraud literature.</w:t>
       </w:r>
     </w:p>
     <w:p>
@@ -12009,7 +11671,7 @@
           <w:lang w:val="en-US"/>
         </w:rPr>
       </w:pPr>
-      <w:bookmarkStart w:id="30" w:name="_Toc222255059"/>
+      <w:bookmarkStart w:id="30" w:name="_Toc222327482"/>
       <w:r>
         <w:rPr>
           <w:lang w:val="en-US"/>
@@ -12174,16 +11836,8 @@
         <w:rPr>
           <w:lang w:val="en-US"/>
         </w:rPr>
-        <w:t xml:space="preserve">In many fraud detection projects, experiment tracking is not just </w:t>
-      </w:r>
-      <w:proofErr w:type="gramStart"/>
-      <w:r>
-        <w:rPr>
-          <w:lang w:val="en-US"/>
-        </w:rPr>
-        <w:t>convenience</w:t>
-      </w:r>
-      <w:proofErr w:type="gramEnd"/>
+        <w:t>In many fraud detection projects, experiment tracking is not just convenience</w:t>
+      </w:r>
       <w:r>
         <w:rPr>
           <w:lang w:val="en-US"/>
@@ -12204,7 +11858,7 @@
           <w:lang w:val="en-US"/>
         </w:rPr>
       </w:pPr>
-      <w:bookmarkStart w:id="31" w:name="_Toc222255060"/>
+      <w:bookmarkStart w:id="31" w:name="_Toc222327483"/>
       <w:r>
         <w:rPr>
           <w:lang w:val="en-US"/>
@@ -12497,7 +12151,7 @@
           <w:lang w:val="en-US"/>
         </w:rPr>
       </w:pPr>
-      <w:bookmarkStart w:id="32" w:name="_Toc222255061"/>
+      <w:bookmarkStart w:id="32" w:name="_Toc222327484"/>
       <w:r>
         <w:rPr>
           <w:lang w:val="en-US"/>
@@ -12630,7 +12284,7 @@
           <w:lang w:val="en-US"/>
         </w:rPr>
       </w:pPr>
-      <w:bookmarkStart w:id="33" w:name="_Toc222255062"/>
+      <w:bookmarkStart w:id="33" w:name="_Toc222327485"/>
       <w:r>
         <w:rPr>
           <w:lang w:val="en-US"/>
@@ -12650,21 +12304,7 @@
         <w:rPr>
           <w:lang w:val="en-US"/>
         </w:rPr>
-        <w:t xml:space="preserve">Fraud detection work involves extensive </w:t>
-      </w:r>
-      <w:proofErr w:type="gramStart"/>
-      <w:r>
-        <w:rPr>
-          <w:lang w:val="en-US"/>
-        </w:rPr>
-        <w:t>exploratory</w:t>
-      </w:r>
-      <w:proofErr w:type="gramEnd"/>
-      <w:r>
-        <w:rPr>
-          <w:lang w:val="en-US"/>
-        </w:rPr>
-        <w:t xml:space="preserve"> analysis because the data is complex and fraud patterns can be subtle. Visualization tools help detect distribution shifts, leakage risks, and feature anomalies.</w:t>
+        <w:t>Fraud detection work involves extensive exploratory analysis because the data is complex and fraud patterns can be subtle. Visualization tools help detect distribution shifts, leakage risks, and feature anomalies.</w:t>
       </w:r>
     </w:p>
     <w:p>
@@ -12740,7 +12380,6 @@
           <w:lang w:val="en-US"/>
         </w:rPr>
       </w:pPr>
-      <w:proofErr w:type="gramStart"/>
       <w:r>
         <w:rPr>
           <w:b/>
@@ -12749,7 +12388,6 @@
         </w:rPr>
         <w:t>seaborn</w:t>
       </w:r>
-      <w:proofErr w:type="gramEnd"/>
       <w:r>
         <w:rPr>
           <w:lang w:val="en-US"/>
@@ -12793,7 +12431,7 @@
           <w:lang w:val="en-US"/>
         </w:rPr>
       </w:pPr>
-      <w:bookmarkStart w:id="34" w:name="_Toc222255063"/>
+      <w:bookmarkStart w:id="34" w:name="_Toc222327486"/>
       <w:r>
         <w:rPr>
           <w:lang w:val="en-US"/>
@@ -12827,21 +12465,7 @@
         <w:rPr>
           <w:lang w:val="en-US"/>
         </w:rPr>
-        <w:t xml:space="preserve">In industry, models are typically </w:t>
-      </w:r>
-      <w:proofErr w:type="gramStart"/>
-      <w:r>
-        <w:rPr>
-          <w:lang w:val="en-US"/>
-        </w:rPr>
-        <w:t>deployed</w:t>
-      </w:r>
-      <w:proofErr w:type="gramEnd"/>
-      <w:r>
-        <w:rPr>
-          <w:lang w:val="en-US"/>
-        </w:rPr>
-        <w:t xml:space="preserve"> as:</w:t>
+        <w:t>In industry, models are typically deployed as:</w:t>
       </w:r>
     </w:p>
     <w:p>
@@ -13011,21 +12635,7 @@
         <w:rPr>
           <w:lang w:val="en-US"/>
         </w:rPr>
-        <w:t xml:space="preserve">Even when deployment frameworks are not used directly in a thesis, describing them is helpful because it frames the gap between “offline metrics” and “real operational value.” </w:t>
-      </w:r>
-      <w:proofErr w:type="gramStart"/>
-      <w:r>
-        <w:rPr>
-          <w:lang w:val="en-US"/>
-        </w:rPr>
-        <w:t>In particular, fraud</w:t>
-      </w:r>
-      <w:proofErr w:type="gramEnd"/>
-      <w:r>
-        <w:rPr>
-          <w:lang w:val="en-US"/>
-        </w:rPr>
-        <w:t xml:space="preserve"> detection systems must manage concept drift and changing adversarial behavior; therefore, tooling for monitoring and retraining becomes part of the broader ecosystem.</w:t>
+        <w:t>Even when deployment frameworks are not used directly in a thesis, describing them is helpful because it frames the gap between “offline metrics” and “real operational value.” In particular, fraud detection systems must manage concept drift and changing adversarial behavior; therefore, tooling for monitoring and retraining becomes part of the broader ecosystem.</w:t>
       </w:r>
     </w:p>
     <w:p>
@@ -13035,7 +12645,7 @@
           <w:lang w:val="en-US"/>
         </w:rPr>
       </w:pPr>
-      <w:bookmarkStart w:id="35" w:name="_Toc222255064"/>
+      <w:bookmarkStart w:id="35" w:name="_Toc222327487"/>
       <w:r>
         <w:rPr>
           <w:lang w:val="en-US"/>
@@ -13120,7 +12730,7 @@
         <w:pStyle w:val="Subheading"/>
       </w:pPr>
       <w:bookmarkStart w:id="36" w:name="conclusion"/>
-      <w:bookmarkStart w:id="37" w:name="_Toc222255065"/>
+      <w:bookmarkStart w:id="37" w:name="_Toc222327488"/>
       <w:bookmarkEnd w:id="25"/>
       <w:r>
         <w:t>2.</w:t>
@@ -13275,7 +12885,7 @@
         </w:rPr>
       </w:pPr>
       <w:bookmarkStart w:id="38" w:name="_3._Methodology"/>
-      <w:bookmarkStart w:id="39" w:name="_Toc222255066"/>
+      <w:bookmarkStart w:id="39" w:name="_Toc222327489"/>
       <w:bookmarkEnd w:id="38"/>
       <w:r>
         <w:rPr>
@@ -13325,21 +12935,7 @@
         <w:rPr>
           <w:lang w:val="en-US"/>
         </w:rPr>
-        <w:t xml:space="preserve">Initially, </w:t>
-      </w:r>
-      <w:proofErr w:type="gramStart"/>
-      <w:r>
-        <w:rPr>
-          <w:lang w:val="en-US"/>
-        </w:rPr>
-        <w:t>exploratory</w:t>
-      </w:r>
-      <w:proofErr w:type="gramEnd"/>
-      <w:r>
-        <w:rPr>
-          <w:lang w:val="en-US"/>
-        </w:rPr>
-        <w:t xml:space="preserve"> data analysis (EDA) was conducted to understand the distributional properties of the data, assess class imbalance, and identify relationships between candidate features and the target variable (fraud vs. non-fraud)</w:t>
+        <w:t>Initially, exploratory data analysis (EDA) was conducted to understand the distributional properties of the data, assess class imbalance, and identify relationships between candidate features and the target variable (fraud vs. non-fraud)</w:t>
       </w:r>
       <w:r>
         <w:rPr>
@@ -13389,7 +12985,19 @@
         <w:rPr>
           <w:lang w:val="en-US"/>
         </w:rPr>
-        <w:t>After completing the data analysis phase, we prepared the dataset for model training. No feature scaling or encoding was applied, as all employed algorithms are tree-based and provide built-in support for categorical variables, while also being insensitive to feature scaling. Since the dataset contains transaction timestamps, observations are ordered chronologically. The data are therefore split based on time, with the first 80% used for training and the remaining 20% reserved as a held-out test set.</w:t>
+        <w:t>After completing the data analysis phase, we prepared the dataset for model training. No feature scaling or encoding was applied, as all employed algorithms are tree-based and provide built-in support for categorical variables, while also being insensitive to feature scaling.</w:t>
+      </w:r>
+      <w:r>
+        <w:rPr>
+          <w:lang w:val="en-US"/>
+        </w:rPr>
+        <w:t xml:space="preserve"> (For other algorithms that were tried, we used one-hot encoding for low cardinality categorical features, and frequency encoding for the rest. Also we used standard scaler).</w:t>
+      </w:r>
+      <w:r>
+        <w:rPr>
+          <w:lang w:val="en-US"/>
+        </w:rPr>
+        <w:t xml:space="preserve"> Since the dataset contains transaction timestamps, observations are ordered chronologically. The data are therefore split based on time, with the first 80% used for training and the remaining 20% reserved as a held-out test set.</w:t>
       </w:r>
       <w:r>
         <w:rPr>
@@ -13403,6 +13011,18 @@
         </w:rPr>
         <w:t>This time-based split prevents information leakage from future transactions into the training process and more accurately reflects real-world deployment, where models are trained on historical data and applied to future transactions.</w:t>
       </w:r>
+      <w:r>
+        <w:rPr>
+          <w:lang w:val="en-US"/>
+        </w:rPr>
+        <w:t xml:space="preserve"> </w:t>
+      </w:r>
+      <w:r>
+        <w:rPr>
+          <w:lang w:val="en-US"/>
+        </w:rPr>
+        <w:t>Fraud detection is particularly sensitive to data leakage, where information that would not be available at prediction time inadvertently influences the model during training or evaluation. To reduce this risk, the dataset was split chronologically and performance was evaluated using time-series cross-validation, which better reflects real-world deployment where models are trained on past data and used to predict future transactions. Feature engineering was considered from a time-realistic perspective, aiming to represent signals that could plausibly be available at the time a transaction occurs. This design choice improves the credibility of the evaluation compared to random splitting, which can overestimate performance in temporally evolving domains such as fraud.</w:t>
+      </w:r>
     </w:p>
     <w:p>
       <w:pPr>
@@ -13415,6 +13035,7 @@
         <w:rPr>
           <w:lang w:val="en-US"/>
         </w:rPr>
+        <w:lastRenderedPageBreak/>
         <w:t xml:space="preserve">Hyperparameter optimization is performed exclusively on the training data using time series cross-validation with an expanding window, implemented through the </w:t>
       </w:r>
       <w:proofErr w:type="spellStart"/>
@@ -13436,6 +13057,12 @@
           <w:lang w:val="en-US"/>
         </w:rPr>
         <w:t>. After selecting the optimal hyperparameter configuration, each model is retrained on the full training dataset and subsequently evaluated on the unseen test set.</w:t>
+      </w:r>
+      <w:r>
+        <w:rPr>
+          <w:lang w:val="en-US"/>
+        </w:rPr>
+        <w:t xml:space="preserve"> </w:t>
       </w:r>
     </w:p>
     <w:p>
@@ -13448,7 +13075,6 @@
           <w:noProof/>
           <w:lang w:val="en-US"/>
         </w:rPr>
-        <w:lastRenderedPageBreak/>
         <w:drawing>
           <wp:inline distT="0" distB="0" distL="0" distR="0" wp14:anchorId="52A77343" wp14:editId="56105D1A">
             <wp:extent cx="5486400" cy="2372360"/>
@@ -13601,7 +13227,14 @@
         <w:rPr>
           <w:lang w:val="en-US"/>
         </w:rPr>
-        <w:t xml:space="preserve">After training the model on the full dataset using all available features, we experimented with different class-balancing techniques. Specifically, we applied downsampling to the non-fraud class, while also testing oversampling of the fraud class using SMOTE. </w:t>
+        <w:t xml:space="preserve">After training the model on the full dataset using all available features, we experimented with different class-balancing techniques. Specifically, we applied downsampling to the non-fraud </w:t>
+      </w:r>
+      <w:r>
+        <w:rPr>
+          <w:lang w:val="en-US"/>
+        </w:rPr>
+        <w:lastRenderedPageBreak/>
+        <w:t xml:space="preserve">class, while also testing oversampling of the fraud class using SMOTE. </w:t>
       </w:r>
       <w:r>
         <w:rPr>
@@ -13643,14 +13276,7 @@
         <w:rPr>
           <w:lang w:val="en-US"/>
         </w:rPr>
-        <w:t xml:space="preserve">After tuning the three models on the final feature set produced during the data </w:t>
-      </w:r>
-      <w:r>
-        <w:rPr>
-          <w:lang w:val="en-US"/>
-        </w:rPr>
-        <w:lastRenderedPageBreak/>
-        <w:t>analysis and feature engineering phase, SHAP values are used to estimate feature importance for each model. Based on these importance scores, the top 30% of features for each model are identified. A reduced feature set is then constructed by retaining features that appear in the top 30% for at least two of the three models. The three algorithms are subsequently retrained using this reduced feature set.</w:t>
+        <w:t>After tuning the three models on the final feature set produced during the data analysis and feature engineering phase, SHAP values are used to estimate feature importance for each model. Based on these importance scores, the top 30% of features for each model are identified. A reduced feature set is then constructed by retaining features that appear in the top 30% for at least two of the three models. The three algorithms are subsequently retrained using this reduced feature set.</w:t>
       </w:r>
     </w:p>
     <w:p>
@@ -13664,27 +13290,13 @@
         <w:rPr>
           <w:lang w:val="en-US"/>
         </w:rPr>
-        <w:t>Following model retraining, probability threshold tuning is incorporated as part of the evaluation methodology to examine how variations in the decision threshold affect performance metrics under different operational trade-</w:t>
-      </w:r>
-      <w:proofErr w:type="gramStart"/>
-      <w:r>
-        <w:rPr>
-          <w:lang w:val="en-US"/>
-        </w:rPr>
-        <w:t>offs.</w:t>
-      </w:r>
-      <w:r>
-        <w:rPr>
-          <w:lang w:val="en-US"/>
-        </w:rPr>
-        <w:t>.</w:t>
-      </w:r>
-      <w:proofErr w:type="gramEnd"/>
-      <w:r>
-        <w:rPr>
-          <w:lang w:val="en-US"/>
-        </w:rPr>
-        <w:t xml:space="preserve"> This step aims to balance the trade-off between precision and recall, as well as between false positive and false negative rates.</w:t>
+        <w:t>Following model retraining, probability threshold tuning is incorporated as part of the evaluation methodology to examine how variations in the decision threshold affect performance metrics under different operational trade-offs.</w:t>
+      </w:r>
+      <w:r>
+        <w:rPr>
+          <w:lang w:val="en-US"/>
+        </w:rPr>
+        <w:t>. This step aims to balance the trade-off between precision and recall, as well as between false positive and false negative rates.</w:t>
       </w:r>
     </w:p>
     <w:p>
@@ -13815,7 +13427,7 @@
           <w:lang w:val="en-US"/>
         </w:rPr>
       </w:pPr>
-      <w:bookmarkStart w:id="41" w:name="_Toc222255067"/>
+      <w:bookmarkStart w:id="41" w:name="_Toc222327490"/>
       <w:r>
         <w:rPr>
           <w:lang w:val="en-US"/>
@@ -13869,21 +13481,7 @@
         <w:rPr>
           <w:lang w:val="en-US"/>
         </w:rPr>
-        <w:t xml:space="preserve">Train dataset has 590540 </w:t>
-      </w:r>
-      <w:proofErr w:type="gramStart"/>
-      <w:r>
-        <w:rPr>
-          <w:lang w:val="en-US"/>
-        </w:rPr>
-        <w:t>rows</w:t>
-      </w:r>
-      <w:proofErr w:type="gramEnd"/>
-      <w:r>
-        <w:rPr>
-          <w:lang w:val="en-US"/>
-        </w:rPr>
-        <w:t xml:space="preserve"> and 434 columns</w:t>
+        <w:t>Train dataset has 590540 rows and 434 columns</w:t>
       </w:r>
       <w:r>
         <w:rPr>
@@ -13907,28 +13505,14 @@
         <w:rPr>
           <w:lang w:val="en-US"/>
         </w:rPr>
-        <w:t xml:space="preserve">. Before training our machine learning models, we </w:t>
-      </w:r>
-      <w:proofErr w:type="gramStart"/>
-      <w:r>
-        <w:rPr>
-          <w:lang w:val="en-US"/>
-        </w:rPr>
-        <w:t>have to</w:t>
-      </w:r>
-      <w:proofErr w:type="gramEnd"/>
-      <w:r>
-        <w:rPr>
-          <w:lang w:val="en-US"/>
-        </w:rPr>
-        <w:t xml:space="preserve"> analyze the nature of the data. In the appendix, we have conducted a detailed explanatory data analysis. On the following section we present the most important results.</w:t>
+        <w:t>. Before training our machine learning models, we have to analyze the nature of the data. In the appendix, we have conducted a detailed explanatory data analysis. On the following section we present the most important results.</w:t>
       </w:r>
     </w:p>
     <w:p>
       <w:pPr>
         <w:pStyle w:val="Subheading"/>
       </w:pPr>
-      <w:bookmarkStart w:id="42" w:name="_Toc222255068"/>
+      <w:bookmarkStart w:id="42" w:name="_Toc222327491"/>
       <w:r>
         <w:t>4</w:t>
       </w:r>
@@ -13947,7 +13531,7 @@
           <w:lang w:val="en-US"/>
         </w:rPr>
       </w:pPr>
-      <w:bookmarkStart w:id="43" w:name="_Toc222255069"/>
+      <w:bookmarkStart w:id="43" w:name="_Toc222327492"/>
       <w:r>
         <w:rPr>
           <w:lang w:val="en-US"/>
@@ -14946,7 +14530,6 @@
         </w:rPr>
       </w:pPr>
       <w:proofErr w:type="spellStart"/>
-      <w:proofErr w:type="gramStart"/>
       <w:r>
         <w:rPr>
           <w:lang w:val="en-US"/>
@@ -14958,14 +14541,7 @@
         <w:rPr>
           <w:lang w:val="en-US"/>
         </w:rPr>
-        <w:t xml:space="preserve">  (</w:t>
-      </w:r>
-      <w:proofErr w:type="gramEnd"/>
-      <w:r>
-        <w:rPr>
-          <w:lang w:val="en-US"/>
-        </w:rPr>
-        <w:t>e.g., mobile/desktop).</w:t>
+        <w:t xml:space="preserve">  (e.g., mobile/desktop).</w:t>
       </w:r>
     </w:p>
     <w:p>
@@ -15072,7 +14648,7 @@
       <w:pPr>
         <w:pStyle w:val="subsubheading"/>
       </w:pPr>
-      <w:bookmarkStart w:id="44" w:name="_Toc222255070"/>
+      <w:bookmarkStart w:id="44" w:name="_Toc222327493"/>
       <w:r>
         <w:rPr>
           <w:lang w:val="en-US"/>
@@ -15363,7 +14939,7 @@
           <w:lang w:val="en-US"/>
         </w:rPr>
       </w:pPr>
-      <w:bookmarkStart w:id="46" w:name="_Toc222255071"/>
+      <w:bookmarkStart w:id="46" w:name="_Toc222327494"/>
       <w:r>
         <w:rPr>
           <w:lang w:val="en-US"/>
@@ -15606,21 +15182,7 @@
         <w:rPr>
           <w:lang w:val="en-US"/>
         </w:rPr>
-        <w:t xml:space="preserve">user identification </w:t>
-      </w:r>
-      <w:proofErr w:type="gramStart"/>
-      <w:r>
-        <w:rPr>
-          <w:lang w:val="en-US"/>
-        </w:rPr>
-        <w:t>data,</w:t>
-      </w:r>
-      <w:proofErr w:type="gramEnd"/>
-      <w:r>
-        <w:rPr>
-          <w:lang w:val="en-US"/>
-        </w:rPr>
-        <w:t xml:space="preserve"> might mean that the adversary couldn’t provide </w:t>
+        <w:t xml:space="preserve">user identification data, might mean that the adversary couldn’t provide </w:t>
       </w:r>
       <w:r>
         <w:rPr>
@@ -15634,19 +15196,11 @@
         </w:rPr>
         <w:t xml:space="preserve"> the user information. </w:t>
       </w:r>
-      <w:proofErr w:type="gramStart"/>
-      <w:r>
-        <w:rPr>
-          <w:lang w:val="en-US"/>
-        </w:rPr>
-        <w:t>So</w:t>
-      </w:r>
-      <w:proofErr w:type="gramEnd"/>
-      <w:r>
-        <w:rPr>
-          <w:lang w:val="en-US"/>
-        </w:rPr>
-        <w:t xml:space="preserve"> for our dataset, we drop only the features with &gt; 9</w:t>
+      <w:r>
+        <w:rPr>
+          <w:lang w:val="en-US"/>
+        </w:rPr>
+        <w:t>So for our dataset, we drop only the features with &gt; 9</w:t>
       </w:r>
       <w:r>
         <w:rPr>
@@ -15675,7 +15229,7 @@
           <w:lang w:val="en-US"/>
         </w:rPr>
       </w:pPr>
-      <w:bookmarkStart w:id="48" w:name="_Toc222255072"/>
+      <w:bookmarkStart w:id="48" w:name="_Toc222327495"/>
       <w:r>
         <w:rPr>
           <w:lang w:val="en-US"/>
@@ -15992,21 +15546,7 @@
         <w:rPr>
           <w:lang w:val="en-US"/>
         </w:rPr>
-        <w:t xml:space="preserve">These features have a conceptual meaning, as we can later compare each transaction with the relative transaction amount statistics, of the corresponding day of week, or hour of day. </w:t>
-      </w:r>
-      <w:proofErr w:type="gramStart"/>
-      <w:r>
-        <w:rPr>
-          <w:lang w:val="en-US"/>
-        </w:rPr>
-        <w:t>So</w:t>
-      </w:r>
-      <w:proofErr w:type="gramEnd"/>
-      <w:r>
-        <w:rPr>
-          <w:lang w:val="en-US"/>
-        </w:rPr>
-        <w:t xml:space="preserve"> on these features we observe the following:</w:t>
+        <w:t>These features have a conceptual meaning, as we can later compare each transaction with the relative transaction amount statistics, of the corresponding day of week, or hour of day. So on these features we observe the following:</w:t>
       </w:r>
     </w:p>
     <w:p>
@@ -16208,7 +15748,7 @@
           <w:lang w:val="en-US"/>
         </w:rPr>
       </w:pPr>
-      <w:bookmarkStart w:id="52" w:name="_Toc222255073"/>
+      <w:bookmarkStart w:id="52" w:name="_Toc222327496"/>
       <w:r>
         <w:rPr>
           <w:lang w:val="en-US"/>
@@ -17158,58 +16698,30 @@
           <w:bCs/>
           <w:lang w:val="en-US"/>
         </w:rPr>
-        <w:t xml:space="preserve">3 decimal </w:t>
-      </w:r>
-      <w:proofErr w:type="gramStart"/>
+        <w:t>3 decimal places, have a much higher fraud percentage</w:t>
+      </w:r>
+      <w:r>
+        <w:rPr>
+          <w:lang w:val="en-US"/>
+        </w:rPr>
+        <w:t xml:space="preserve">. Note that as we mentioned earlier, 3 decimal places might indicate that the transaction </w:t>
+      </w:r>
       <w:r>
         <w:rPr>
           <w:b/>
           <w:bCs/>
           <w:lang w:val="en-US"/>
         </w:rPr>
-        <w:t>places,</w:t>
-      </w:r>
-      <w:proofErr w:type="gramEnd"/>
+        <w:t xml:space="preserve">included a currency exchange </w:t>
+      </w:r>
       <w:r>
         <w:rPr>
           <w:b/>
           <w:bCs/>
           <w:lang w:val="en-US"/>
         </w:rPr>
-        <w:t xml:space="preserve"> have a much higher fraud percentage</w:t>
-      </w:r>
-      <w:r>
-        <w:rPr>
-          <w:lang w:val="en-US"/>
-        </w:rPr>
-        <w:t xml:space="preserve">. Note that as we mentioned earlier, 3 decimal places might indicate that the transaction </w:t>
-      </w:r>
-      <w:r>
-        <w:rPr>
-          <w:b/>
-          <w:bCs/>
-          <w:lang w:val="en-US"/>
-        </w:rPr>
-        <w:t xml:space="preserve">included a currency </w:t>
-      </w:r>
-      <w:proofErr w:type="gramStart"/>
-      <w:r>
-        <w:rPr>
-          <w:b/>
-          <w:bCs/>
-          <w:lang w:val="en-US"/>
-        </w:rPr>
-        <w:t xml:space="preserve">exchange </w:t>
-      </w:r>
-      <w:r>
-        <w:rPr>
-          <w:b/>
-          <w:bCs/>
-          <w:lang w:val="en-US"/>
-        </w:rPr>
         <w:t>.</w:t>
       </w:r>
-      <w:proofErr w:type="gramEnd"/>
     </w:p>
     <w:p>
       <w:pPr>
@@ -17235,7 +16747,7 @@
           <w:lang w:val="en-US"/>
         </w:rPr>
       </w:pPr>
-      <w:bookmarkStart w:id="56" w:name="_Toc222255074"/>
+      <w:bookmarkStart w:id="56" w:name="_Toc222327497"/>
       <w:r>
         <w:rPr>
           <w:lang w:val="en-US"/>
@@ -17826,7 +17338,7 @@
           <w:lang w:val="en-US"/>
         </w:rPr>
       </w:pPr>
-      <w:bookmarkStart w:id="60" w:name="_Toc222255075"/>
+      <w:bookmarkStart w:id="60" w:name="_Toc222327498"/>
       <w:r>
         <w:rPr>
           <w:lang w:val="en-US"/>
@@ -18670,45 +18182,13 @@
           <w:rStyle w:val="BodyTextChar"/>
           <w:lang w:val="en-US"/>
         </w:rPr>
-        <w:t xml:space="preserve">We keep them as </w:t>
-      </w:r>
-      <w:proofErr w:type="gramStart"/>
+        <w:t>We keep them as is, and let later importance calculations decide.</w:t>
+      </w:r>
       <w:r>
         <w:rPr>
           <w:rStyle w:val="BodyTextChar"/>
           <w:lang w:val="en-US"/>
         </w:rPr>
-        <w:t>is, and</w:t>
-      </w:r>
-      <w:proofErr w:type="gramEnd"/>
-      <w:r>
-        <w:rPr>
-          <w:rStyle w:val="BodyTextChar"/>
-          <w:lang w:val="en-US"/>
-        </w:rPr>
-        <w:t xml:space="preserve"> let </w:t>
-      </w:r>
-      <w:proofErr w:type="gramStart"/>
-      <w:r>
-        <w:rPr>
-          <w:rStyle w:val="BodyTextChar"/>
-          <w:lang w:val="en-US"/>
-        </w:rPr>
-        <w:t>later importance calculations decide</w:t>
-      </w:r>
-      <w:proofErr w:type="gramEnd"/>
-      <w:r>
-        <w:rPr>
-          <w:rStyle w:val="BodyTextChar"/>
-          <w:lang w:val="en-US"/>
-        </w:rPr>
-        <w:t>.</w:t>
-      </w:r>
-      <w:r>
-        <w:rPr>
-          <w:rStyle w:val="BodyTextChar"/>
-          <w:lang w:val="en-US"/>
-        </w:rPr>
         <w:tab/>
       </w:r>
       <w:r>
@@ -18725,7 +18205,7 @@
           <w:lang w:val="en-US"/>
         </w:rPr>
       </w:pPr>
-      <w:bookmarkStart w:id="65" w:name="_Toc222255076"/>
+      <w:bookmarkStart w:id="65" w:name="_Toc222327499"/>
       <w:r>
         <w:rPr>
           <w:lang w:val="en-US"/>
@@ -18841,41 +18321,13 @@
         <w:rPr>
           <w:lang w:val="en-US"/>
         </w:rPr>
-        <w:t xml:space="preserve"> deemed insignificant. </w:t>
-      </w:r>
-      <w:proofErr w:type="gramStart"/>
-      <w:r>
-        <w:rPr>
-          <w:lang w:val="en-US"/>
-        </w:rPr>
-        <w:t>So</w:t>
-      </w:r>
-      <w:proofErr w:type="gramEnd"/>
-      <w:r>
-        <w:rPr>
-          <w:lang w:val="en-US"/>
-        </w:rPr>
-        <w:t xml:space="preserve"> we used the rest of the features. </w:t>
-      </w:r>
-      <w:r>
-        <w:rPr>
-          <w:lang w:val="en-US"/>
-        </w:rPr>
-        <w:t xml:space="preserve">On the following plot we can see that there is </w:t>
-      </w:r>
-      <w:proofErr w:type="gramStart"/>
-      <w:r>
-        <w:rPr>
-          <w:lang w:val="en-US"/>
-        </w:rPr>
-        <w:t>really high</w:t>
-      </w:r>
-      <w:proofErr w:type="gramEnd"/>
-      <w:r>
-        <w:rPr>
-          <w:lang w:val="en-US"/>
-        </w:rPr>
-        <w:t xml:space="preserve"> correlation between the vesta features (even after dropping many of them).</w:t>
+        <w:t xml:space="preserve"> deemed insignificant. So we used the rest of the features. </w:t>
+      </w:r>
+      <w:r>
+        <w:rPr>
+          <w:lang w:val="en-US"/>
+        </w:rPr>
+        <w:t>On the following plot we can see that there is really high correlation between the vesta features (even after dropping many of them).</w:t>
       </w:r>
     </w:p>
     <w:p>
@@ -19021,7 +18473,7 @@
       <w:pPr>
         <w:pStyle w:val="Subheading"/>
       </w:pPr>
-      <w:bookmarkStart w:id="67" w:name="_Toc222255077"/>
+      <w:bookmarkStart w:id="67" w:name="_Toc222327500"/>
       <w:r>
         <w:lastRenderedPageBreak/>
         <w:t>4</w:t>
@@ -19038,7 +18490,7 @@
           <w:lang w:val="en-US"/>
         </w:rPr>
       </w:pPr>
-      <w:bookmarkStart w:id="68" w:name="_Toc222255078"/>
+      <w:bookmarkStart w:id="68" w:name="_Toc222327501"/>
       <w:r>
         <w:rPr>
           <w:lang w:val="en-US"/>
@@ -19112,7 +18564,7 @@
           <w:lang w:val="en-US"/>
         </w:rPr>
       </w:pPr>
-      <w:bookmarkStart w:id="69" w:name="_Toc222255079"/>
+      <w:bookmarkStart w:id="69" w:name="_Toc222327502"/>
       <w:r>
         <w:rPr>
           <w:lang w:val="en-US"/>
@@ -20421,21 +19873,7 @@
         <w:rPr>
           <w:lang w:val="en-US"/>
         </w:rPr>
-        <w:t xml:space="preserve">. This generates </w:t>
-      </w:r>
-      <w:proofErr w:type="gramStart"/>
-      <w:r>
-        <w:rPr>
-          <w:lang w:val="en-US"/>
-        </w:rPr>
-        <w:t>a large number of</w:t>
-      </w:r>
-      <w:proofErr w:type="gramEnd"/>
-      <w:r>
-        <w:rPr>
-          <w:lang w:val="en-US"/>
-        </w:rPr>
-        <w:t xml:space="preserve"> relational features. Many of them are proven to be redundant, but again we rely on later feature importance calculations to </w:t>
+        <w:t xml:space="preserve">. This generates a large number of relational features. Many of them are proven to be redundant, but again we rely on later feature importance calculations to </w:t>
       </w:r>
       <w:r>
         <w:rPr>
@@ -20465,7 +19903,7 @@
           <w:lang w:val="en-US"/>
         </w:rPr>
       </w:pPr>
-      <w:bookmarkStart w:id="74" w:name="_Toc222255080"/>
+      <w:bookmarkStart w:id="74" w:name="_Toc222327503"/>
       <w:r>
         <w:rPr>
           <w:lang w:val="en-US"/>
@@ -20544,7 +19982,7 @@
       <w:pPr>
         <w:pStyle w:val="Subheading"/>
       </w:pPr>
-      <w:bookmarkStart w:id="75" w:name="_Toc222255081"/>
+      <w:bookmarkStart w:id="75" w:name="_Toc222327504"/>
       <w:r>
         <w:t>5</w:t>
       </w:r>
@@ -22185,7 +21623,7 @@
       <w:pPr>
         <w:pStyle w:val="Subheading"/>
       </w:pPr>
-      <w:bookmarkStart w:id="80" w:name="_Toc222255082"/>
+      <w:bookmarkStart w:id="80" w:name="_Toc222327505"/>
       <w:r>
         <w:lastRenderedPageBreak/>
         <w:t>5.2. Downsampling</w:t>
@@ -23881,21 +23319,7 @@
         <w:rPr>
           <w:lang w:val="en-US"/>
         </w:rPr>
-        <w:t xml:space="preserve">LightGBM remained the best performant model, even though it’s ROC-AUC did not improve. </w:t>
-      </w:r>
-      <w:proofErr w:type="gramStart"/>
-      <w:r>
-        <w:rPr>
-          <w:lang w:val="en-US"/>
-        </w:rPr>
-        <w:t>However</w:t>
-      </w:r>
-      <w:proofErr w:type="gramEnd"/>
-      <w:r>
-        <w:rPr>
-          <w:lang w:val="en-US"/>
-        </w:rPr>
-        <w:t xml:space="preserve"> we can see that average precision metric</w:t>
+        <w:t>LightGBM remained the best performant model, even though it’s ROC-AUC did not improve. However we can see that average precision metric</w:t>
       </w:r>
       <w:r>
         <w:rPr>
@@ -23974,7 +23398,7 @@
       <w:pPr>
         <w:pStyle w:val="Subheading"/>
       </w:pPr>
-      <w:bookmarkStart w:id="85" w:name="_Toc222255083"/>
+      <w:bookmarkStart w:id="85" w:name="_Toc222327506"/>
       <w:r>
         <w:lastRenderedPageBreak/>
         <w:t>5.</w:t>
@@ -24004,21 +23428,7 @@
         <w:rPr>
           <w:lang w:val="en-US"/>
         </w:rPr>
-        <w:t xml:space="preserve"> The final features selected were the ones that were </w:t>
-      </w:r>
-      <w:proofErr w:type="gramStart"/>
-      <w:r>
-        <w:rPr>
-          <w:lang w:val="en-US"/>
-        </w:rPr>
-        <w:t>on</w:t>
-      </w:r>
-      <w:proofErr w:type="gramEnd"/>
-      <w:r>
-        <w:rPr>
-          <w:lang w:val="en-US"/>
-        </w:rPr>
-        <w:t xml:space="preserve"> the top 30% of most important features for at least 2 of the 3 models.</w:t>
+        <w:t xml:space="preserve"> The final features selected were the ones that were on the top 30% of most important features for at least 2 of the 3 models.</w:t>
       </w:r>
     </w:p>
     <w:tbl>
@@ -28817,21 +28227,7 @@
         <w:rPr>
           <w:lang w:val="en-US"/>
         </w:rPr>
-        <w:t xml:space="preserve">aggregated user behavioral statistics, and device-related features, indicating that both transactional characteristics and historical user </w:t>
-      </w:r>
-      <w:proofErr w:type="gramStart"/>
-      <w:r>
-        <w:rPr>
-          <w:lang w:val="en-US"/>
-        </w:rPr>
-        <w:t>behavior</w:t>
-      </w:r>
-      <w:proofErr w:type="gramEnd"/>
-      <w:r>
-        <w:rPr>
-          <w:lang w:val="en-US"/>
-        </w:rPr>
-        <w:t xml:space="preserve"> are critical for effective fraud detection.</w:t>
+        <w:t>aggregated user behavioral statistics, and device-related features, indicating that both transactional characteristics and historical user behavior are critical for effective fraud detection.</w:t>
       </w:r>
       <w:r>
         <w:rPr>
@@ -30567,7 +29963,7 @@
       <w:pPr>
         <w:pStyle w:val="Subheading"/>
       </w:pPr>
-      <w:bookmarkStart w:id="90" w:name="_Toc222255084"/>
+      <w:bookmarkStart w:id="90" w:name="_Toc222327507"/>
       <w:r>
         <w:lastRenderedPageBreak/>
         <w:t>5.4. Decision Threshold Tuning</w:t>
@@ -30866,7 +30262,6 @@
                 <w:lang w:val="en-US"/>
               </w:rPr>
             </w:pPr>
-            <w:proofErr w:type="gramStart"/>
             <w:r>
               <w:rPr>
                 <w:rFonts w:ascii="Calibri" w:eastAsia="Times New Roman" w:hAnsi="Calibri" w:cs="Calibri"/>
@@ -30875,18 +30270,7 @@
                 <w:szCs w:val="22"/>
                 <w:lang w:val="en-US"/>
               </w:rPr>
-              <w:t>XGBoost @</w:t>
-            </w:r>
-            <w:proofErr w:type="gramEnd"/>
-            <w:r>
-              <w:rPr>
-                <w:rFonts w:ascii="Calibri" w:eastAsia="Times New Roman" w:hAnsi="Calibri" w:cs="Calibri"/>
-                <w:color w:val="000000"/>
-                <w:sz w:val="22"/>
-                <w:szCs w:val="22"/>
-                <w:lang w:val="en-US"/>
-              </w:rPr>
-              <w:t xml:space="preserve"> threshold = 0.1</w:t>
+              <w:t>XGBoost @ threshold = 0.1</w:t>
             </w:r>
           </w:p>
         </w:tc>
@@ -31030,7 +30414,6 @@
                 <w:lang w:val="en-US"/>
               </w:rPr>
             </w:pPr>
-            <w:proofErr w:type="gramStart"/>
             <w:r>
               <w:rPr>
                 <w:rFonts w:ascii="Calibri" w:eastAsia="Times New Roman" w:hAnsi="Calibri" w:cs="Calibri"/>
@@ -31039,18 +30422,7 @@
                 <w:szCs w:val="22"/>
                 <w:lang w:val="en-US"/>
               </w:rPr>
-              <w:t>LGBM @</w:t>
-            </w:r>
-            <w:proofErr w:type="gramEnd"/>
-            <w:r>
-              <w:rPr>
-                <w:rFonts w:ascii="Calibri" w:eastAsia="Times New Roman" w:hAnsi="Calibri" w:cs="Calibri"/>
-                <w:color w:val="000000"/>
-                <w:sz w:val="22"/>
-                <w:szCs w:val="22"/>
-                <w:lang w:val="en-US"/>
-              </w:rPr>
-              <w:t xml:space="preserve"> threshold = 0.1</w:t>
+              <w:t>LGBM @ threshold = 0.1</w:t>
             </w:r>
           </w:p>
         </w:tc>
@@ -31195,7 +30567,6 @@
               </w:rPr>
             </w:pPr>
             <w:proofErr w:type="spellStart"/>
-            <w:proofErr w:type="gramStart"/>
             <w:r>
               <w:rPr>
                 <w:rFonts w:ascii="Calibri" w:eastAsia="Times New Roman" w:hAnsi="Calibri" w:cs="Calibri"/>
@@ -31215,18 +30586,7 @@
                 <w:szCs w:val="22"/>
                 <w:lang w:val="en-US"/>
               </w:rPr>
-              <w:t xml:space="preserve"> @</w:t>
-            </w:r>
-            <w:proofErr w:type="gramEnd"/>
-            <w:r>
-              <w:rPr>
-                <w:rFonts w:ascii="Calibri" w:eastAsia="Times New Roman" w:hAnsi="Calibri" w:cs="Calibri"/>
-                <w:color w:val="000000"/>
-                <w:sz w:val="22"/>
-                <w:szCs w:val="22"/>
-                <w:lang w:val="en-US"/>
-              </w:rPr>
-              <w:t xml:space="preserve"> threshold = 0.1</w:t>
+              <w:t xml:space="preserve"> @ threshold = 0.1</w:t>
             </w:r>
           </w:p>
         </w:tc>
@@ -31977,21 +31337,7 @@
         <w:rPr>
           <w:lang w:val="en-US"/>
         </w:rPr>
-        <w:t xml:space="preserve">For </w:t>
-      </w:r>
-      <w:proofErr w:type="gramStart"/>
-      <w:r>
-        <w:rPr>
-          <w:lang w:val="en-US"/>
-        </w:rPr>
-        <w:t>example</w:t>
-      </w:r>
-      <w:proofErr w:type="gramEnd"/>
-      <w:r>
-        <w:rPr>
-          <w:lang w:val="en-US"/>
-        </w:rPr>
-        <w:t xml:space="preserve"> in the LGBM plots (which is the best performing model), we can see that </w:t>
+        <w:t xml:space="preserve">For example in the LGBM plots (which is the best performing model), we can see that </w:t>
       </w:r>
       <w:r>
         <w:rPr>
@@ -32042,7 +31388,6 @@
         <w:t xml:space="preserve">The false positive and false negative rates are also plotted over time. So, from these plots we can see that the rates are stable over time, so our models are quite robust, at least regarding the timespan that the test dataset </w:t>
       </w:r>
       <w:proofErr w:type="spellStart"/>
-      <w:proofErr w:type="gramStart"/>
       <w:r>
         <w:rPr>
           <w:lang w:val="en-US"/>
@@ -32056,7 +31401,6 @@
         <w:t>These</w:t>
       </w:r>
       <w:proofErr w:type="spellEnd"/>
-      <w:proofErr w:type="gramEnd"/>
       <w:r>
         <w:rPr>
           <w:lang w:val="en-US"/>
@@ -32072,10 +31416,25 @@
     </w:p>
     <w:p>
       <w:pPr>
+        <w:pStyle w:val="BodyText"/>
+        <w:rPr>
+          <w:lang w:val="en-US"/>
+        </w:rPr>
+      </w:pPr>
+      <w:r>
+        <w:rPr>
+          <w:lang w:val="en-US"/>
+        </w:rPr>
+        <w:t>In practical fraud detection systems, the decision threshold is not selected solely to maximize a single metric, but to balance detection performance with operational constraints. Lowering the threshold typically increases recall (fewer fraudulent transactions missed) while also increasing false positives, which translates into additional manual review workload and potentially higher customer friction. Raising the threshold reduces the number of flagged transactions and review effort, but can allow more fraud to pass undetected. For this reason, the chosen threshold should reflect business priorities (e.g., minimizing missed fraud vs. minimizing unnecessary reviews) and available analyst capacity, and it may require periodic adjustment over time.</w:t>
+      </w:r>
+    </w:p>
+    <w:p>
+      <w:pPr>
         <w:pStyle w:val="Subheading"/>
       </w:pPr>
-      <w:bookmarkStart w:id="95" w:name="_Toc222255085"/>
-      <w:r>
+      <w:bookmarkStart w:id="95" w:name="_Toc222327508"/>
+      <w:r>
+        <w:lastRenderedPageBreak/>
         <w:t>5.</w:t>
       </w:r>
       <w:r>
@@ -32134,7 +31493,7 @@
           <w:lang w:val="en-US"/>
         </w:rPr>
       </w:pPr>
-      <w:bookmarkStart w:id="96" w:name="_Toc222255086"/>
+      <w:bookmarkStart w:id="96" w:name="_Toc222327509"/>
       <w:r>
         <w:rPr>
           <w:lang w:val="en-US"/>
@@ -32148,7 +31507,7 @@
       <w:pPr>
         <w:pStyle w:val="Subheading"/>
       </w:pPr>
-      <w:bookmarkStart w:id="97" w:name="_Toc222255087"/>
+      <w:bookmarkStart w:id="97" w:name="_Toc222327510"/>
       <w:r>
         <w:t>6.1</w:t>
       </w:r>
@@ -32251,7 +31610,19 @@
         <w:rPr>
           <w:lang w:val="en-US"/>
         </w:rPr>
-        <w:t>Overall, three main conclusions can be drawn: (1) gradient boosting models provide strong baseline performance for fraud detection in this dataset, with LightGBM being the most robust approach</w:t>
+        <w:t xml:space="preserve">Overall, </w:t>
+      </w:r>
+      <w:r>
+        <w:rPr>
+          <w:lang w:val="en-US"/>
+        </w:rPr>
+        <w:t>four</w:t>
+      </w:r>
+      <w:r>
+        <w:rPr>
+          <w:lang w:val="en-US"/>
+        </w:rPr>
+        <w:t xml:space="preserve"> main conclusions can be drawn: (1) gradient boosting models provide strong baseline performance for fraud detection in this dataset, with LightGBM being the most robust approach</w:t>
       </w:r>
       <w:r>
         <w:rPr>
@@ -32275,7 +31646,7 @@
         <w:rPr>
           <w:lang w:val="en-US"/>
         </w:rPr>
-        <w:t xml:space="preserve"> and (3) engineered </w:t>
+        <w:t xml:space="preserve"> (3) engineered </w:t>
       </w:r>
       <w:r>
         <w:rPr>
@@ -32287,15 +31658,44 @@
         <w:rPr>
           <w:lang w:val="en-US"/>
         </w:rPr>
-        <w:t xml:space="preserve"> aggregate features can preserve predictive power even when the feature set is reduced.</w:t>
-      </w:r>
+        <w:t xml:space="preserve"> aggregate features can preserve predictive power even when the feature set is </w:t>
+      </w:r>
+      <w:r>
+        <w:rPr>
+          <w:lang w:val="en-US"/>
+        </w:rPr>
+        <w:t>reduced,</w:t>
+      </w:r>
+      <w:r>
+        <w:rPr>
+          <w:rFonts w:asciiTheme="minorHAnsi" w:hAnsiTheme="minorHAnsi"/>
+          <w:sz w:val="24"/>
+          <w:lang w:val="en-US"/>
+        </w:rPr>
+        <w:t xml:space="preserve"> </w:t>
+      </w:r>
+      <w:r>
+        <w:rPr>
+          <w:lang w:val="en-US"/>
+        </w:rPr>
+        <w:t>and (4) the decision threshold is a key operational lever that controls the trade-off between recall and precision, meaning the appropriate threshold should be selected according to business cost asymmetries and available investigation capacity rather than relying on a default value.</w:t>
+      </w:r>
+    </w:p>
+    <w:p>
+      <w:pPr>
+        <w:pStyle w:val="BodyText"/>
+        <w:rPr>
+          <w:lang w:val="en-US"/>
+        </w:rPr>
+      </w:pPr>
     </w:p>
     <w:p>
       <w:pPr>
         <w:pStyle w:val="Subheading"/>
       </w:pPr>
-      <w:bookmarkStart w:id="98" w:name="_Toc222255088"/>
-      <w:r>
+      <w:bookmarkStart w:id="98" w:name="_Toc222327511"/>
+      <w:r>
+        <w:lastRenderedPageBreak/>
         <w:t>6.</w:t>
       </w:r>
       <w:r>
@@ -32332,14 +31732,7 @@
         <w:rPr>
           <w:lang w:val="en-US"/>
         </w:rPr>
-        <w:t xml:space="preserve">First, future work could explore cost-aware decision making by selecting classification thresholds based on operational constraints (e.g., manual review capacity) or explicit business costs associated with false positives and false negatives. Second, the models </w:t>
-      </w:r>
-      <w:r>
-        <w:rPr>
-          <w:lang w:val="en-US"/>
-        </w:rPr>
-        <w:lastRenderedPageBreak/>
-        <w:t>could be complemented with probability calibration methods to ensure that predicted risk scores better reflect true fraud likelihood, which is valuable for prioritization and downstream decision support.</w:t>
+        <w:t>First, future work could explore cost-aware decision making by selecting classification thresholds based on operational constraints (e.g., manual review capacity) or explicit business costs associated with false positives and false negatives. Second, the models could be complemented with probability calibration methods to ensure that predicted risk scores better reflect true fraud likelihood, which is valuable for prioritization and downstream decision support.</w:t>
       </w:r>
       <w:r>
         <w:rPr>
@@ -32373,7 +31766,7 @@
           <w:lang w:val="en-US"/>
         </w:rPr>
       </w:pPr>
-      <w:bookmarkStart w:id="99" w:name="_Toc222255089"/>
+      <w:bookmarkStart w:id="99" w:name="_Toc222327512"/>
       <w:r>
         <w:rPr>
           <w:lang w:val="en-US"/>
@@ -32442,7 +31835,7 @@
           <w:lang w:val="en-US"/>
         </w:rPr>
       </w:pPr>
-      <w:bookmarkStart w:id="100" w:name="_Toc222255090"/>
+      <w:bookmarkStart w:id="100" w:name="_Toc222327513"/>
       <w:r>
         <w:rPr>
           <w:lang w:val="en-US"/>
@@ -33082,21 +32475,7 @@
         <w:rPr>
           <w:lang w:val="en-US"/>
         </w:rPr>
-        <w:t xml:space="preserve"> (2022) “Feature Engineering and Resampling Strategies for Fund Transfer Fraud </w:t>
-      </w:r>
-      <w:proofErr w:type="gramStart"/>
-      <w:r>
-        <w:rPr>
-          <w:lang w:val="en-US"/>
-        </w:rPr>
-        <w:t>With</w:t>
-      </w:r>
-      <w:proofErr w:type="gramEnd"/>
-      <w:r>
-        <w:rPr>
-          <w:lang w:val="en-US"/>
-        </w:rPr>
-        <w:t xml:space="preserve"> Limited Transaction Data and a Time-Inhomogeneous Modi Operandi,” </w:t>
+        <w:t xml:space="preserve"> (2022) “Feature Engineering and Resampling Strategies for Fund Transfer Fraud With Limited Transaction Data and a Time-Inhomogeneous Modi Operandi,” </w:t>
       </w:r>
       <w:r>
         <w:rPr>
@@ -33232,57 +32611,21 @@
           <w:iCs/>
           <w:lang w:val="en-US"/>
         </w:rPr>
-        <w:t xml:space="preserve">2017 Third International Conference on Advances in Electrical, Electronics, Information, Communication and </w:t>
-      </w:r>
-      <w:proofErr w:type="gramStart"/>
+        <w:t>2017 Third International Conference on Advances in Electrical, Electronics, Information, Communication and Bio-Informatics (AEEICB)</w:t>
+      </w:r>
+      <w:r>
+        <w:rPr>
+          <w:lang w:val="en-US"/>
+        </w:rPr>
+        <w:t xml:space="preserve">. </w:t>
+      </w:r>
       <w:r>
         <w:rPr>
           <w:i/>
           <w:iCs/>
           <w:lang w:val="en-US"/>
         </w:rPr>
-        <w:t>Bio-Informatics</w:t>
-      </w:r>
-      <w:proofErr w:type="gramEnd"/>
-      <w:r>
-        <w:rPr>
-          <w:i/>
-          <w:iCs/>
-          <w:lang w:val="en-US"/>
-        </w:rPr>
-        <w:t xml:space="preserve"> (AEEICB)</w:t>
-      </w:r>
-      <w:r>
-        <w:rPr>
-          <w:lang w:val="en-US"/>
-        </w:rPr>
-        <w:t xml:space="preserve">. </w:t>
-      </w:r>
-      <w:r>
-        <w:rPr>
-          <w:i/>
-          <w:iCs/>
-          <w:lang w:val="en-US"/>
-        </w:rPr>
-        <w:t xml:space="preserve">2017 Third International Conference on Advances in Electrical, Electronics, Information, Communication and </w:t>
-      </w:r>
-      <w:proofErr w:type="gramStart"/>
-      <w:r>
-        <w:rPr>
-          <w:i/>
-          <w:iCs/>
-          <w:lang w:val="en-US"/>
-        </w:rPr>
-        <w:t>Bio-Informatics</w:t>
-      </w:r>
-      <w:proofErr w:type="gramEnd"/>
-      <w:r>
-        <w:rPr>
-          <w:i/>
-          <w:iCs/>
-          <w:lang w:val="en-US"/>
-        </w:rPr>
-        <w:t xml:space="preserve"> (AEEICB)</w:t>
+        <w:t>2017 Third International Conference on Advances in Electrical, Electronics, Information, Communication and Bio-Informatics (AEEICB)</w:t>
       </w:r>
       <w:r>
         <w:rPr>
@@ -42271,7 +41614,6 @@
   <w:style w:type="character" w:default="1" w:styleId="DefaultParagraphFont">
     <w:name w:val="Default Paragraph Font"/>
     <w:uiPriority w:val="1"/>
-    <w:semiHidden/>
     <w:unhideWhenUsed/>
   </w:style>
   <w:style w:type="table" w:default="1" w:styleId="TableNormal">

</xml_diff>